<commit_message>
feat: Add 'etage' property to apartment models and include it in the document generation service.
</commit_message>
<xml_diff>
--- a/src/assets/docx/bail.docx
+++ b/src/assets/docx/bail.docx
@@ -4,7 +4,7 @@
   <w:body>
     <w:p>
       <w:pPr>
-        <w:pStyle w:val="871"/>
+        <w:pStyle w:val="873"/>
         <w:pBdr/>
         <w:spacing/>
         <w:ind/>
@@ -17,7 +17,7 @@
     </w:p>
     <w:p>
       <w:pPr>
-        <w:pStyle w:val="871"/>
+        <w:pStyle w:val="873"/>
         <w:pBdr/>
         <w:spacing/>
         <w:ind/>
@@ -76,7 +76,7 @@
     </w:p>
     <w:p>
       <w:pPr>
-        <w:pStyle w:val="871"/>
+        <w:pStyle w:val="873"/>
         <w:pBdr/>
         <w:spacing/>
         <w:ind/>
@@ -131,7 +131,7 @@
     </w:p>
     <w:p>
       <w:pPr>
-        <w:pStyle w:val="839"/>
+        <w:pStyle w:val="841"/>
         <w:numPr>
           <w:ilvl w:val="0"/>
           <w:numId w:val="13"/>
@@ -189,7 +189,7 @@
     </w:p>
     <w:p>
       <w:pPr>
-        <w:pStyle w:val="840"/>
+        <w:pStyle w:val="842"/>
         <w:pBdr/>
         <w:shd w:val="solid" w:color="ffffff" w:fill="auto"/>
         <w:spacing/>
@@ -370,7 +370,7 @@
     </w:p>
     <w:p>
       <w:pPr>
-        <w:pStyle w:val="840"/>
+        <w:pStyle w:val="842"/>
         <w:pBdr/>
         <w:shd w:val="solid" w:color="ffffff" w:fill="auto"/>
         <w:spacing/>
@@ -586,7 +586,7 @@
     </w:p>
     <w:p>
       <w:pPr>
-        <w:pStyle w:val="839"/>
+        <w:pStyle w:val="841"/>
         <w:numPr>
           <w:ilvl w:val="0"/>
           <w:numId w:val="13"/>
@@ -641,7 +641,7 @@
     </w:p>
     <w:p>
       <w:pPr>
-        <w:pStyle w:val="840"/>
+        <w:pStyle w:val="842"/>
         <w:pBdr/>
         <w:shd w:val="solid" w:color="ffffff" w:fill="auto"/>
         <w:spacing/>
@@ -769,7 +769,7 @@
         <w:rPr/>
       </w:pPr>
       <w:r>
-        <w:t xml:space="preserve">Étage : 4è Étage, porte de droite</w:t>
+        <w:t xml:space="preserve">Étage : {etage}</w:t>
       </w:r>
       <w:r/>
     </w:p>
@@ -909,6 +909,7 @@
         <w:rPr>
           <w:bCs/>
         </w:rPr>
+        <w:t xml:space="preserve">s</w:t>
       </w:r>
       <w:r>
         <w:rPr>
@@ -2082,7 +2083,7 @@
       </w:r>
       <w:r>
         <w:rPr>
-          <w:bCs/>
+          <w:highlight w:val="none"/>
         </w:rPr>
       </w:r>
       <w:r>
@@ -2249,7 +2250,7 @@
     </w:p>
     <w:p>
       <w:pPr>
-        <w:pStyle w:val="869"/>
+        <w:pStyle w:val="871"/>
         <w:numPr>
           <w:ilvl w:val="0"/>
           <w:numId w:val="5"/>
@@ -2309,7 +2310,7 @@
     </w:p>
     <w:p>
       <w:pPr>
-        <w:pStyle w:val="882"/>
+        <w:pStyle w:val="884"/>
         <w:pBdr/>
         <w:spacing/>
         <w:ind/>
@@ -2352,7 +2353,7 @@
     </w:p>
     <w:p>
       <w:pPr>
-        <w:pStyle w:val="882"/>
+        <w:pStyle w:val="884"/>
         <w:pBdr/>
         <w:spacing/>
         <w:ind/>
@@ -2395,7 +2396,7 @@
     </w:p>
     <w:p>
       <w:pPr>
-        <w:pStyle w:val="882"/>
+        <w:pStyle w:val="884"/>
         <w:pBdr/>
         <w:spacing/>
         <w:ind/>
@@ -2514,7 +2515,7 @@
     </w:p>
     <w:p>
       <w:pPr>
-        <w:pStyle w:val="840"/>
+        <w:pStyle w:val="842"/>
         <w:pBdr/>
         <w:shd w:val="solid" w:color="ffffff" w:fill="auto"/>
         <w:spacing/>
@@ -2651,7 +2652,7 @@
     </w:p>
     <w:p>
       <w:pPr>
-        <w:pStyle w:val="840"/>
+        <w:pStyle w:val="842"/>
         <w:pBdr/>
         <w:shd w:val="solid" w:color="ffffff" w:fill="auto"/>
         <w:spacing/>
@@ -2738,7 +2739,7 @@
     </w:p>
     <w:p>
       <w:pPr>
-        <w:pStyle w:val="840"/>
+        <w:pStyle w:val="842"/>
         <w:pBdr/>
         <w:shd w:val="solid" w:color="ffffff" w:fill="auto"/>
         <w:spacing/>
@@ -3027,7 +3028,7 @@
       <w:r>
         <w:rPr>
           <w:rFonts w:cs="Arial"/>
-          <w:szCs w:val="20"/>
+          <w:highlight w:val="none"/>
         </w:rPr>
       </w:r>
       <w:r>
@@ -3056,8 +3057,6 @@
       <w:r>
         <w:rPr>
           <w:rFonts w:cs="Arial"/>
-          <w:szCs w:val="20"/>
-          <w:highlight w:val="none"/>
         </w:rPr>
       </w:r>
       <w:r>
@@ -3068,7 +3067,7 @@
     </w:p>
     <w:p>
       <w:pPr>
-        <w:pStyle w:val="840"/>
+        <w:pStyle w:val="842"/>
         <w:pBdr/>
         <w:shd w:val="solid" w:color="ffffff" w:fill="auto"/>
         <w:spacing/>
@@ -3188,7 +3187,7 @@
     </w:p>
     <w:p>
       <w:pPr>
-        <w:pStyle w:val="839"/>
+        <w:pStyle w:val="841"/>
         <w:numPr>
           <w:ilvl w:val="0"/>
           <w:numId w:val="13"/>
@@ -3280,7 +3279,7 @@
     </w:p>
     <w:p>
       <w:pPr>
-        <w:pStyle w:val="840"/>
+        <w:pStyle w:val="842"/>
         <w:pBdr/>
         <w:shd w:val="solid" w:color="ffffff" w:fill="auto"/>
         <w:spacing/>
@@ -3414,7 +3413,7 @@
     </w:p>
     <w:p>
       <w:pPr>
-        <w:pStyle w:val="840"/>
+        <w:pStyle w:val="842"/>
         <w:pBdr/>
         <w:shd w:val="solid" w:color="ffffff" w:fill="auto"/>
         <w:spacing/>
@@ -4349,7 +4348,7 @@
     </w:p>
     <w:p>
       <w:pPr>
-        <w:pStyle w:val="839"/>
+        <w:pStyle w:val="841"/>
         <w:numPr>
           <w:ilvl w:val="0"/>
           <w:numId w:val="13"/>
@@ -4441,7 +4440,7 @@
     </w:p>
     <w:p>
       <w:pPr>
-        <w:pStyle w:val="840"/>
+        <w:pStyle w:val="842"/>
         <w:pBdr/>
         <w:shd w:val="solid" w:color="ffffff" w:fill="auto"/>
         <w:spacing/>
@@ -4469,7 +4468,7 @@
     </w:p>
     <w:p>
       <w:pPr>
-        <w:pStyle w:val="841"/>
+        <w:pStyle w:val="843"/>
         <w:pBdr/>
         <w:spacing/>
         <w:ind/>
@@ -4828,7 +4827,7 @@
     </w:p>
     <w:p>
       <w:pPr>
-        <w:pStyle w:val="869"/>
+        <w:pStyle w:val="871"/>
         <w:numPr>
           <w:ilvl w:val="1"/>
           <w:numId w:val="9"/>
@@ -4845,7 +4844,7 @@
     </w:p>
     <w:p>
       <w:pPr>
-        <w:pStyle w:val="869"/>
+        <w:pStyle w:val="871"/>
         <w:numPr>
           <w:ilvl w:val="1"/>
           <w:numId w:val="9"/>
@@ -4868,7 +4867,7 @@
     </w:p>
     <w:p>
       <w:pPr>
-        <w:pStyle w:val="869"/>
+        <w:pStyle w:val="871"/>
         <w:numPr>
           <w:ilvl w:val="1"/>
           <w:numId w:val="9"/>
@@ -4885,7 +4884,7 @@
     </w:p>
     <w:p>
       <w:pPr>
-        <w:pStyle w:val="869"/>
+        <w:pStyle w:val="871"/>
         <w:numPr>
           <w:ilvl w:val="1"/>
           <w:numId w:val="9"/>
@@ -4911,7 +4910,7 @@
     </w:p>
     <w:p>
       <w:pPr>
-        <w:pStyle w:val="869"/>
+        <w:pStyle w:val="871"/>
         <w:numPr>
           <w:ilvl w:val="1"/>
           <w:numId w:val="9"/>
@@ -4928,7 +4927,7 @@
     </w:p>
     <w:p>
       <w:pPr>
-        <w:pStyle w:val="869"/>
+        <w:pStyle w:val="871"/>
         <w:numPr>
           <w:ilvl w:val="1"/>
           <w:numId w:val="9"/>
@@ -4957,7 +4956,7 @@
     </w:p>
     <w:p>
       <w:pPr>
-        <w:pStyle w:val="869"/>
+        <w:pStyle w:val="871"/>
         <w:numPr>
           <w:ilvl w:val="1"/>
           <w:numId w:val="9"/>
@@ -4974,7 +4973,7 @@
     </w:p>
     <w:p>
       <w:pPr>
-        <w:pStyle w:val="869"/>
+        <w:pStyle w:val="871"/>
         <w:numPr>
           <w:ilvl w:val="1"/>
           <w:numId w:val="9"/>
@@ -5012,7 +5011,7 @@
     </w:p>
     <w:p>
       <w:pPr>
-        <w:pStyle w:val="869"/>
+        <w:pStyle w:val="871"/>
         <w:numPr>
           <w:ilvl w:val="1"/>
           <w:numId w:val="9"/>
@@ -5032,7 +5031,7 @@
     </w:p>
     <w:p>
       <w:pPr>
-        <w:pStyle w:val="869"/>
+        <w:pStyle w:val="871"/>
         <w:numPr>
           <w:ilvl w:val="1"/>
           <w:numId w:val="9"/>
@@ -5073,7 +5072,7 @@
     </w:p>
     <w:p>
       <w:pPr>
-        <w:pStyle w:val="869"/>
+        <w:pStyle w:val="871"/>
         <w:numPr>
           <w:ilvl w:val="1"/>
           <w:numId w:val="9"/>
@@ -5090,7 +5089,7 @@
     </w:p>
     <w:p>
       <w:pPr>
-        <w:pStyle w:val="869"/>
+        <w:pStyle w:val="871"/>
         <w:numPr>
           <w:ilvl w:val="1"/>
           <w:numId w:val="9"/>
@@ -5107,7 +5106,7 @@
     </w:p>
     <w:p>
       <w:pPr>
-        <w:pStyle w:val="869"/>
+        <w:pStyle w:val="871"/>
         <w:numPr>
           <w:ilvl w:val="1"/>
           <w:numId w:val="9"/>
@@ -5142,7 +5141,7 @@
     </w:p>
     <w:p>
       <w:pPr>
-        <w:pStyle w:val="869"/>
+        <w:pStyle w:val="871"/>
         <w:numPr>
           <w:ilvl w:val="1"/>
           <w:numId w:val="9"/>
@@ -5159,7 +5158,7 @@
     </w:p>
     <w:p>
       <w:pPr>
-        <w:pStyle w:val="869"/>
+        <w:pStyle w:val="871"/>
         <w:numPr>
           <w:ilvl w:val="1"/>
           <w:numId w:val="9"/>
@@ -5170,39 +5169,30 @@
         <w:rPr/>
       </w:pPr>
       <w:r>
-        <w:t xml:space="preserve">La présence d’espaces verts au sein de la résidence et la situation de l’appartement au sein de l’immeuble (quatrième étage, avec vue dégagée sur la cour privée de la résidence) constituent de véritables atouts.</w:t>
+        <w:t xml:space="preserve">La présence d’espaces verts au sein de la résidence et la situation de l’appartement au sein de l’immeuble (vue dégagée sur le parc du Square du château constituent de véritables atouts.</w:t>
+      </w:r>
+      <w:r>
+        <w:t xml:space="preserve">{/</w:t>
+      </w:r>
+      <w:r>
+        <w:rPr>
+          <w:rFonts w:cs="Arial"/>
+          <w:szCs w:val="20"/>
+        </w:rPr>
+        <w:t xml:space="preserve">isChateauGaillard53A</w:t>
+      </w:r>
+      <w:r>
+        <w:t xml:space="preserve">}</w:t>
       </w:r>
       <w:r/>
     </w:p>
     <w:p>
       <w:pPr>
-        <w:pStyle w:val="869"/>
-        <w:numPr>
-          <w:ilvl w:val="1"/>
-          <w:numId w:val="9"/>
-        </w:numPr>
-        <w:pBdr/>
-        <w:spacing/>
-        <w:ind w:hanging="360" w:left="1440"/>
+        <w:pBdr/>
+        <w:spacing/>
+        <w:ind w:left="720"/>
         <w:rPr/>
       </w:pPr>
-      <w:r>
-        <w:t xml:space="preserve">La présence d’espaces verts au sein de la résidence et la situation de l’appartement au sein de l’immeuble (vue dégagée sur le parc du Square du château constituent de véritables atouts.</w:t>
-      </w:r>
-      <w:r/>
-      <w:r>
-        <w:t xml:space="preserve">{/</w:t>
-      </w:r>
-      <w:r>
-        <w:rPr>
-          <w:rFonts w:cs="Arial"/>
-          <w:szCs w:val="20"/>
-        </w:rPr>
-        <w:t xml:space="preserve">isChateauGaillard53A</w:t>
-      </w:r>
-      <w:r>
-        <w:t xml:space="preserve">}</w:t>
-      </w:r>
       <w:r/>
       <w:r/>
     </w:p>
@@ -5210,10 +5200,86 @@
       <w:pPr>
         <w:pBdr/>
         <w:spacing/>
-        <w:ind w:left="720"/>
+        <w:ind/>
+        <w:rPr>
+          <w:rFonts w:cs="Arial"/>
+          <w:szCs w:val="20"/>
+        </w:rPr>
+      </w:pPr>
+      <w:r>
+        <w:rPr>
+          <w:rFonts w:cs="Arial"/>
+          <w:szCs w:val="20"/>
+        </w:rPr>
+        <w:t xml:space="preserve">c) Informations relatives au loyer du dernier locataire : Le loyer appliqué au dernier locataire était de {</w:t>
+      </w:r>
+      <w:r>
+        <w:rPr>
+          <w:rFonts w:cs="Arial"/>
+          <w:szCs w:val="20"/>
+        </w:rPr>
+        <w:t xml:space="preserve">lastPriceWithoutCharge</w:t>
+      </w:r>
+      <w:r>
+        <w:rPr>
+          <w:rFonts w:cs="Arial"/>
+          <w:szCs w:val="20"/>
+        </w:rPr>
+        <w:t xml:space="preserve">}€ hors charges.</w:t>
+      </w:r>
+      <w:r>
+        <w:rPr>
+          <w:rFonts w:cs="Arial"/>
+          <w:szCs w:val="20"/>
+        </w:rPr>
+      </w:r>
+      <w:r>
+        <w:rPr>
+          <w:rFonts w:cs="Arial"/>
+          <w:szCs w:val="20"/>
+        </w:rPr>
+      </w:r>
+    </w:p>
+    <w:p>
+      <w:pPr>
+        <w:pBdr/>
+        <w:spacing/>
+        <w:ind/>
+        <w:rPr>
+          <w:rFonts w:cs="Arial"/>
+          <w:szCs w:val="20"/>
+        </w:rPr>
+      </w:pPr>
+      <w:r>
+        <w:rPr>
+          <w:rFonts w:cs="Arial"/>
+          <w:szCs w:val="20"/>
+        </w:rPr>
+      </w:r>
+      <w:r>
+        <w:rPr>
+          <w:rFonts w:cs="Arial"/>
+          <w:szCs w:val="20"/>
+        </w:rPr>
+      </w:r>
+      <w:r>
+        <w:rPr>
+          <w:rFonts w:cs="Arial"/>
+          <w:szCs w:val="20"/>
+        </w:rPr>
+      </w:r>
+    </w:p>
+    <w:p>
+      <w:pPr>
+        <w:pStyle w:val="843"/>
+        <w:pBdr/>
+        <w:spacing/>
+        <w:ind/>
         <w:rPr/>
       </w:pPr>
-      <w:r/>
+      <w:r>
+        <w:t xml:space="preserve">2° Modalités de révision</w:t>
+      </w:r>
       <w:r/>
     </w:p>
     <w:p>
@@ -5226,27 +5292,16 @@
           <w:szCs w:val="20"/>
         </w:rPr>
       </w:pPr>
-      <w:r>
-        <w:rPr>
-          <w:rFonts w:cs="Arial"/>
-          <w:szCs w:val="20"/>
-        </w:rPr>
-        <w:t xml:space="preserve">c) Informations relatives au loyer du dernier locataire : Le loyer appliqué au dernier locataire était de {</w:t>
-      </w:r>
-      <w:r>
-        <w:rPr>
-          <w:rFonts w:cs="Arial"/>
-          <w:szCs w:val="20"/>
-        </w:rPr>
-        <w:t xml:space="preserve">lastPriceWithoutCharge</w:t>
-      </w:r>
-      <w:r>
-        <w:rPr>
-          <w:rFonts w:cs="Arial"/>
-          <w:szCs w:val="20"/>
-        </w:rPr>
-        <w:t xml:space="preserve">}€ hors charges.</w:t>
-      </w:r>
+      <w:r/>
+      <w:bookmarkStart w:id="7" w:name="_Hlk206256147"/>
+      <w:r>
+        <w:rPr>
+          <w:rFonts w:cs="Arial"/>
+          <w:szCs w:val="20"/>
+        </w:rPr>
+        <w:t xml:space="preserve">Le loyer sera révisé chaque année à la date anniversaire de la signature du bail, en fonction de la variation de l’Indice de Référence des Loyers (IRL) publié par l’INSEE.</w:t>
+      </w:r>
+      <w:bookmarkEnd w:id="7"/>
       <w:r>
         <w:rPr>
           <w:rFonts w:cs="Arial"/>
@@ -5275,6 +5330,35 @@
           <w:rFonts w:cs="Arial"/>
           <w:szCs w:val="20"/>
         </w:rPr>
+        <w:t xml:space="preserve">Le trimestre de référence retenu est le {</w:t>
+      </w:r>
+      <w:r>
+        <w:rPr>
+          <w:rFonts w:cs="Arial"/>
+          <w:szCs w:val="20"/>
+        </w:rPr>
+        <w:t xml:space="preserve">tIrl</w:t>
+      </w:r>
+      <w:r>
+        <w:rPr>
+          <w:rFonts w:cs="Arial"/>
+          <w:szCs w:val="20"/>
+        </w:rPr>
+        <w:t xml:space="preserve">} valeur {</w:t>
+      </w:r>
+      <w:r>
+        <w:rPr>
+          <w:rFonts w:cs="Arial"/>
+          <w:szCs w:val="20"/>
+        </w:rPr>
+        <w:t xml:space="preserve">valIrl</w:t>
+      </w:r>
+      <w:r>
+        <w:rPr>
+          <w:rFonts w:cs="Arial"/>
+          <w:szCs w:val="20"/>
+        </w:rPr>
+        <w:t xml:space="preserve">}</w:t>
       </w:r>
       <w:r>
         <w:rPr>
@@ -5291,16 +5375,33 @@
     </w:p>
     <w:p>
       <w:pPr>
-        <w:pStyle w:val="841"/>
-        <w:pBdr/>
-        <w:spacing/>
-        <w:ind/>
-        <w:rPr/>
-      </w:pPr>
-      <w:r>
-        <w:t xml:space="preserve">2° Modalités de révision</w:t>
-      </w:r>
-      <w:r/>
+        <w:pBdr/>
+        <w:spacing/>
+        <w:ind/>
+        <w:rPr>
+          <w:rFonts w:cs="Arial"/>
+          <w:szCs w:val="20"/>
+        </w:rPr>
+      </w:pPr>
+      <w:r>
+        <w:rPr>
+          <w:rFonts w:cs="Arial"/>
+          <w:szCs w:val="20"/>
+        </w:rPr>
+        <w:t xml:space="preserve">La formule de calcul de la révision est la suivante : Nouveau loyer = Loyer actuel × (Nouvel IRL / IRL de référence)</w:t>
+      </w:r>
+      <w:r>
+        <w:rPr>
+          <w:rFonts w:cs="Arial"/>
+          <w:szCs w:val="20"/>
+        </w:rPr>
+      </w:r>
+      <w:r>
+        <w:rPr>
+          <w:rFonts w:cs="Arial"/>
+          <w:szCs w:val="20"/>
+        </w:rPr>
+      </w:r>
     </w:p>
     <w:p>
       <w:pPr>
@@ -5312,16 +5413,13 @@
           <w:szCs w:val="20"/>
         </w:rPr>
       </w:pPr>
-      <w:r/>
-      <w:bookmarkStart w:id="7" w:name="_Hlk206256147"/>
-      <w:r>
-        <w:rPr>
-          <w:rFonts w:cs="Arial"/>
-          <w:szCs w:val="20"/>
-        </w:rPr>
-        <w:t xml:space="preserve">Le loyer sera révisé chaque année à la date anniversaire de la signature du bail, en fonction de la variation de l’Indice de Référence des Loyers (IRL) publié par l’INSEE.</w:t>
-      </w:r>
-      <w:bookmarkEnd w:id="7"/>
+      <w:r>
+        <w:rPr>
+          <w:rFonts w:cs="Arial"/>
+          <w:szCs w:val="20"/>
+        </w:rPr>
+        <w:t xml:space="preserve">L’IRL de référence est celui du trimestre indiqué ci-dessus. Le nouvel IRL est celui publié par l’INSEE le jour de la date de la révision du loyer.</w:t>
+      </w:r>
       <w:r>
         <w:rPr>
           <w:rFonts w:cs="Arial"/>
@@ -5350,35 +5448,6 @@
           <w:rFonts w:cs="Arial"/>
           <w:szCs w:val="20"/>
         </w:rPr>
-        <w:t xml:space="preserve">Le trimestre de référence retenu est le {</w:t>
-      </w:r>
-      <w:r>
-        <w:rPr>
-          <w:rFonts w:cs="Arial"/>
-          <w:szCs w:val="20"/>
-        </w:rPr>
-        <w:t xml:space="preserve">tIrl</w:t>
-      </w:r>
-      <w:r>
-        <w:rPr>
-          <w:rFonts w:cs="Arial"/>
-          <w:szCs w:val="20"/>
-        </w:rPr>
-        <w:t xml:space="preserve">} valeur {</w:t>
-      </w:r>
-      <w:r>
-        <w:rPr>
-          <w:rFonts w:cs="Arial"/>
-          <w:szCs w:val="20"/>
-        </w:rPr>
-        <w:t xml:space="preserve">valIrl</w:t>
-      </w:r>
-      <w:r>
-        <w:rPr>
-          <w:rFonts w:cs="Arial"/>
-          <w:szCs w:val="20"/>
-        </w:rPr>
-        <w:t xml:space="preserve">}</w:t>
       </w:r>
       <w:r>
         <w:rPr>
@@ -5408,7 +5477,7 @@
           <w:rFonts w:cs="Arial"/>
           <w:szCs w:val="20"/>
         </w:rPr>
-        <w:t xml:space="preserve">La formule de calcul de la révision est la suivante : Nouveau loyer = Loyer actuel × (Nouvel IRL / IRL de référence)</w:t>
+        <w:t xml:space="preserve">En cas de non-application de la révision à la date prévue, le bailleur pourra en demander l’application rétroactive dans la limite d’un an.</w:t>
       </w:r>
       <w:r>
         <w:rPr>
@@ -5438,7 +5507,6 @@
           <w:rFonts w:cs="Arial"/>
           <w:szCs w:val="20"/>
         </w:rPr>
-        <w:t xml:space="preserve">L’IRL de référence est celui du trimestre indiqué ci-dessus. Le nouvel IRL est celui publié par l’INSEE le jour de la date de la révision du loyer.</w:t>
       </w:r>
       <w:r>
         <w:rPr>
@@ -5455,95 +5523,7 @@
     </w:p>
     <w:p>
       <w:pPr>
-        <w:pBdr/>
-        <w:spacing/>
-        <w:ind/>
-        <w:rPr>
-          <w:rFonts w:cs="Arial"/>
-          <w:szCs w:val="20"/>
-        </w:rPr>
-      </w:pPr>
-      <w:r>
-        <w:rPr>
-          <w:rFonts w:cs="Arial"/>
-          <w:szCs w:val="20"/>
-        </w:rPr>
-      </w:r>
-      <w:r>
-        <w:rPr>
-          <w:rFonts w:cs="Arial"/>
-          <w:szCs w:val="20"/>
-        </w:rPr>
-      </w:r>
-      <w:r>
-        <w:rPr>
-          <w:rFonts w:cs="Arial"/>
-          <w:szCs w:val="20"/>
-        </w:rPr>
-      </w:r>
-    </w:p>
-    <w:p>
-      <w:pPr>
-        <w:pBdr/>
-        <w:spacing/>
-        <w:ind/>
-        <w:rPr>
-          <w:rFonts w:cs="Arial"/>
-          <w:szCs w:val="20"/>
-        </w:rPr>
-      </w:pPr>
-      <w:r>
-        <w:rPr>
-          <w:rFonts w:cs="Arial"/>
-          <w:szCs w:val="20"/>
-        </w:rPr>
-        <w:t xml:space="preserve">En cas de non-application de la révision à la date prévue, le bailleur pourra en demander l’application rétroactive dans la limite d’un an.</w:t>
-      </w:r>
-      <w:r>
-        <w:rPr>
-          <w:rFonts w:cs="Arial"/>
-          <w:szCs w:val="20"/>
-        </w:rPr>
-      </w:r>
-      <w:r>
-        <w:rPr>
-          <w:rFonts w:cs="Arial"/>
-          <w:szCs w:val="20"/>
-        </w:rPr>
-      </w:r>
-    </w:p>
-    <w:p>
-      <w:pPr>
-        <w:pBdr/>
-        <w:spacing/>
-        <w:ind/>
-        <w:rPr>
-          <w:rFonts w:cs="Arial"/>
-          <w:szCs w:val="20"/>
-        </w:rPr>
-      </w:pPr>
-      <w:r>
-        <w:rPr>
-          <w:rFonts w:cs="Arial"/>
-          <w:szCs w:val="20"/>
-        </w:rPr>
-      </w:r>
-      <w:r>
-        <w:rPr>
-          <w:rFonts w:cs="Arial"/>
-          <w:szCs w:val="20"/>
-        </w:rPr>
-      </w:r>
-      <w:r>
-        <w:rPr>
-          <w:rFonts w:cs="Arial"/>
-          <w:szCs w:val="20"/>
-        </w:rPr>
-      </w:r>
-    </w:p>
-    <w:p>
-      <w:pPr>
-        <w:pStyle w:val="840"/>
+        <w:pStyle w:val="842"/>
         <w:pBdr/>
         <w:shd w:val="solid" w:color="ffffff" w:fill="auto"/>
         <w:spacing/>
@@ -5609,9 +5589,9 @@
           <w:b/>
           <w:color w:val="000000"/>
           <w:sz w:val="22"/>
-          <w:highlight w:val="none"/>
           <w:shd w:val="clear" w:color="auto" w:fill="ffffff"/>
         </w:rPr>
+        <w:t xml:space="preserve">1° Modalité de règlement des charges récupérables </w:t>
       </w:r>
       <w:r>
         <w:rPr>
@@ -5624,45 +5604,11 @@
       </w:r>
       <w:r>
         <w:rPr>
-          <w:rFonts w:cs="Arial"/>
-          <w:szCs w:val="20"/>
-        </w:rPr>
-      </w:r>
-      <w:r>
-        <w:rPr>
-          <w:b/>
-          <w:color w:val="000000"/>
-          <w:sz w:val="22"/>
-          <w:shd w:val="clear" w:color="auto" w:fill="ffffff"/>
-        </w:rPr>
-        <w:t xml:space="preserve">1° Modalité de règlement des charges récupérables </w:t>
-      </w:r>
-      <w:r>
-        <w:rPr>
-          <w:b/>
-          <w:color w:val="000000"/>
-          <w:sz w:val="22"/>
-          <w:shd w:val="clear" w:color="auto" w:fill="ffffff"/>
-        </w:rPr>
-      </w:r>
-      <w:r>
-        <w:rPr>
           <w:b/>
           <w:bCs/>
           <w:color w:val="000000"/>
           <w:sz w:val="22"/>
           <w:szCs w:val="22"/>
-          <w:highlight w:val="none"/>
-          <w:shd w:val="clear" w:color="auto" w:fill="ffffff"/>
-        </w:rPr>
-      </w:r>
-      <w:r>
-        <w:rPr>
-          <w:b/>
-          <w:bCs/>
-          <w:color w:val="000000"/>
-          <w:sz w:val="22"/>
-          <w:szCs w:val="22"/>
         </w:rPr>
       </w:r>
     </w:p>
@@ -6612,7 +6558,7 @@
     </w:p>
     <w:p>
       <w:pPr>
-        <w:pStyle w:val="841"/>
+        <w:pStyle w:val="843"/>
         <w:pBdr/>
         <w:spacing/>
         <w:ind/>
@@ -6703,7 +6649,7 @@
     </w:p>
     <w:p>
       <w:pPr>
-        <w:pStyle w:val="841"/>
+        <w:pStyle w:val="843"/>
         <w:pBdr/>
         <w:spacing/>
         <w:ind/>
@@ -6769,7 +6715,7 @@
     </w:p>
     <w:p>
       <w:pPr>
-        <w:pStyle w:val="841"/>
+        <w:pStyle w:val="843"/>
         <w:pBdr/>
         <w:spacing/>
         <w:ind/>
@@ -6841,7 +6787,7 @@
     </w:p>
     <w:p>
       <w:pPr>
-        <w:pStyle w:val="840"/>
+        <w:pStyle w:val="842"/>
         <w:pBdr/>
         <w:shd w:val="solid" w:color="ffffff" w:fill="auto"/>
         <w:spacing/>
@@ -6957,7 +6903,7 @@
     </w:p>
     <w:p>
       <w:pPr>
-        <w:pStyle w:val="840"/>
+        <w:pStyle w:val="842"/>
         <w:pBdr/>
         <w:shd w:val="solid" w:color="ffffff" w:fill="auto"/>
         <w:spacing/>
@@ -8440,7 +8386,7 @@
     </w:p>
     <w:p>
       <w:pPr>
-        <w:pStyle w:val="869"/>
+        <w:pStyle w:val="871"/>
         <w:pBdr/>
         <w:spacing/>
         <w:ind w:left="1418"/>
@@ -8542,7 +8488,7 @@
     </w:p>
     <w:p>
       <w:pPr>
-        <w:pStyle w:val="869"/>
+        <w:pStyle w:val="871"/>
         <w:pBdr/>
         <w:spacing/>
         <w:ind w:left="1418"/>
@@ -8629,7 +8575,7 @@
     </w:p>
     <w:p>
       <w:pPr>
-        <w:pStyle w:val="869"/>
+        <w:pStyle w:val="871"/>
         <w:pBdr/>
         <w:spacing/>
         <w:ind w:left="1418"/>
@@ -8936,7 +8882,7 @@
     </w:p>
     <w:p>
       <w:pPr>
-        <w:pStyle w:val="839"/>
+        <w:pStyle w:val="841"/>
         <w:numPr>
           <w:ilvl w:val="0"/>
           <w:numId w:val="13"/>
@@ -9140,7 +9086,7 @@
     </w:p>
     <w:p>
       <w:pPr>
-        <w:pStyle w:val="839"/>
+        <w:pStyle w:val="841"/>
         <w:numPr>
           <w:ilvl w:val="0"/>
           <w:numId w:val="13"/>
@@ -9173,7 +9119,7 @@
     </w:p>
     <w:p>
       <w:pPr>
-        <w:pStyle w:val="840"/>
+        <w:pStyle w:val="842"/>
         <w:pBdr/>
         <w:shd w:val="solid" w:color="ffffff" w:fill="auto"/>
         <w:spacing/>
@@ -9289,7 +9235,7 @@
     </w:p>
     <w:p>
       <w:pPr>
-        <w:pStyle w:val="840"/>
+        <w:pStyle w:val="842"/>
         <w:pBdr/>
         <w:shd w:val="solid" w:color="ffffff" w:fill="auto"/>
         <w:spacing/>
@@ -9448,7 +9394,7 @@
     </w:p>
     <w:p>
       <w:pPr>
-        <w:pStyle w:val="840"/>
+        <w:pStyle w:val="842"/>
         <w:pBdr/>
         <w:shd w:val="solid" w:color="ffffff" w:fill="auto"/>
         <w:spacing/>
@@ -9689,7 +9635,7 @@
     </w:p>
     <w:p>
       <w:pPr>
-        <w:pStyle w:val="839"/>
+        <w:pStyle w:val="841"/>
         <w:numPr>
           <w:ilvl w:val="0"/>
           <w:numId w:val="13"/>
@@ -9877,7 +9823,7 @@
     </w:p>
     <w:p>
       <w:pPr>
-        <w:pStyle w:val="869"/>
+        <w:pStyle w:val="871"/>
         <w:numPr>
           <w:ilvl w:val="0"/>
           <w:numId w:val="9"/>
@@ -9912,7 +9858,7 @@
     </w:p>
     <w:p>
       <w:pPr>
-        <w:pStyle w:val="869"/>
+        <w:pStyle w:val="871"/>
         <w:numPr>
           <w:ilvl w:val="0"/>
           <w:numId w:val="9"/>
@@ -9976,7 +9922,7 @@
     </w:p>
     <w:p>
       <w:pPr>
-        <w:pStyle w:val="839"/>
+        <w:pStyle w:val="841"/>
         <w:numPr>
           <w:ilvl w:val="0"/>
           <w:numId w:val="13"/>
@@ -10039,7 +9985,7 @@
     </w:p>
     <w:p>
       <w:pPr>
-        <w:pStyle w:val="840"/>
+        <w:pStyle w:val="842"/>
         <w:numPr>
           <w:ilvl w:val="0"/>
           <w:numId w:val="11"/>
@@ -10140,7 +10086,7 @@
     </w:p>
     <w:p>
       <w:pPr>
-        <w:pStyle w:val="840"/>
+        <w:pStyle w:val="842"/>
         <w:numPr>
           <w:ilvl w:val="0"/>
           <w:numId w:val="11"/>
@@ -10231,7 +10177,7 @@
     </w:p>
     <w:p>
       <w:pPr>
-        <w:pStyle w:val="840"/>
+        <w:pStyle w:val="842"/>
         <w:numPr>
           <w:ilvl w:val="0"/>
           <w:numId w:val="11"/>
@@ -10537,7 +10483,7 @@
     </w:p>
     <w:p>
       <w:pPr>
-        <w:pStyle w:val="839"/>
+        <w:pStyle w:val="841"/>
         <w:numPr>
           <w:ilvl w:val="0"/>
           <w:numId w:val="13"/>
@@ -10599,7 +10545,7 @@
     </w:p>
     <w:p>
       <w:pPr>
-        <w:pStyle w:val="840"/>
+        <w:pStyle w:val="842"/>
         <w:numPr>
           <w:ilvl w:val="0"/>
           <w:numId w:val="2"/>
@@ -10700,7 +10646,7 @@
     </w:p>
     <w:p>
       <w:pPr>
-        <w:pStyle w:val="869"/>
+        <w:pStyle w:val="871"/>
         <w:numPr>
           <w:ilvl w:val="0"/>
           <w:numId w:val="5"/>
@@ -10777,7 +10723,7 @@
     </w:p>
     <w:p>
       <w:pPr>
-        <w:pStyle w:val="840"/>
+        <w:pStyle w:val="842"/>
         <w:numPr>
           <w:ilvl w:val="0"/>
           <w:numId w:val="2"/>
@@ -11008,7 +10954,7 @@
     </w:p>
     <w:p>
       <w:pPr>
-        <w:pStyle w:val="840"/>
+        <w:pStyle w:val="842"/>
         <w:numPr>
           <w:ilvl w:val="0"/>
           <w:numId w:val="2"/>
@@ -11135,7 +11081,7 @@
     </w:p>
     <w:p>
       <w:pPr>
-        <w:pStyle w:val="840"/>
+        <w:pStyle w:val="842"/>
         <w:numPr>
           <w:ilvl w:val="0"/>
           <w:numId w:val="2"/>
@@ -11259,7 +11205,7 @@
     </w:p>
     <w:p>
       <w:pPr>
-        <w:pStyle w:val="840"/>
+        <w:pStyle w:val="842"/>
         <w:numPr>
           <w:ilvl w:val="0"/>
           <w:numId w:val="2"/>
@@ -11351,7 +11297,7 @@
     </w:p>
     <w:p>
       <w:pPr>
-        <w:pStyle w:val="840"/>
+        <w:pStyle w:val="842"/>
         <w:numPr>
           <w:ilvl w:val="0"/>
           <w:numId w:val="2"/>
@@ -11411,7 +11357,7 @@
     </w:p>
     <w:p>
       <w:pPr>
-        <w:pStyle w:val="869"/>
+        <w:pStyle w:val="871"/>
         <w:numPr>
           <w:ilvl w:val="0"/>
           <w:numId w:val="9"/>
@@ -11450,7 +11396,7 @@
     </w:p>
     <w:p>
       <w:pPr>
-        <w:pStyle w:val="869"/>
+        <w:pStyle w:val="871"/>
         <w:numPr>
           <w:ilvl w:val="0"/>
           <w:numId w:val="10"/>
@@ -11467,7 +11413,7 @@
     </w:p>
     <w:p>
       <w:pPr>
-        <w:pStyle w:val="869"/>
+        <w:pStyle w:val="871"/>
         <w:numPr>
           <w:ilvl w:val="0"/>
           <w:numId w:val="10"/>
@@ -11484,7 +11430,7 @@
     </w:p>
     <w:p>
       <w:pPr>
-        <w:pStyle w:val="869"/>
+        <w:pStyle w:val="871"/>
         <w:numPr>
           <w:ilvl w:val="0"/>
           <w:numId w:val="10"/>
@@ -11501,7 +11447,7 @@
     </w:p>
     <w:p>
       <w:pPr>
-        <w:pStyle w:val="869"/>
+        <w:pStyle w:val="871"/>
         <w:numPr>
           <w:ilvl w:val="0"/>
           <w:numId w:val="10"/>
@@ -11562,7 +11508,7 @@
     </w:p>
     <w:p>
       <w:pPr>
-        <w:pStyle w:val="841"/>
+        <w:pStyle w:val="843"/>
         <w:pBdr/>
         <w:spacing/>
         <w:ind/>
@@ -11635,7 +11581,7 @@
     </w:p>
     <w:p>
       <w:pPr>
-        <w:pStyle w:val="841"/>
+        <w:pStyle w:val="843"/>
         <w:pBdr/>
         <w:spacing/>
         <w:ind/>
@@ -11809,7 +11755,7 @@
     </w:p>
     <w:p>
       <w:pPr>
-        <w:pStyle w:val="841"/>
+        <w:pStyle w:val="843"/>
         <w:pBdr/>
         <w:spacing/>
         <w:ind/>
@@ -11847,7 +11793,7 @@
     </w:p>
     <w:p>
       <w:pPr>
-        <w:pStyle w:val="840"/>
+        <w:pStyle w:val="842"/>
         <w:numPr>
           <w:ilvl w:val="0"/>
           <w:numId w:val="2"/>
@@ -11937,7 +11883,7 @@
     </w:p>
     <w:p>
       <w:pPr>
-        <w:pStyle w:val="840"/>
+        <w:pStyle w:val="842"/>
         <w:numPr>
           <w:ilvl w:val="0"/>
           <w:numId w:val="2"/>
@@ -11993,7 +11939,7 @@
     </w:p>
     <w:p>
       <w:pPr>
-        <w:pStyle w:val="869"/>
+        <w:pStyle w:val="871"/>
         <w:numPr>
           <w:ilvl w:val="0"/>
           <w:numId w:val="16"/>
@@ -12011,7 +11957,7 @@
     </w:p>
     <w:p>
       <w:pPr>
-        <w:pStyle w:val="869"/>
+        <w:pStyle w:val="871"/>
         <w:numPr>
           <w:ilvl w:val="0"/>
           <w:numId w:val="16"/>
@@ -12029,7 +11975,7 @@
     </w:p>
     <w:p>
       <w:pPr>
-        <w:pStyle w:val="869"/>
+        <w:pStyle w:val="871"/>
         <w:numPr>
           <w:ilvl w:val="0"/>
           <w:numId w:val="16"/>
@@ -12071,7 +12017,7 @@
     </w:p>
     <w:p>
       <w:pPr>
-        <w:pStyle w:val="869"/>
+        <w:pStyle w:val="871"/>
         <w:numPr>
           <w:ilvl w:val="0"/>
           <w:numId w:val="16"/>
@@ -12089,7 +12035,7 @@
     </w:p>
     <w:p>
       <w:pPr>
-        <w:pStyle w:val="869"/>
+        <w:pStyle w:val="871"/>
         <w:numPr>
           <w:ilvl w:val="0"/>
           <w:numId w:val="16"/>
@@ -12107,7 +12053,7 @@
     </w:p>
     <w:p>
       <w:pPr>
-        <w:pStyle w:val="869"/>
+        <w:pStyle w:val="871"/>
         <w:numPr>
           <w:ilvl w:val="0"/>
           <w:numId w:val="16"/>
@@ -12186,7 +12132,7 @@
     </w:p>
     <w:p>
       <w:pPr>
-        <w:pStyle w:val="869"/>
+        <w:pStyle w:val="871"/>
         <w:numPr>
           <w:ilvl w:val="0"/>
           <w:numId w:val="4"/>
@@ -12204,7 +12150,7 @@
     </w:p>
     <w:p>
       <w:pPr>
-        <w:pStyle w:val="869"/>
+        <w:pStyle w:val="871"/>
         <w:numPr>
           <w:ilvl w:val="0"/>
           <w:numId w:val="4"/>
@@ -12222,7 +12168,7 @@
     </w:p>
     <w:p>
       <w:pPr>
-        <w:pStyle w:val="869"/>
+        <w:pStyle w:val="871"/>
         <w:numPr>
           <w:ilvl w:val="0"/>
           <w:numId w:val="4"/>
@@ -12264,7 +12210,7 @@
     </w:p>
     <w:p>
       <w:pPr>
-        <w:pStyle w:val="869"/>
+        <w:pStyle w:val="871"/>
         <w:numPr>
           <w:ilvl w:val="0"/>
           <w:numId w:val="7"/>
@@ -12282,7 +12228,7 @@
     </w:p>
     <w:p>
       <w:pPr>
-        <w:pStyle w:val="869"/>
+        <w:pStyle w:val="871"/>
         <w:numPr>
           <w:ilvl w:val="0"/>
           <w:numId w:val="7"/>
@@ -12311,7 +12257,7 @@
     </w:p>
     <w:p>
       <w:pPr>
-        <w:pStyle w:val="840"/>
+        <w:pStyle w:val="842"/>
         <w:numPr>
           <w:ilvl w:val="0"/>
           <w:numId w:val="2"/>
@@ -12434,7 +12380,7 @@
     </w:p>
     <w:p>
       <w:pPr>
-        <w:pStyle w:val="839"/>
+        <w:pStyle w:val="841"/>
         <w:numPr>
           <w:ilvl w:val="0"/>
           <w:numId w:val="13"/>
@@ -13035,7 +12981,7 @@
         </w:tcPr>
         <w:p>
           <w:pPr>
-            <w:pStyle w:val="874"/>
+            <w:pStyle w:val="876"/>
             <w:pBdr/>
             <w:spacing/>
             <w:ind/>
@@ -13077,7 +13023,7 @@
         </w:tcPr>
         <w:p>
           <w:pPr>
-            <w:pStyle w:val="874"/>
+            <w:pStyle w:val="876"/>
             <w:pBdr/>
             <w:spacing/>
             <w:ind/>
@@ -13117,7 +13063,7 @@
               </w:tcPr>
               <w:p>
                 <w:pPr>
-                  <w:pStyle w:val="874"/>
+                  <w:pStyle w:val="876"/>
                   <w:pBdr/>
                   <w:spacing/>
                   <w:ind/>
@@ -13131,7 +13077,7 @@
               </w:p>
               <w:p>
                 <w:pPr>
-                  <w:pStyle w:val="874"/>
+                  <w:pStyle w:val="876"/>
                   <w:pBdr/>
                   <w:spacing/>
                   <w:ind/>
@@ -13151,7 +13097,7 @@
         </w:tbl>
         <w:p>
           <w:pPr>
-            <w:pStyle w:val="874"/>
+            <w:pStyle w:val="876"/>
             <w:pBdr/>
             <w:spacing/>
             <w:ind/>
@@ -13170,7 +13116,7 @@
         </w:tcPr>
         <w:p>
           <w:pPr>
-            <w:pStyle w:val="874"/>
+            <w:pStyle w:val="876"/>
             <w:pBdr/>
             <w:spacing/>
             <w:ind/>
@@ -13219,7 +13165,7 @@
   </w:tbl>
   <w:p>
     <w:pPr>
-      <w:pStyle w:val="874"/>
+      <w:pStyle w:val="876"/>
       <w:pBdr/>
       <w:spacing/>
       <w:ind/>
@@ -13283,7 +13229,7 @@
 <w:hdr xmlns:wpc="http://schemas.microsoft.com/office/word/2010/wordprocessingCanvas" xmlns:mc="http://schemas.openxmlformats.org/markup-compatibility/2006" xmlns:o="urn:schemas-microsoft-com:office:office" xmlns:r="http://schemas.openxmlformats.org/officeDocument/2006/relationships" xmlns:m="http://schemas.openxmlformats.org/officeDocument/2006/math" xmlns:v="urn:schemas-microsoft-com:vml" xmlns:wp14="http://schemas.microsoft.com/office/word/2010/wordprocessingDrawing" xmlns:wp="http://schemas.openxmlformats.org/drawingml/2006/wordprocessingDrawing" xmlns:w10="urn:schemas-microsoft-com:office:word" xmlns:w="http://schemas.openxmlformats.org/wordprocessingml/2006/main" xmlns:w14="http://schemas.microsoft.com/office/word/2010/wordml" xmlns:w15="http://schemas.microsoft.com/office/word/2012/wordml" xmlns:wpg="http://schemas.microsoft.com/office/word/2010/wordprocessingGroup" xmlns:wpi="http://schemas.microsoft.com/office/word/2010/wordprocessingInk" xmlns:wne="http://schemas.microsoft.com/office/word/2006/wordml" xmlns:a="http://schemas.openxmlformats.org/drawingml/2006/main" xmlns:wps="http://schemas.microsoft.com/office/word/2010/wordprocessingShape" mc:Ignorable="w14 w15 wp14">
   <w:p>
     <w:pPr>
-      <w:pStyle w:val="873"/>
+      <w:pStyle w:val="875"/>
       <w:pBdr/>
       <w:spacing/>
       <w:ind/>
@@ -14058,7 +14004,7 @@
         <w:spacing/>
         <w:ind w:firstLine="0" w:left="360"/>
       </w:pPr>
-      <w:pStyle w:val="867"/>
+      <w:pStyle w:val="869"/>
       <w:rPr>
         <w:spacing w:val="0"/>
       </w:rPr>
@@ -17176,7 +17122,7 @@
     <w:lsdException w:name="Bibliography" w:uiPriority="37"/>
     <w:lsdException w:name="TOC Heading" w:uiPriority="39" w:qFormat="1"/>
   </w:latentStyles>
-  <w:style w:type="paragraph" w:styleId="838" w:default="1">
+  <w:style w:type="paragraph" w:styleId="840" w:default="1">
     <w:name w:val="Normal"/>
     <w:qFormat/>
     <w:pPr>
@@ -17188,10 +17134,10 @@
       <w:szCs w:val="22"/>
     </w:rPr>
   </w:style>
-  <w:style w:type="paragraph" w:styleId="839">
+  <w:style w:type="paragraph" w:styleId="841">
     <w:name w:val="Heading 1"/>
-    <w:basedOn w:val="838"/>
-    <w:next w:val="838"/>
+    <w:basedOn w:val="840"/>
+    <w:next w:val="840"/>
     <w:qFormat/>
     <w:pPr>
       <w:widowControl w:val="false"/>
@@ -17216,10 +17162,10 @@
       <w:szCs w:val="24"/>
     </w:rPr>
   </w:style>
-  <w:style w:type="paragraph" w:styleId="840">
+  <w:style w:type="paragraph" w:styleId="842">
     <w:name w:val="Heading 2"/>
-    <w:basedOn w:val="838"/>
-    <w:next w:val="838"/>
+    <w:basedOn w:val="840"/>
+    <w:next w:val="840"/>
     <w:qFormat/>
     <w:pPr>
       <w:widowControl w:val="false"/>
@@ -17244,10 +17190,10 @@
       <w:szCs w:val="24"/>
     </w:rPr>
   </w:style>
-  <w:style w:type="paragraph" w:styleId="841">
+  <w:style w:type="paragraph" w:styleId="843">
     <w:name w:val="Heading 3"/>
-    <w:basedOn w:val="838"/>
-    <w:next w:val="838"/>
+    <w:basedOn w:val="840"/>
+    <w:next w:val="840"/>
     <w:qFormat/>
     <w:pPr>
       <w:keepNext w:val="true"/>
@@ -17270,10 +17216,10 @@
       <w:sz w:val="22"/>
     </w:rPr>
   </w:style>
-  <w:style w:type="paragraph" w:styleId="842">
+  <w:style w:type="paragraph" w:styleId="844">
     <w:name w:val="Heading 4"/>
-    <w:basedOn w:val="838"/>
-    <w:next w:val="838"/>
+    <w:basedOn w:val="840"/>
+    <w:next w:val="840"/>
     <w:qFormat/>
     <w:pPr>
       <w:keepNext w:val="true"/>
@@ -17290,10 +17236,10 @@
       <w:color w:val="0f4761"/>
     </w:rPr>
   </w:style>
-  <w:style w:type="paragraph" w:styleId="843">
+  <w:style w:type="paragraph" w:styleId="845">
     <w:name w:val="Heading 5"/>
-    <w:basedOn w:val="838"/>
-    <w:next w:val="838"/>
+    <w:basedOn w:val="840"/>
+    <w:next w:val="840"/>
     <w:qFormat/>
     <w:pPr>
       <w:keepNext w:val="true"/>
@@ -17308,10 +17254,10 @@
       <w:color w:val="0f4761"/>
     </w:rPr>
   </w:style>
-  <w:style w:type="paragraph" w:styleId="844">
+  <w:style w:type="paragraph" w:styleId="846">
     <w:name w:val="Heading 6"/>
-    <w:basedOn w:val="838"/>
-    <w:next w:val="838"/>
+    <w:basedOn w:val="840"/>
+    <w:next w:val="840"/>
     <w:qFormat/>
     <w:pPr>
       <w:keepNext w:val="true"/>
@@ -17328,10 +17274,10 @@
       <w:color w:val="595959"/>
     </w:rPr>
   </w:style>
-  <w:style w:type="paragraph" w:styleId="845">
+  <w:style w:type="paragraph" w:styleId="847">
     <w:name w:val="Heading 7"/>
-    <w:basedOn w:val="838"/>
-    <w:next w:val="838"/>
+    <w:basedOn w:val="840"/>
+    <w:next w:val="840"/>
     <w:qFormat/>
     <w:pPr>
       <w:keepNext w:val="true"/>
@@ -17348,10 +17294,10 @@
       <w:color w:val="404040"/>
     </w:rPr>
   </w:style>
-  <w:style w:type="paragraph" w:styleId="846">
+  <w:style w:type="paragraph" w:styleId="848">
     <w:name w:val="Heading 8"/>
-    <w:basedOn w:val="838"/>
-    <w:next w:val="838"/>
+    <w:basedOn w:val="840"/>
+    <w:next w:val="840"/>
     <w:qFormat/>
     <w:pPr>
       <w:keepNext w:val="true"/>
@@ -17367,10 +17313,10 @@
       <w:szCs w:val="20"/>
     </w:rPr>
   </w:style>
-  <w:style w:type="paragraph" w:styleId="847">
+  <w:style w:type="paragraph" w:styleId="849">
     <w:name w:val="Heading 9"/>
-    <w:basedOn w:val="838"/>
-    <w:next w:val="838"/>
+    <w:basedOn w:val="840"/>
+    <w:next w:val="840"/>
     <w:qFormat/>
     <w:pPr>
       <w:keepNext w:val="true"/>
@@ -17388,7 +17334,7 @@
       <w:szCs w:val="20"/>
     </w:rPr>
   </w:style>
-  <w:style w:type="character" w:styleId="848" w:default="1">
+  <w:style w:type="character" w:styleId="850" w:default="1">
     <w:name w:val="Default Paragraph Font"/>
     <w:uiPriority w:val="1"/>
     <w:unhideWhenUsed/>
@@ -17398,7 +17344,7 @@
       <w:ind/>
     </w:pPr>
   </w:style>
-  <w:style w:type="table" w:styleId="849" w:default="1">
+  <w:style w:type="table" w:styleId="851" w:default="1">
     <w:name w:val="Normal Table"/>
     <w:uiPriority w:val="99"/>
     <w:semiHidden/>
@@ -17591,7 +17537,7 @@
       </w:tcPr>
     </w:tblStylePr>
   </w:style>
-  <w:style w:type="numbering" w:styleId="850" w:default="1">
+  <w:style w:type="numbering" w:styleId="852" w:default="1">
     <w:name w:val="No List"/>
     <w:uiPriority w:val="99"/>
     <w:semiHidden/>
@@ -17602,10 +17548,10 @@
       <w:ind/>
     </w:pPr>
   </w:style>
-  <w:style w:type="paragraph" w:styleId="851">
+  <w:style w:type="paragraph" w:styleId="853">
     <w:name w:val="Quote"/>
-    <w:basedOn w:val="838"/>
-    <w:next w:val="838"/>
+    <w:basedOn w:val="840"/>
+    <w:next w:val="840"/>
     <w:qFormat/>
     <w:pPr>
       <w:pBdr/>
@@ -17619,10 +17565,10 @@
       <w:color w:val="404040"/>
     </w:rPr>
   </w:style>
-  <w:style w:type="paragraph" w:styleId="852">
+  <w:style w:type="paragraph" w:styleId="854">
     <w:name w:val="Intense Quote"/>
-    <w:basedOn w:val="838"/>
-    <w:next w:val="838"/>
+    <w:basedOn w:val="840"/>
+    <w:next w:val="840"/>
     <w:qFormat/>
     <w:pPr>
       <w:pBdr>
@@ -17642,10 +17588,10 @@
       <w:color w:val="0f4761"/>
     </w:rPr>
   </w:style>
-  <w:style w:type="paragraph" w:styleId="853">
+  <w:style w:type="paragraph" w:styleId="855">
     <w:name w:val="Caption"/>
-    <w:basedOn w:val="838"/>
-    <w:next w:val="838"/>
+    <w:basedOn w:val="840"/>
+    <w:next w:val="840"/>
     <w:qFormat/>
     <w:pPr>
       <w:pBdr/>
@@ -17660,10 +17606,10 @@
       <w:szCs w:val="18"/>
     </w:rPr>
   </w:style>
-  <w:style w:type="paragraph" w:styleId="854">
+  <w:style w:type="paragraph" w:styleId="856">
     <w:name w:val="toc 1"/>
-    <w:basedOn w:val="838"/>
-    <w:next w:val="838"/>
+    <w:basedOn w:val="840"/>
+    <w:next w:val="840"/>
     <w:qFormat/>
     <w:pPr>
       <w:pBdr/>
@@ -17671,10 +17617,10 @@
       <w:ind/>
     </w:pPr>
   </w:style>
-  <w:style w:type="paragraph" w:styleId="855">
+  <w:style w:type="paragraph" w:styleId="857">
     <w:name w:val="toc 2"/>
-    <w:basedOn w:val="838"/>
-    <w:next w:val="838"/>
+    <w:basedOn w:val="840"/>
+    <w:next w:val="840"/>
     <w:qFormat/>
     <w:pPr>
       <w:pBdr/>
@@ -17682,10 +17628,10 @@
       <w:ind w:left="220"/>
     </w:pPr>
   </w:style>
-  <w:style w:type="paragraph" w:styleId="856">
+  <w:style w:type="paragraph" w:styleId="858">
     <w:name w:val="toc 3"/>
-    <w:basedOn w:val="838"/>
-    <w:next w:val="838"/>
+    <w:basedOn w:val="840"/>
+    <w:next w:val="840"/>
     <w:qFormat/>
     <w:pPr>
       <w:pBdr/>
@@ -17693,10 +17639,10 @@
       <w:ind w:left="440"/>
     </w:pPr>
   </w:style>
-  <w:style w:type="paragraph" w:styleId="857">
+  <w:style w:type="paragraph" w:styleId="859">
     <w:name w:val="toc 4"/>
-    <w:basedOn w:val="838"/>
-    <w:next w:val="838"/>
+    <w:basedOn w:val="840"/>
+    <w:next w:val="840"/>
     <w:qFormat/>
     <w:pPr>
       <w:pBdr/>
@@ -17704,10 +17650,10 @@
       <w:ind w:left="660"/>
     </w:pPr>
   </w:style>
-  <w:style w:type="paragraph" w:styleId="858">
+  <w:style w:type="paragraph" w:styleId="860">
     <w:name w:val="toc 5"/>
-    <w:basedOn w:val="838"/>
-    <w:next w:val="838"/>
+    <w:basedOn w:val="840"/>
+    <w:next w:val="840"/>
     <w:qFormat/>
     <w:pPr>
       <w:pBdr/>
@@ -17715,10 +17661,10 @@
       <w:ind w:left="880"/>
     </w:pPr>
   </w:style>
-  <w:style w:type="paragraph" w:styleId="859">
+  <w:style w:type="paragraph" w:styleId="861">
     <w:name w:val="toc 6"/>
-    <w:basedOn w:val="838"/>
-    <w:next w:val="838"/>
+    <w:basedOn w:val="840"/>
+    <w:next w:val="840"/>
     <w:qFormat/>
     <w:pPr>
       <w:pBdr/>
@@ -17726,10 +17672,10 @@
       <w:ind w:left="1100"/>
     </w:pPr>
   </w:style>
-  <w:style w:type="paragraph" w:styleId="860">
+  <w:style w:type="paragraph" w:styleId="862">
     <w:name w:val="toc 7"/>
-    <w:basedOn w:val="838"/>
-    <w:next w:val="838"/>
+    <w:basedOn w:val="840"/>
+    <w:next w:val="840"/>
     <w:qFormat/>
     <w:pPr>
       <w:pBdr/>
@@ -17737,10 +17683,10 @@
       <w:ind w:left="1320"/>
     </w:pPr>
   </w:style>
-  <w:style w:type="paragraph" w:styleId="861">
+  <w:style w:type="paragraph" w:styleId="863">
     <w:name w:val="toc 8"/>
-    <w:basedOn w:val="838"/>
-    <w:next w:val="838"/>
+    <w:basedOn w:val="840"/>
+    <w:next w:val="840"/>
     <w:qFormat/>
     <w:pPr>
       <w:pBdr/>
@@ -17748,10 +17694,10 @@
       <w:ind w:left="1540"/>
     </w:pPr>
   </w:style>
-  <w:style w:type="paragraph" w:styleId="862">
+  <w:style w:type="paragraph" w:styleId="864">
     <w:name w:val="toc 9"/>
-    <w:basedOn w:val="838"/>
-    <w:next w:val="838"/>
+    <w:basedOn w:val="840"/>
+    <w:next w:val="840"/>
     <w:qFormat/>
     <w:pPr>
       <w:pBdr/>
@@ -17759,7 +17705,7 @@
       <w:ind w:left="1760"/>
     </w:pPr>
   </w:style>
-  <w:style w:type="paragraph" w:styleId="863">
+  <w:style w:type="paragraph" w:styleId="865">
     <w:name w:val="TOC Heading"/>
     <w:qFormat/>
     <w:pPr>
@@ -17769,10 +17715,10 @@
       <w:jc w:val="left"/>
     </w:pPr>
   </w:style>
-  <w:style w:type="paragraph" w:styleId="864">
+  <w:style w:type="paragraph" w:styleId="866">
     <w:name w:val="table of figures"/>
-    <w:basedOn w:val="838"/>
-    <w:next w:val="838"/>
+    <w:basedOn w:val="840"/>
+    <w:next w:val="840"/>
     <w:qFormat/>
     <w:pPr>
       <w:pBdr/>
@@ -17780,9 +17726,9 @@
       <w:ind/>
     </w:pPr>
   </w:style>
-  <w:style w:type="paragraph" w:styleId="865">
+  <w:style w:type="paragraph" w:styleId="867">
     <w:name w:val="Body Text 2"/>
-    <w:basedOn w:val="838"/>
+    <w:basedOn w:val="840"/>
     <w:qFormat/>
     <w:pPr>
       <w:widowControl w:val="false"/>
@@ -17794,9 +17740,9 @@
       <w:rFonts w:eastAsia="Times New Roman" w:cs="Arial"/>
     </w:rPr>
   </w:style>
-  <w:style w:type="paragraph" w:styleId="866">
+  <w:style w:type="paragraph" w:styleId="868">
     <w:name w:val="Body Text 3"/>
-    <w:basedOn w:val="838"/>
+    <w:basedOn w:val="840"/>
     <w:qFormat/>
     <w:pPr>
       <w:pBdr/>
@@ -17808,9 +17754,9 @@
       <w:szCs w:val="16"/>
     </w:rPr>
   </w:style>
-  <w:style w:type="paragraph" w:styleId="867" w:customStyle="1">
+  <w:style w:type="paragraph" w:styleId="869" w:customStyle="1">
     <w:name w:val="Titres conditions générales"/>
-    <w:basedOn w:val="838"/>
+    <w:basedOn w:val="840"/>
     <w:qFormat/>
     <w:pPr>
       <w:numPr>
@@ -17826,7 +17772,7 @@
       <w:sz w:val="22"/>
     </w:rPr>
   </w:style>
-  <w:style w:type="paragraph" w:styleId="868">
+  <w:style w:type="paragraph" w:styleId="870">
     <w:name w:val="No Spacing"/>
     <w:qFormat/>
     <w:pPr>
@@ -17841,9 +17787,9 @@
       <w:szCs w:val="22"/>
     </w:rPr>
   </w:style>
-  <w:style w:type="paragraph" w:styleId="869">
+  <w:style w:type="paragraph" w:styleId="871">
     <w:name w:val="List Paragraph"/>
-    <w:basedOn w:val="838"/>
+    <w:basedOn w:val="840"/>
     <w:qFormat/>
     <w:pPr>
       <w:pBdr/>
@@ -17852,9 +17798,9 @@
       <w:contextualSpacing w:val="true"/>
     </w:pPr>
   </w:style>
-  <w:style w:type="paragraph" w:styleId="870" w:customStyle="1">
+  <w:style w:type="paragraph" w:styleId="872" w:customStyle="1">
     <w:name w:val="Annexes - Soustitre"/>
-    <w:basedOn w:val="838"/>
+    <w:basedOn w:val="840"/>
     <w:qFormat/>
     <w:pPr>
       <w:pBdr/>
@@ -17867,10 +17813,10 @@
       <w:color w:val="7f7f7f"/>
     </w:rPr>
   </w:style>
-  <w:style w:type="paragraph" w:styleId="871">
+  <w:style w:type="paragraph" w:styleId="873">
     <w:name w:val="Title"/>
-    <w:basedOn w:val="838"/>
-    <w:next w:val="838"/>
+    <w:basedOn w:val="840"/>
+    <w:next w:val="840"/>
     <w:qFormat/>
     <w:pPr>
       <w:pBdr/>
@@ -17887,10 +17833,10 @@
       <w:szCs w:val="52"/>
     </w:rPr>
   </w:style>
-  <w:style w:type="paragraph" w:styleId="872">
+  <w:style w:type="paragraph" w:styleId="874">
     <w:name w:val="Subtitle"/>
-    <w:basedOn w:val="838"/>
-    <w:next w:val="838"/>
+    <w:basedOn w:val="840"/>
+    <w:next w:val="840"/>
     <w:qFormat/>
     <w:pPr>
       <w:pBdr/>
@@ -17907,9 +17853,9 @@
       <w:szCs w:val="24"/>
     </w:rPr>
   </w:style>
-  <w:style w:type="paragraph" w:styleId="873">
+  <w:style w:type="paragraph" w:styleId="875">
     <w:name w:val="Header"/>
-    <w:basedOn w:val="838"/>
+    <w:basedOn w:val="840"/>
     <w:qFormat/>
     <w:pPr>
       <w:pBdr/>
@@ -17921,9 +17867,9 @@
       <w:ind/>
     </w:pPr>
   </w:style>
-  <w:style w:type="paragraph" w:styleId="874">
+  <w:style w:type="paragraph" w:styleId="876">
     <w:name w:val="Footer"/>
-    <w:basedOn w:val="838"/>
+    <w:basedOn w:val="840"/>
     <w:qFormat/>
     <w:pPr>
       <w:pBdr/>
@@ -17935,9 +17881,9 @@
       <w:ind/>
     </w:pPr>
   </w:style>
-  <w:style w:type="paragraph" w:styleId="875">
+  <w:style w:type="paragraph" w:styleId="877">
     <w:name w:val="Balloon Text"/>
-    <w:basedOn w:val="838"/>
+    <w:basedOn w:val="840"/>
     <w:qFormat/>
     <w:pPr>
       <w:pBdr/>
@@ -17950,9 +17896,9 @@
       <w:szCs w:val="16"/>
     </w:rPr>
   </w:style>
-  <w:style w:type="paragraph" w:styleId="876" w:customStyle="1">
+  <w:style w:type="paragraph" w:styleId="878" w:customStyle="1">
     <w:name w:val="Conditions générales"/>
-    <w:basedOn w:val="838"/>
+    <w:basedOn w:val="840"/>
     <w:qFormat/>
     <w:pPr>
       <w:pBdr/>
@@ -17963,9 +17909,9 @@
       <w:sz w:val="18"/>
     </w:rPr>
   </w:style>
-  <w:style w:type="paragraph" w:styleId="877">
+  <w:style w:type="paragraph" w:styleId="879">
     <w:name w:val="endnote text"/>
-    <w:basedOn w:val="838"/>
+    <w:basedOn w:val="840"/>
     <w:qFormat/>
     <w:pPr>
       <w:pBdr/>
@@ -17976,9 +17922,9 @@
       <w:szCs w:val="20"/>
     </w:rPr>
   </w:style>
-  <w:style w:type="paragraph" w:styleId="878">
+  <w:style w:type="paragraph" w:styleId="880">
     <w:name w:val="footnote text"/>
-    <w:basedOn w:val="838"/>
+    <w:basedOn w:val="840"/>
     <w:qFormat/>
     <w:pPr>
       <w:pBdr/>
@@ -17989,9 +17935,9 @@
       <w:szCs w:val="20"/>
     </w:rPr>
   </w:style>
-  <w:style w:type="paragraph" w:styleId="879" w:customStyle="1">
+  <w:style w:type="paragraph" w:styleId="881" w:customStyle="1">
     <w:name w:val="Commentaire1"/>
-    <w:basedOn w:val="838"/>
+    <w:basedOn w:val="840"/>
     <w:qFormat/>
     <w:pPr>
       <w:pBdr/>
@@ -18002,10 +17948,10 @@
       <w:szCs w:val="20"/>
     </w:rPr>
   </w:style>
-  <w:style w:type="paragraph" w:styleId="880" w:customStyle="1">
+  <w:style w:type="paragraph" w:styleId="882" w:customStyle="1">
     <w:name w:val="Objet du commentaire1"/>
-    <w:basedOn w:val="879"/>
-    <w:next w:val="879"/>
+    <w:basedOn w:val="881"/>
+    <w:next w:val="881"/>
     <w:qFormat/>
     <w:pPr>
       <w:pBdr/>
@@ -18017,7 +17963,7 @@
       <w:bCs/>
     </w:rPr>
   </w:style>
-  <w:style w:type="paragraph" w:styleId="881">
+  <w:style w:type="paragraph" w:styleId="883">
     <w:name w:val="Revision"/>
     <w:qFormat/>
     <w:pPr>
@@ -18030,7 +17976,7 @@
       <w:szCs w:val="22"/>
     </w:rPr>
   </w:style>
-  <w:style w:type="paragraph" w:styleId="882" w:customStyle="1">
+  <w:style w:type="paragraph" w:styleId="884" w:customStyle="1">
     <w:name w:val="Default"/>
     <w:qFormat/>
     <w:pPr>
@@ -18046,9 +17992,9 @@
       <w:szCs w:val="24"/>
     </w:rPr>
   </w:style>
-  <w:style w:type="character" w:styleId="883" w:customStyle="1">
+  <w:style w:type="character" w:styleId="885" w:customStyle="1">
     <w:name w:val="Heading 1 Char"/>
-    <w:basedOn w:val="848"/>
+    <w:basedOn w:val="850"/>
     <w:pPr>
       <w:pBdr/>
       <w:spacing/>
@@ -18061,9 +18007,9 @@
       <w:szCs w:val="40"/>
     </w:rPr>
   </w:style>
-  <w:style w:type="character" w:styleId="884" w:customStyle="1">
+  <w:style w:type="character" w:styleId="886" w:customStyle="1">
     <w:name w:val="Heading 2 Char"/>
-    <w:basedOn w:val="848"/>
+    <w:basedOn w:val="850"/>
     <w:pPr>
       <w:pBdr/>
       <w:spacing/>
@@ -18076,9 +18022,9 @@
       <w:szCs w:val="32"/>
     </w:rPr>
   </w:style>
-  <w:style w:type="character" w:styleId="885" w:customStyle="1">
+  <w:style w:type="character" w:styleId="887" w:customStyle="1">
     <w:name w:val="Heading 3 Char"/>
-    <w:basedOn w:val="848"/>
+    <w:basedOn w:val="850"/>
     <w:pPr>
       <w:pBdr/>
       <w:spacing/>
@@ -18091,9 +18037,9 @@
       <w:szCs w:val="28"/>
     </w:rPr>
   </w:style>
-  <w:style w:type="character" w:styleId="886" w:customStyle="1">
+  <w:style w:type="character" w:styleId="888" w:customStyle="1">
     <w:name w:val="Heading 4 Char"/>
-    <w:basedOn w:val="848"/>
+    <w:basedOn w:val="850"/>
     <w:pPr>
       <w:pBdr/>
       <w:spacing/>
@@ -18106,9 +18052,9 @@
       <w:color w:val="0f4761"/>
     </w:rPr>
   </w:style>
-  <w:style w:type="character" w:styleId="887" w:customStyle="1">
+  <w:style w:type="character" w:styleId="889" w:customStyle="1">
     <w:name w:val="Heading 5 Char"/>
-    <w:basedOn w:val="848"/>
+    <w:basedOn w:val="850"/>
     <w:pPr>
       <w:pBdr/>
       <w:spacing/>
@@ -18119,9 +18065,9 @@
       <w:color w:val="0f4761"/>
     </w:rPr>
   </w:style>
-  <w:style w:type="character" w:styleId="888" w:customStyle="1">
+  <w:style w:type="character" w:styleId="890" w:customStyle="1">
     <w:name w:val="Heading 6 Char"/>
-    <w:basedOn w:val="848"/>
+    <w:basedOn w:val="850"/>
     <w:pPr>
       <w:pBdr/>
       <w:spacing/>
@@ -18134,9 +18080,9 @@
       <w:color w:val="595959"/>
     </w:rPr>
   </w:style>
-  <w:style w:type="character" w:styleId="889" w:customStyle="1">
+  <w:style w:type="character" w:styleId="891" w:customStyle="1">
     <w:name w:val="Heading 7 Char"/>
-    <w:basedOn w:val="848"/>
+    <w:basedOn w:val="850"/>
     <w:pPr>
       <w:pBdr/>
       <w:spacing/>
@@ -18147,9 +18093,9 @@
       <w:color w:val="595959"/>
     </w:rPr>
   </w:style>
-  <w:style w:type="character" w:styleId="890" w:customStyle="1">
+  <w:style w:type="character" w:styleId="892" w:customStyle="1">
     <w:name w:val="Heading 8 Char"/>
-    <w:basedOn w:val="848"/>
+    <w:basedOn w:val="850"/>
     <w:pPr>
       <w:pBdr/>
       <w:spacing/>
@@ -18162,9 +18108,9 @@
       <w:color w:val="272727"/>
     </w:rPr>
   </w:style>
-  <w:style w:type="character" w:styleId="891" w:customStyle="1">
+  <w:style w:type="character" w:styleId="893" w:customStyle="1">
     <w:name w:val="Heading 9 Char"/>
-    <w:basedOn w:val="848"/>
+    <w:basedOn w:val="850"/>
     <w:pPr>
       <w:pBdr/>
       <w:spacing/>
@@ -18177,9 +18123,9 @@
       <w:color w:val="272727"/>
     </w:rPr>
   </w:style>
-  <w:style w:type="character" w:styleId="892" w:customStyle="1">
+  <w:style w:type="character" w:styleId="894" w:customStyle="1">
     <w:name w:val="Title Char"/>
-    <w:basedOn w:val="848"/>
+    <w:basedOn w:val="850"/>
     <w:pPr>
       <w:pBdr/>
       <w:spacing/>
@@ -18192,9 +18138,9 @@
       <w:szCs w:val="56"/>
     </w:rPr>
   </w:style>
-  <w:style w:type="character" w:styleId="893" w:customStyle="1">
+  <w:style w:type="character" w:styleId="895" w:customStyle="1">
     <w:name w:val="Subtitle Char"/>
-    <w:basedOn w:val="848"/>
+    <w:basedOn w:val="850"/>
     <w:pPr>
       <w:pBdr/>
       <w:spacing/>
@@ -18207,9 +18153,9 @@
       <w:szCs w:val="28"/>
     </w:rPr>
   </w:style>
-  <w:style w:type="character" w:styleId="894" w:customStyle="1">
+  <w:style w:type="character" w:styleId="896" w:customStyle="1">
     <w:name w:val="Quote Char"/>
-    <w:basedOn w:val="848"/>
+    <w:basedOn w:val="850"/>
     <w:pPr>
       <w:pBdr/>
       <w:spacing/>
@@ -18221,9 +18167,9 @@
       <w:color w:val="404040"/>
     </w:rPr>
   </w:style>
-  <w:style w:type="character" w:styleId="895">
+  <w:style w:type="character" w:styleId="897">
     <w:name w:val="Intense Emphasis"/>
-    <w:basedOn w:val="848"/>
+    <w:basedOn w:val="850"/>
     <w:pPr>
       <w:pBdr/>
       <w:spacing/>
@@ -18235,9 +18181,9 @@
       <w:color w:val="0f4761"/>
     </w:rPr>
   </w:style>
-  <w:style w:type="character" w:styleId="896" w:customStyle="1">
+  <w:style w:type="character" w:styleId="898" w:customStyle="1">
     <w:name w:val="Intense Quote Char"/>
-    <w:basedOn w:val="848"/>
+    <w:basedOn w:val="850"/>
     <w:pPr>
       <w:pBdr/>
       <w:spacing/>
@@ -18249,9 +18195,9 @@
       <w:color w:val="0f4761"/>
     </w:rPr>
   </w:style>
-  <w:style w:type="character" w:styleId="897">
+  <w:style w:type="character" w:styleId="899">
     <w:name w:val="Intense Reference"/>
-    <w:basedOn w:val="848"/>
+    <w:basedOn w:val="850"/>
     <w:pPr>
       <w:pBdr/>
       <w:spacing/>
@@ -18265,9 +18211,9 @@
       <w:spacing w:val="0"/>
     </w:rPr>
   </w:style>
-  <w:style w:type="character" w:styleId="898">
+  <w:style w:type="character" w:styleId="900">
     <w:name w:val="Subtle Emphasis"/>
-    <w:basedOn w:val="848"/>
+    <w:basedOn w:val="850"/>
     <w:pPr>
       <w:pBdr/>
       <w:spacing/>
@@ -18279,9 +18225,9 @@
       <w:color w:val="404040"/>
     </w:rPr>
   </w:style>
-  <w:style w:type="character" w:styleId="899">
+  <w:style w:type="character" w:styleId="901">
     <w:name w:val="Emphasis"/>
-    <w:basedOn w:val="848"/>
+    <w:basedOn w:val="850"/>
     <w:pPr>
       <w:pBdr/>
       <w:spacing/>
@@ -18292,9 +18238,9 @@
       <w:iCs/>
     </w:rPr>
   </w:style>
-  <w:style w:type="character" w:styleId="900">
+  <w:style w:type="character" w:styleId="902">
     <w:name w:val="Strong"/>
-    <w:basedOn w:val="848"/>
+    <w:basedOn w:val="850"/>
     <w:pPr>
       <w:pBdr/>
       <w:spacing/>
@@ -18305,9 +18251,9 @@
       <w:bCs/>
     </w:rPr>
   </w:style>
-  <w:style w:type="character" w:styleId="901">
+  <w:style w:type="character" w:styleId="903">
     <w:name w:val="Subtle Reference"/>
-    <w:basedOn w:val="848"/>
+    <w:basedOn w:val="850"/>
     <w:pPr>
       <w:pBdr/>
       <w:spacing/>
@@ -18318,9 +18264,9 @@
       <w:color w:val="5a5a5a"/>
     </w:rPr>
   </w:style>
-  <w:style w:type="character" w:styleId="902">
+  <w:style w:type="character" w:styleId="904">
     <w:name w:val="Book Title"/>
-    <w:basedOn w:val="848"/>
+    <w:basedOn w:val="850"/>
     <w:pPr>
       <w:pBdr/>
       <w:spacing/>
@@ -18334,27 +18280,27 @@
       <w:spacing w:val="0"/>
     </w:rPr>
   </w:style>
-  <w:style w:type="character" w:styleId="903" w:customStyle="1">
+  <w:style w:type="character" w:styleId="905" w:customStyle="1">
     <w:name w:val="Header Char"/>
-    <w:basedOn w:val="848"/>
+    <w:basedOn w:val="850"/>
     <w:pPr>
       <w:pBdr/>
       <w:spacing/>
       <w:ind/>
     </w:pPr>
   </w:style>
-  <w:style w:type="character" w:styleId="904" w:customStyle="1">
+  <w:style w:type="character" w:styleId="906" w:customStyle="1">
     <w:name w:val="Footer Char"/>
-    <w:basedOn w:val="848"/>
+    <w:basedOn w:val="850"/>
     <w:pPr>
       <w:pBdr/>
       <w:spacing/>
       <w:ind/>
     </w:pPr>
   </w:style>
-  <w:style w:type="character" w:styleId="905" w:customStyle="1">
+  <w:style w:type="character" w:styleId="907" w:customStyle="1">
     <w:name w:val="Footnote Text Char"/>
-    <w:basedOn w:val="848"/>
+    <w:basedOn w:val="850"/>
     <w:pPr>
       <w:pBdr/>
       <w:spacing/>
@@ -18365,9 +18311,9 @@
       <w:szCs w:val="20"/>
     </w:rPr>
   </w:style>
-  <w:style w:type="character" w:styleId="906" w:customStyle="1">
+  <w:style w:type="character" w:styleId="908" w:customStyle="1">
     <w:name w:val="Endnote Text Char"/>
-    <w:basedOn w:val="848"/>
+    <w:basedOn w:val="850"/>
     <w:pPr>
       <w:pBdr/>
       <w:spacing/>
@@ -18378,9 +18324,9 @@
       <w:szCs w:val="20"/>
     </w:rPr>
   </w:style>
-  <w:style w:type="character" w:styleId="907">
+  <w:style w:type="character" w:styleId="909">
     <w:name w:val="FollowedHyperlink"/>
-    <w:basedOn w:val="848"/>
+    <w:basedOn w:val="850"/>
     <w:pPr>
       <w:pBdr/>
       <w:spacing/>
@@ -18391,7 +18337,7 @@
       <w:u w:val="single"/>
     </w:rPr>
   </w:style>
-  <w:style w:type="character" w:styleId="908" w:customStyle="1">
+  <w:style w:type="character" w:styleId="910" w:customStyle="1">
     <w:name w:val="Titre 1 Car"/>
     <w:pPr>
       <w:pBdr/>
@@ -18407,7 +18353,7 @@
       <w:shd w:val="clear" w:color="auto" w:fill="ffffff"/>
     </w:rPr>
   </w:style>
-  <w:style w:type="character" w:styleId="909" w:customStyle="1">
+  <w:style w:type="character" w:styleId="911" w:customStyle="1">
     <w:name w:val="Titre 2 Car"/>
     <w:pPr>
       <w:pBdr/>
@@ -18424,7 +18370,7 @@
       <w:shd w:val="clear" w:color="auto" w:fill="808080"/>
     </w:rPr>
   </w:style>
-  <w:style w:type="character" w:styleId="910" w:customStyle="1">
+  <w:style w:type="character" w:styleId="912" w:customStyle="1">
     <w:name w:val="Corps de texte 2 Car"/>
     <w:pPr>
       <w:pBdr/>
@@ -18435,7 +18381,7 @@
       <w:rFonts w:ascii="Arial" w:hAnsi="Arial" w:eastAsia="Times New Roman" w:cs="Arial"/>
     </w:rPr>
   </w:style>
-  <w:style w:type="character" w:styleId="911" w:customStyle="1">
+  <w:style w:type="character" w:styleId="913" w:customStyle="1">
     <w:name w:val="Titre 9 Car"/>
     <w:pPr>
       <w:pBdr/>
@@ -18451,7 +18397,7 @@
       <w:szCs w:val="20"/>
     </w:rPr>
   </w:style>
-  <w:style w:type="character" w:styleId="912" w:customStyle="1">
+  <w:style w:type="character" w:styleId="914" w:customStyle="1">
     <w:name w:val="Corps de texte 3 Car"/>
     <w:pPr>
       <w:pBdr/>
@@ -18463,7 +18409,7 @@
       <w:szCs w:val="16"/>
     </w:rPr>
   </w:style>
-  <w:style w:type="character" w:styleId="913" w:customStyle="1">
+  <w:style w:type="character" w:styleId="915" w:customStyle="1">
     <w:name w:val="Titre 7 Car"/>
     <w:pPr>
       <w:pBdr/>
@@ -18477,7 +18423,7 @@
       <w:color w:val="404040"/>
     </w:rPr>
   </w:style>
-  <w:style w:type="character" w:styleId="914" w:customStyle="1">
+  <w:style w:type="character" w:styleId="916" w:customStyle="1">
     <w:name w:val="Titre 8 Car"/>
     <w:pPr>
       <w:pBdr/>
@@ -18491,7 +18437,7 @@
       <w:szCs w:val="20"/>
     </w:rPr>
   </w:style>
-  <w:style w:type="character" w:styleId="915" w:customStyle="1">
+  <w:style w:type="character" w:styleId="917" w:customStyle="1">
     <w:name w:val="Titres conditions générales Car"/>
     <w:pPr>
       <w:pBdr/>
@@ -18505,7 +18451,7 @@
       <w:szCs w:val="22"/>
     </w:rPr>
   </w:style>
-  <w:style w:type="character" w:styleId="916" w:customStyle="1">
+  <w:style w:type="character" w:styleId="918" w:customStyle="1">
     <w:name w:val="Titre 3 Car"/>
     <w:pPr>
       <w:pBdr/>
@@ -18518,7 +18464,7 @@
       <w:bCs/>
     </w:rPr>
   </w:style>
-  <w:style w:type="character" w:styleId="917" w:customStyle="1">
+  <w:style w:type="character" w:styleId="919" w:customStyle="1">
     <w:name w:val="Annexes - Soustitre Car"/>
     <w:pPr>
       <w:pBdr/>
@@ -18532,7 +18478,7 @@
       <w:sz w:val="20"/>
     </w:rPr>
   </w:style>
-  <w:style w:type="character" w:styleId="918" w:customStyle="1">
+  <w:style w:type="character" w:styleId="920" w:customStyle="1">
     <w:name w:val="Titre Car"/>
     <w:pPr>
       <w:pBdr/>
@@ -18547,7 +18493,7 @@
       <w:szCs w:val="52"/>
     </w:rPr>
   </w:style>
-  <w:style w:type="character" w:styleId="919" w:customStyle="1">
+  <w:style w:type="character" w:styleId="921" w:customStyle="1">
     <w:name w:val="Sous-titre Car"/>
     <w:pPr>
       <w:pBdr/>
@@ -18564,7 +18510,7 @@
       <w:szCs w:val="24"/>
     </w:rPr>
   </w:style>
-  <w:style w:type="character" w:styleId="920" w:customStyle="1">
+  <w:style w:type="character" w:styleId="922" w:customStyle="1">
     <w:name w:val="En-tête Car"/>
     <w:pPr>
       <w:pBdr/>
@@ -18575,7 +18521,7 @@
       <w:sz w:val="20"/>
     </w:rPr>
   </w:style>
-  <w:style w:type="character" w:styleId="921" w:customStyle="1">
+  <w:style w:type="character" w:styleId="923" w:customStyle="1">
     <w:name w:val="Pied de page Car"/>
     <w:pPr>
       <w:pBdr/>
@@ -18586,7 +18532,7 @@
       <w:sz w:val="20"/>
     </w:rPr>
   </w:style>
-  <w:style w:type="character" w:styleId="922" w:customStyle="1">
+  <w:style w:type="character" w:styleId="924" w:customStyle="1">
     <w:name w:val="Texte de bulles Car"/>
     <w:pPr>
       <w:pBdr/>
@@ -18599,7 +18545,7 @@
       <w:szCs w:val="16"/>
     </w:rPr>
   </w:style>
-  <w:style w:type="character" w:styleId="923">
+  <w:style w:type="character" w:styleId="925">
     <w:name w:val="Hyperlink"/>
     <w:pPr>
       <w:pBdr/>
@@ -18611,7 +18557,7 @@
       <w:u w:val="single"/>
     </w:rPr>
   </w:style>
-  <w:style w:type="character" w:styleId="924">
+  <w:style w:type="character" w:styleId="926">
     <w:name w:val="Placeholder Text"/>
     <w:pPr>
       <w:pBdr/>
@@ -18622,7 +18568,7 @@
       <w:color w:val="808080"/>
     </w:rPr>
   </w:style>
-  <w:style w:type="character" w:styleId="925" w:customStyle="1">
+  <w:style w:type="character" w:styleId="927" w:customStyle="1">
     <w:name w:val="Conditions générales Car"/>
     <w:pPr>
       <w:pBdr/>
@@ -18633,7 +18579,7 @@
       <w:sz w:val="18"/>
     </w:rPr>
   </w:style>
-  <w:style w:type="character" w:styleId="926" w:customStyle="1">
+  <w:style w:type="character" w:styleId="928" w:customStyle="1">
     <w:name w:val="Note de fin Car"/>
     <w:pPr>
       <w:pBdr/>
@@ -18641,7 +18587,7 @@
       <w:ind/>
     </w:pPr>
   </w:style>
-  <w:style w:type="character" w:styleId="927">
+  <w:style w:type="character" w:styleId="929">
     <w:name w:val="endnote reference"/>
     <w:pPr>
       <w:pBdr/>
@@ -18652,7 +18598,7 @@
       <w:vertAlign w:val="superscript"/>
     </w:rPr>
   </w:style>
-  <w:style w:type="character" w:styleId="928" w:customStyle="1">
+  <w:style w:type="character" w:styleId="930" w:customStyle="1">
     <w:name w:val="Note de bas de page Car"/>
     <w:pPr>
       <w:pBdr/>
@@ -18660,7 +18606,7 @@
       <w:ind/>
     </w:pPr>
   </w:style>
-  <w:style w:type="character" w:styleId="929">
+  <w:style w:type="character" w:styleId="931">
     <w:name w:val="footnote reference"/>
     <w:pPr>
       <w:pBdr/>
@@ -18671,7 +18617,7 @@
       <w:vertAlign w:val="superscript"/>
     </w:rPr>
   </w:style>
-  <w:style w:type="character" w:styleId="930" w:customStyle="1">
+  <w:style w:type="character" w:styleId="932" w:customStyle="1">
     <w:name w:val="Marque de commentaire1"/>
     <w:pPr>
       <w:pBdr/>
@@ -18683,7 +18629,7 @@
       <w:szCs w:val="16"/>
     </w:rPr>
   </w:style>
-  <w:style w:type="character" w:styleId="931" w:customStyle="1">
+  <w:style w:type="character" w:styleId="933" w:customStyle="1">
     <w:name w:val="Commentaire Car"/>
     <w:pPr>
       <w:pBdr/>
@@ -18691,7 +18637,7 @@
       <w:ind/>
     </w:pPr>
   </w:style>
-  <w:style w:type="character" w:styleId="932" w:customStyle="1">
+  <w:style w:type="character" w:styleId="934" w:customStyle="1">
     <w:name w:val="Objet du commentaire Car"/>
     <w:pPr>
       <w:pBdr/>
@@ -18703,16 +18649,16 @@
       <w:bCs/>
     </w:rPr>
   </w:style>
-  <w:style w:type="character" w:styleId="933" w:customStyle="1">
+  <w:style w:type="character" w:styleId="935" w:customStyle="1">
     <w:name w:val="mr-3"/>
-    <w:basedOn w:val="848"/>
+    <w:basedOn w:val="850"/>
     <w:pPr>
       <w:pBdr/>
       <w:spacing/>
       <w:ind/>
     </w:pPr>
   </w:style>
-  <w:style w:type="character" w:styleId="934" w:customStyle="1">
+  <w:style w:type="character" w:styleId="936" w:customStyle="1">
     <w:name w:val="Mention non résolue1"/>
     <w:pPr>
       <w:pBdr/>
@@ -18724,7 +18670,7 @@
       <w:shd w:val="clear" w:color="auto" w:fill="e1dfdd"/>
     </w:rPr>
   </w:style>
-  <w:style w:type="table" w:styleId="935" w:customStyle="1">
+  <w:style w:type="table" w:styleId="937" w:customStyle="1">
     <w:name w:val="Tableau normal"/>
     <w:uiPriority w:val="99"/>
     <w:semiHidden/>
@@ -18919,9 +18865,9 @@
       </w:tcPr>
     </w:tblStylePr>
   </w:style>
-  <w:style w:type="table" w:styleId="936" w:customStyle="1">
+  <w:style w:type="table" w:styleId="938" w:customStyle="1">
     <w:name w:val="Table Grid Light"/>
-    <w:basedOn w:val="849"/>
+    <w:basedOn w:val="851"/>
     <w:pPr>
       <w:pBdr/>
       <w:spacing/>
@@ -19110,9 +19056,9 @@
       </w:tcPr>
     </w:tblStylePr>
   </w:style>
-  <w:style w:type="table" w:styleId="937">
+  <w:style w:type="table" w:styleId="939">
     <w:name w:val="Plain Table 1"/>
-    <w:basedOn w:val="849"/>
+    <w:basedOn w:val="851"/>
     <w:uiPriority w:val="41"/>
     <w:pPr>
       <w:pBdr/>
@@ -19356,9 +19302,9 @@
       </w:tcPr>
     </w:tblStylePr>
   </w:style>
-  <w:style w:type="table" w:styleId="938">
+  <w:style w:type="table" w:styleId="940">
     <w:name w:val="Plain Table 2"/>
-    <w:basedOn w:val="849"/>
+    <w:basedOn w:val="851"/>
     <w:uiPriority w:val="42"/>
     <w:pPr>
       <w:pBdr/>
@@ -19608,9 +19554,9 @@
       </w:tcPr>
     </w:tblStylePr>
   </w:style>
-  <w:style w:type="table" w:styleId="939">
+  <w:style w:type="table" w:styleId="941">
     <w:name w:val="Plain Table 3"/>
-    <w:basedOn w:val="849"/>
+    <w:basedOn w:val="851"/>
     <w:uiPriority w:val="43"/>
     <w:pPr>
       <w:pBdr/>
@@ -19873,9 +19819,9 @@
       </w:tcPr>
     </w:tblStylePr>
   </w:style>
-  <w:style w:type="table" w:styleId="940">
+  <w:style w:type="table" w:styleId="942">
     <w:name w:val="Plain Table 4"/>
-    <w:basedOn w:val="849"/>
+    <w:basedOn w:val="851"/>
     <w:uiPriority w:val="44"/>
     <w:pPr>
       <w:pBdr/>
@@ -20130,9 +20076,9 @@
       </w:tcPr>
     </w:tblStylePr>
   </w:style>
-  <w:style w:type="table" w:styleId="941">
+  <w:style w:type="table" w:styleId="943">
     <w:name w:val="Plain Table 5"/>
-    <w:basedOn w:val="849"/>
+    <w:basedOn w:val="851"/>
     <w:uiPriority w:val="45"/>
     <w:pPr>
       <w:pBdr/>
@@ -20400,9 +20346,9 @@
       </w:tcPr>
     </w:tblStylePr>
   </w:style>
-  <w:style w:type="table" w:styleId="942">
+  <w:style w:type="table" w:styleId="944">
     <w:name w:val="Grid Table 1 Light"/>
-    <w:basedOn w:val="849"/>
+    <w:basedOn w:val="851"/>
     <w:uiPriority w:val="46"/>
     <w:pPr>
       <w:pBdr/>
@@ -20657,9 +20603,9 @@
       </w:tcPr>
     </w:tblStylePr>
   </w:style>
-  <w:style w:type="table" w:styleId="943" w:customStyle="1">
+  <w:style w:type="table" w:styleId="945" w:customStyle="1">
     <w:name w:val="Grid Table 1 Light - Accent 1"/>
-    <w:basedOn w:val="849"/>
+    <w:basedOn w:val="851"/>
     <w:pPr>
       <w:pBdr/>
       <w:spacing/>
@@ -20913,9 +20859,9 @@
       </w:tcPr>
     </w:tblStylePr>
   </w:style>
-  <w:style w:type="table" w:styleId="944" w:customStyle="1">
+  <w:style w:type="table" w:styleId="946" w:customStyle="1">
     <w:name w:val="Grid Table 1 Light - Accent 2"/>
-    <w:basedOn w:val="849"/>
+    <w:basedOn w:val="851"/>
     <w:pPr>
       <w:pBdr/>
       <w:spacing/>
@@ -21169,9 +21115,9 @@
       </w:tcPr>
     </w:tblStylePr>
   </w:style>
-  <w:style w:type="table" w:styleId="945" w:customStyle="1">
+  <w:style w:type="table" w:styleId="947" w:customStyle="1">
     <w:name w:val="Grid Table 1 Light - Accent 3"/>
-    <w:basedOn w:val="849"/>
+    <w:basedOn w:val="851"/>
     <w:pPr>
       <w:pBdr/>
       <w:spacing/>
@@ -21425,9 +21371,9 @@
       </w:tcPr>
     </w:tblStylePr>
   </w:style>
-  <w:style w:type="table" w:styleId="946" w:customStyle="1">
+  <w:style w:type="table" w:styleId="948" w:customStyle="1">
     <w:name w:val="Grid Table 1 Light - Accent 4"/>
-    <w:basedOn w:val="849"/>
+    <w:basedOn w:val="851"/>
     <w:pPr>
       <w:pBdr/>
       <w:spacing/>
@@ -21681,9 +21627,9 @@
       </w:tcPr>
     </w:tblStylePr>
   </w:style>
-  <w:style w:type="table" w:styleId="947" w:customStyle="1">
+  <w:style w:type="table" w:styleId="949" w:customStyle="1">
     <w:name w:val="Grid Table 1 Light - Accent 5"/>
-    <w:basedOn w:val="849"/>
+    <w:basedOn w:val="851"/>
     <w:pPr>
       <w:pBdr/>
       <w:spacing/>
@@ -21937,9 +21883,9 @@
       </w:tcPr>
     </w:tblStylePr>
   </w:style>
-  <w:style w:type="table" w:styleId="948" w:customStyle="1">
+  <w:style w:type="table" w:styleId="950" w:customStyle="1">
     <w:name w:val="Grid Table 1 Light - Accent 6"/>
-    <w:basedOn w:val="849"/>
+    <w:basedOn w:val="851"/>
     <w:pPr>
       <w:pBdr/>
       <w:spacing/>
@@ -22193,9 +22139,9 @@
       </w:tcPr>
     </w:tblStylePr>
   </w:style>
-  <w:style w:type="table" w:styleId="949">
+  <w:style w:type="table" w:styleId="951">
     <w:name w:val="Grid Table 2"/>
-    <w:basedOn w:val="849"/>
+    <w:basedOn w:val="851"/>
     <w:uiPriority w:val="47"/>
     <w:pPr>
       <w:pBdr/>
@@ -22460,9 +22406,9 @@
       </w:tcPr>
     </w:tblStylePr>
   </w:style>
-  <w:style w:type="table" w:styleId="950" w:customStyle="1">
+  <w:style w:type="table" w:styleId="952" w:customStyle="1">
     <w:name w:val="Grid Table 2 - Accent 1"/>
-    <w:basedOn w:val="849"/>
+    <w:basedOn w:val="851"/>
     <w:pPr>
       <w:pBdr/>
       <w:spacing/>
@@ -22726,9 +22672,9 @@
       </w:tcPr>
     </w:tblStylePr>
   </w:style>
-  <w:style w:type="table" w:styleId="951" w:customStyle="1">
+  <w:style w:type="table" w:styleId="953" w:customStyle="1">
     <w:name w:val="Grid Table 2 - Accent 2"/>
-    <w:basedOn w:val="849"/>
+    <w:basedOn w:val="851"/>
     <w:pPr>
       <w:pBdr/>
       <w:spacing/>
@@ -22992,9 +22938,9 @@
       </w:tcPr>
     </w:tblStylePr>
   </w:style>
-  <w:style w:type="table" w:styleId="952" w:customStyle="1">
+  <w:style w:type="table" w:styleId="954" w:customStyle="1">
     <w:name w:val="Grid Table 2 - Accent 3"/>
-    <w:basedOn w:val="849"/>
+    <w:basedOn w:val="851"/>
     <w:pPr>
       <w:pBdr/>
       <w:spacing/>
@@ -23258,9 +23204,9 @@
       </w:tcPr>
     </w:tblStylePr>
   </w:style>
-  <w:style w:type="table" w:styleId="953" w:customStyle="1">
+  <w:style w:type="table" w:styleId="955" w:customStyle="1">
     <w:name w:val="Grid Table 2 - Accent 4"/>
-    <w:basedOn w:val="849"/>
+    <w:basedOn w:val="851"/>
     <w:pPr>
       <w:pBdr/>
       <w:spacing/>
@@ -23524,9 +23470,9 @@
       </w:tcPr>
     </w:tblStylePr>
   </w:style>
-  <w:style w:type="table" w:styleId="954" w:customStyle="1">
+  <w:style w:type="table" w:styleId="956" w:customStyle="1">
     <w:name w:val="Grid Table 2 - Accent 5"/>
-    <w:basedOn w:val="849"/>
+    <w:basedOn w:val="851"/>
     <w:pPr>
       <w:pBdr/>
       <w:spacing/>
@@ -23790,9 +23736,9 @@
       </w:tcPr>
     </w:tblStylePr>
   </w:style>
-  <w:style w:type="table" w:styleId="955" w:customStyle="1">
+  <w:style w:type="table" w:styleId="957" w:customStyle="1">
     <w:name w:val="Grid Table 2 - Accent 6"/>
-    <w:basedOn w:val="849"/>
+    <w:basedOn w:val="851"/>
     <w:pPr>
       <w:pBdr/>
       <w:spacing/>
@@ -24056,9 +24002,9 @@
       </w:tcPr>
     </w:tblStylePr>
   </w:style>
-  <w:style w:type="table" w:styleId="956">
+  <w:style w:type="table" w:styleId="958">
     <w:name w:val="Grid Table 3"/>
-    <w:basedOn w:val="849"/>
+    <w:basedOn w:val="851"/>
     <w:uiPriority w:val="48"/>
     <w:pPr>
       <w:pBdr/>
@@ -24322,9 +24268,9 @@
       </w:tcPr>
     </w:tblStylePr>
   </w:style>
-  <w:style w:type="table" w:styleId="957" w:customStyle="1">
+  <w:style w:type="table" w:styleId="959" w:customStyle="1">
     <w:name w:val="Grid Table 3 - Accent 1"/>
-    <w:basedOn w:val="849"/>
+    <w:basedOn w:val="851"/>
     <w:pPr>
       <w:pBdr/>
       <w:spacing/>
@@ -24587,9 +24533,9 @@
       </w:tcPr>
     </w:tblStylePr>
   </w:style>
-  <w:style w:type="table" w:styleId="958" w:customStyle="1">
+  <w:style w:type="table" w:styleId="960" w:customStyle="1">
     <w:name w:val="Grid Table 3 - Accent 2"/>
-    <w:basedOn w:val="849"/>
+    <w:basedOn w:val="851"/>
     <w:pPr>
       <w:pBdr/>
       <w:spacing/>
@@ -24852,9 +24798,9 @@
       </w:tcPr>
     </w:tblStylePr>
   </w:style>
-  <w:style w:type="table" w:styleId="959" w:customStyle="1">
+  <w:style w:type="table" w:styleId="961" w:customStyle="1">
     <w:name w:val="Grid Table 3 - Accent 3"/>
-    <w:basedOn w:val="849"/>
+    <w:basedOn w:val="851"/>
     <w:pPr>
       <w:pBdr/>
       <w:spacing/>
@@ -25117,9 +25063,9 @@
       </w:tcPr>
     </w:tblStylePr>
   </w:style>
-  <w:style w:type="table" w:styleId="960" w:customStyle="1">
+  <w:style w:type="table" w:styleId="962" w:customStyle="1">
     <w:name w:val="Grid Table 3 - Accent 4"/>
-    <w:basedOn w:val="849"/>
+    <w:basedOn w:val="851"/>
     <w:pPr>
       <w:pBdr/>
       <w:spacing/>
@@ -25382,9 +25328,9 @@
       </w:tcPr>
     </w:tblStylePr>
   </w:style>
-  <w:style w:type="table" w:styleId="961" w:customStyle="1">
+  <w:style w:type="table" w:styleId="963" w:customStyle="1">
     <w:name w:val="Grid Table 3 - Accent 5"/>
-    <w:basedOn w:val="849"/>
+    <w:basedOn w:val="851"/>
     <w:pPr>
       <w:pBdr/>
       <w:spacing/>
@@ -25647,9 +25593,9 @@
       </w:tcPr>
     </w:tblStylePr>
   </w:style>
-  <w:style w:type="table" w:styleId="962" w:customStyle="1">
+  <w:style w:type="table" w:styleId="964" w:customStyle="1">
     <w:name w:val="Grid Table 3 - Accent 6"/>
-    <w:basedOn w:val="849"/>
+    <w:basedOn w:val="851"/>
     <w:pPr>
       <w:pBdr/>
       <w:spacing/>
@@ -25912,9 +25858,9 @@
       </w:tcPr>
     </w:tblStylePr>
   </w:style>
-  <w:style w:type="table" w:styleId="963">
+  <w:style w:type="table" w:styleId="965">
     <w:name w:val="Grid Table 4"/>
-    <w:basedOn w:val="849"/>
+    <w:basedOn w:val="851"/>
     <w:uiPriority w:val="49"/>
     <w:pPr>
       <w:pBdr/>
@@ -26186,9 +26132,9 @@
       </w:tcPr>
     </w:tblStylePr>
   </w:style>
-  <w:style w:type="table" w:styleId="964" w:customStyle="1">
+  <w:style w:type="table" w:styleId="966" w:customStyle="1">
     <w:name w:val="Grid Table 4 - Accent 1"/>
-    <w:basedOn w:val="849"/>
+    <w:basedOn w:val="851"/>
     <w:pPr>
       <w:pBdr/>
       <w:spacing/>
@@ -26459,9 +26405,9 @@
       </w:tcPr>
     </w:tblStylePr>
   </w:style>
-  <w:style w:type="table" w:styleId="965" w:customStyle="1">
+  <w:style w:type="table" w:styleId="967" w:customStyle="1">
     <w:name w:val="Grid Table 4 - Accent 2"/>
-    <w:basedOn w:val="849"/>
+    <w:basedOn w:val="851"/>
     <w:pPr>
       <w:pBdr/>
       <w:spacing/>
@@ -26732,9 +26678,9 @@
       </w:tcPr>
     </w:tblStylePr>
   </w:style>
-  <w:style w:type="table" w:styleId="966" w:customStyle="1">
+  <w:style w:type="table" w:styleId="968" w:customStyle="1">
     <w:name w:val="Grid Table 4 - Accent 3"/>
-    <w:basedOn w:val="849"/>
+    <w:basedOn w:val="851"/>
     <w:pPr>
       <w:pBdr/>
       <w:spacing/>
@@ -27005,9 +26951,9 @@
       </w:tcPr>
     </w:tblStylePr>
   </w:style>
-  <w:style w:type="table" w:styleId="967" w:customStyle="1">
+  <w:style w:type="table" w:styleId="969" w:customStyle="1">
     <w:name w:val="Grid Table 4 - Accent 4"/>
-    <w:basedOn w:val="849"/>
+    <w:basedOn w:val="851"/>
     <w:pPr>
       <w:pBdr/>
       <w:spacing/>
@@ -27278,9 +27224,9 @@
       </w:tcPr>
     </w:tblStylePr>
   </w:style>
-  <w:style w:type="table" w:styleId="968" w:customStyle="1">
+  <w:style w:type="table" w:styleId="970" w:customStyle="1">
     <w:name w:val="Grid Table 4 - Accent 5"/>
-    <w:basedOn w:val="849"/>
+    <w:basedOn w:val="851"/>
     <w:pPr>
       <w:pBdr/>
       <w:spacing/>
@@ -27551,9 +27497,9 @@
       </w:tcPr>
     </w:tblStylePr>
   </w:style>
-  <w:style w:type="table" w:styleId="969" w:customStyle="1">
+  <w:style w:type="table" w:styleId="971" w:customStyle="1">
     <w:name w:val="Grid Table 4 - Accent 6"/>
-    <w:basedOn w:val="849"/>
+    <w:basedOn w:val="851"/>
     <w:pPr>
       <w:pBdr/>
       <w:spacing/>
@@ -27824,9 +27770,9 @@
       </w:tcPr>
     </w:tblStylePr>
   </w:style>
-  <w:style w:type="table" w:styleId="970">
+  <w:style w:type="table" w:styleId="972">
     <w:name w:val="Grid Table 5 Dark"/>
-    <w:basedOn w:val="849"/>
+    <w:basedOn w:val="851"/>
     <w:uiPriority w:val="50"/>
     <w:pPr>
       <w:pBdr/>
@@ -28079,9 +28025,9 @@
       </w:tcPr>
     </w:tblStylePr>
   </w:style>
-  <w:style w:type="table" w:styleId="971" w:customStyle="1">
+  <w:style w:type="table" w:styleId="973" w:customStyle="1">
     <w:name w:val="Grid Table 5 Dark- Accent 1"/>
-    <w:basedOn w:val="849"/>
+    <w:basedOn w:val="851"/>
     <w:pPr>
       <w:pBdr/>
       <w:spacing/>
@@ -28333,9 +28279,9 @@
       </w:tcPr>
     </w:tblStylePr>
   </w:style>
-  <w:style w:type="table" w:styleId="972" w:customStyle="1">
+  <w:style w:type="table" w:styleId="974" w:customStyle="1">
     <w:name w:val="Grid Table 5 Dark - Accent 2"/>
-    <w:basedOn w:val="849"/>
+    <w:basedOn w:val="851"/>
     <w:pPr>
       <w:pBdr/>
       <w:spacing/>
@@ -28587,9 +28533,9 @@
       </w:tcPr>
     </w:tblStylePr>
   </w:style>
-  <w:style w:type="table" w:styleId="973" w:customStyle="1">
+  <w:style w:type="table" w:styleId="975" w:customStyle="1">
     <w:name w:val="Grid Table 5 Dark - Accent 3"/>
-    <w:basedOn w:val="849"/>
+    <w:basedOn w:val="851"/>
     <w:pPr>
       <w:pBdr/>
       <w:spacing/>
@@ -28841,9 +28787,9 @@
       </w:tcPr>
     </w:tblStylePr>
   </w:style>
-  <w:style w:type="table" w:styleId="974" w:customStyle="1">
+  <w:style w:type="table" w:styleId="976" w:customStyle="1">
     <w:name w:val="Grid Table 5 Dark- Accent 4"/>
-    <w:basedOn w:val="849"/>
+    <w:basedOn w:val="851"/>
     <w:pPr>
       <w:pBdr/>
       <w:spacing/>
@@ -29095,9 +29041,9 @@
       </w:tcPr>
     </w:tblStylePr>
   </w:style>
-  <w:style w:type="table" w:styleId="975" w:customStyle="1">
+  <w:style w:type="table" w:styleId="977" w:customStyle="1">
     <w:name w:val="Grid Table 5 Dark - Accent 5"/>
-    <w:basedOn w:val="849"/>
+    <w:basedOn w:val="851"/>
     <w:pPr>
       <w:pBdr/>
       <w:spacing/>
@@ -29349,9 +29295,9 @@
       </w:tcPr>
     </w:tblStylePr>
   </w:style>
-  <w:style w:type="table" w:styleId="976" w:customStyle="1">
+  <w:style w:type="table" w:styleId="978" w:customStyle="1">
     <w:name w:val="Grid Table 5 Dark - Accent 6"/>
-    <w:basedOn w:val="849"/>
+    <w:basedOn w:val="851"/>
     <w:pPr>
       <w:pBdr/>
       <w:spacing/>
@@ -29603,9 +29549,9 @@
       </w:tcPr>
     </w:tblStylePr>
   </w:style>
-  <w:style w:type="table" w:styleId="977">
+  <w:style w:type="table" w:styleId="979">
     <w:name w:val="Grid Table 6 Colorful"/>
-    <w:basedOn w:val="849"/>
+    <w:basedOn w:val="851"/>
     <w:uiPriority w:val="51"/>
     <w:pPr>
       <w:pBdr>
@@ -29880,9 +29826,9 @@
       </w:tcPr>
     </w:tblStylePr>
   </w:style>
-  <w:style w:type="table" w:styleId="978" w:customStyle="1">
+  <w:style w:type="table" w:styleId="980" w:customStyle="1">
     <w:name w:val="Grid Table 6 Colorful - Accent 1"/>
-    <w:basedOn w:val="849"/>
+    <w:basedOn w:val="851"/>
     <w:pPr>
       <w:pBdr>
         <w:top w:val="none" w:color="000000" w:sz="0" w:space="3"/>
@@ -30156,9 +30102,9 @@
       </w:tcPr>
     </w:tblStylePr>
   </w:style>
-  <w:style w:type="table" w:styleId="979" w:customStyle="1">
+  <w:style w:type="table" w:styleId="981" w:customStyle="1">
     <w:name w:val="Grid Table 6 Colorful - Accent 2"/>
-    <w:basedOn w:val="849"/>
+    <w:basedOn w:val="851"/>
     <w:pPr>
       <w:pBdr>
         <w:top w:val="none" w:color="000000" w:sz="0" w:space="3"/>
@@ -30432,9 +30378,9 @@
       </w:tcPr>
     </w:tblStylePr>
   </w:style>
-  <w:style w:type="table" w:styleId="980" w:customStyle="1">
+  <w:style w:type="table" w:styleId="982" w:customStyle="1">
     <w:name w:val="Grid Table 6 Colorful - Accent 3"/>
-    <w:basedOn w:val="849"/>
+    <w:basedOn w:val="851"/>
     <w:pPr>
       <w:pBdr>
         <w:top w:val="none" w:color="000000" w:sz="0" w:space="3"/>
@@ -30708,9 +30654,9 @@
       </w:tcPr>
     </w:tblStylePr>
   </w:style>
-  <w:style w:type="table" w:styleId="981" w:customStyle="1">
+  <w:style w:type="table" w:styleId="983" w:customStyle="1">
     <w:name w:val="Grid Table 6 Colorful - Accent 4"/>
-    <w:basedOn w:val="849"/>
+    <w:basedOn w:val="851"/>
     <w:pPr>
       <w:pBdr>
         <w:top w:val="none" w:color="000000" w:sz="0" w:space="3"/>
@@ -30984,9 +30930,9 @@
       </w:tcPr>
     </w:tblStylePr>
   </w:style>
-  <w:style w:type="table" w:styleId="982" w:customStyle="1">
+  <w:style w:type="table" w:styleId="984" w:customStyle="1">
     <w:name w:val="Grid Table 6 Colorful - Accent 5"/>
-    <w:basedOn w:val="849"/>
+    <w:basedOn w:val="851"/>
     <w:pPr>
       <w:pBdr>
         <w:top w:val="none" w:color="000000" w:sz="0" w:space="3"/>
@@ -31260,9 +31206,9 @@
       </w:tcPr>
     </w:tblStylePr>
   </w:style>
-  <w:style w:type="table" w:styleId="983" w:customStyle="1">
+  <w:style w:type="table" w:styleId="985" w:customStyle="1">
     <w:name w:val="Grid Table 6 Colorful - Accent 6"/>
-    <w:basedOn w:val="849"/>
+    <w:basedOn w:val="851"/>
     <w:pPr>
       <w:pBdr>
         <w:top w:val="none" w:color="000000" w:sz="0" w:space="3"/>
@@ -31536,9 +31482,9 @@
       </w:tcPr>
     </w:tblStylePr>
   </w:style>
-  <w:style w:type="table" w:styleId="984">
+  <w:style w:type="table" w:styleId="986">
     <w:name w:val="Grid Table 7 Colorful"/>
-    <w:basedOn w:val="849"/>
+    <w:basedOn w:val="851"/>
     <w:uiPriority w:val="52"/>
     <w:pPr>
       <w:pBdr/>
@@ -31819,9 +31765,9 @@
       </w:tcPr>
     </w:tblStylePr>
   </w:style>
-  <w:style w:type="table" w:styleId="985" w:customStyle="1">
+  <w:style w:type="table" w:styleId="987" w:customStyle="1">
     <w:name w:val="Grid Table 7 Colorful - Accent 1"/>
-    <w:basedOn w:val="849"/>
+    <w:basedOn w:val="851"/>
     <w:pPr>
       <w:pBdr/>
       <w:spacing/>
@@ -32101,9 +32047,9 @@
       </w:tcPr>
     </w:tblStylePr>
   </w:style>
-  <w:style w:type="table" w:styleId="986" w:customStyle="1">
+  <w:style w:type="table" w:styleId="988" w:customStyle="1">
     <w:name w:val="Grid Table 7 Colorful - Accent 2"/>
-    <w:basedOn w:val="849"/>
+    <w:basedOn w:val="851"/>
     <w:pPr>
       <w:pBdr/>
       <w:spacing/>
@@ -32383,9 +32329,9 @@
       </w:tcPr>
     </w:tblStylePr>
   </w:style>
-  <w:style w:type="table" w:styleId="987" w:customStyle="1">
+  <w:style w:type="table" w:styleId="989" w:customStyle="1">
     <w:name w:val="Grid Table 7 Colorful - Accent 3"/>
-    <w:basedOn w:val="849"/>
+    <w:basedOn w:val="851"/>
     <w:pPr>
       <w:pBdr/>
       <w:spacing/>
@@ -32665,9 +32611,9 @@
       </w:tcPr>
     </w:tblStylePr>
   </w:style>
-  <w:style w:type="table" w:styleId="988" w:customStyle="1">
+  <w:style w:type="table" w:styleId="990" w:customStyle="1">
     <w:name w:val="Grid Table 7 Colorful - Accent 4"/>
-    <w:basedOn w:val="849"/>
+    <w:basedOn w:val="851"/>
     <w:pPr>
       <w:pBdr/>
       <w:spacing/>
@@ -32947,9 +32893,9 @@
       </w:tcPr>
     </w:tblStylePr>
   </w:style>
-  <w:style w:type="table" w:styleId="989" w:customStyle="1">
+  <w:style w:type="table" w:styleId="991" w:customStyle="1">
     <w:name w:val="Grid Table 7 Colorful - Accent 5"/>
-    <w:basedOn w:val="849"/>
+    <w:basedOn w:val="851"/>
     <w:pPr>
       <w:pBdr/>
       <w:spacing/>
@@ -33229,9 +33175,9 @@
       </w:tcPr>
     </w:tblStylePr>
   </w:style>
-  <w:style w:type="table" w:styleId="990" w:customStyle="1">
+  <w:style w:type="table" w:styleId="992" w:customStyle="1">
     <w:name w:val="Grid Table 7 Colorful - Accent 6"/>
-    <w:basedOn w:val="849"/>
+    <w:basedOn w:val="851"/>
     <w:pPr>
       <w:pBdr/>
       <w:spacing/>
@@ -33511,9 +33457,9 @@
       </w:tcPr>
     </w:tblStylePr>
   </w:style>
-  <w:style w:type="table" w:styleId="991">
+  <w:style w:type="table" w:styleId="993">
     <w:name w:val="List Table 1 Light"/>
-    <w:basedOn w:val="849"/>
+    <w:basedOn w:val="851"/>
     <w:uiPriority w:val="46"/>
     <w:pPr>
       <w:pBdr/>
@@ -33748,9 +33694,9 @@
       </w:tcPr>
     </w:tblStylePr>
   </w:style>
-  <w:style w:type="table" w:styleId="992" w:customStyle="1">
+  <w:style w:type="table" w:styleId="994" w:customStyle="1">
     <w:name w:val="List Table 1 Light - Accent 1"/>
-    <w:basedOn w:val="849"/>
+    <w:basedOn w:val="851"/>
     <w:pPr>
       <w:pBdr/>
       <w:spacing/>
@@ -33984,9 +33930,9 @@
       </w:tcPr>
     </w:tblStylePr>
   </w:style>
-  <w:style w:type="table" w:styleId="993" w:customStyle="1">
+  <w:style w:type="table" w:styleId="995" w:customStyle="1">
     <w:name w:val="List Table 1 Light - Accent 2"/>
-    <w:basedOn w:val="849"/>
+    <w:basedOn w:val="851"/>
     <w:pPr>
       <w:pBdr/>
       <w:spacing/>
@@ -34220,9 +34166,9 @@
       </w:tcPr>
     </w:tblStylePr>
   </w:style>
-  <w:style w:type="table" w:styleId="994" w:customStyle="1">
+  <w:style w:type="table" w:styleId="996" w:customStyle="1">
     <w:name w:val="List Table 1 Light - Accent 3"/>
-    <w:basedOn w:val="849"/>
+    <w:basedOn w:val="851"/>
     <w:pPr>
       <w:pBdr/>
       <w:spacing/>
@@ -34456,9 +34402,9 @@
       </w:tcPr>
     </w:tblStylePr>
   </w:style>
-  <w:style w:type="table" w:styleId="995" w:customStyle="1">
+  <w:style w:type="table" w:styleId="997" w:customStyle="1">
     <w:name w:val="List Table 1 Light - Accent 4"/>
-    <w:basedOn w:val="849"/>
+    <w:basedOn w:val="851"/>
     <w:pPr>
       <w:pBdr/>
       <w:spacing/>
@@ -34692,9 +34638,9 @@
       </w:tcPr>
     </w:tblStylePr>
   </w:style>
-  <w:style w:type="table" w:styleId="996" w:customStyle="1">
+  <w:style w:type="table" w:styleId="998" w:customStyle="1">
     <w:name w:val="List Table 1 Light - Accent 5"/>
-    <w:basedOn w:val="849"/>
+    <w:basedOn w:val="851"/>
     <w:pPr>
       <w:pBdr/>
       <w:spacing/>
@@ -34928,9 +34874,9 @@
       </w:tcPr>
     </w:tblStylePr>
   </w:style>
-  <w:style w:type="table" w:styleId="997" w:customStyle="1">
+  <w:style w:type="table" w:styleId="999" w:customStyle="1">
     <w:name w:val="List Table 1 Light - Accent 6"/>
-    <w:basedOn w:val="849"/>
+    <w:basedOn w:val="851"/>
     <w:pPr>
       <w:pBdr/>
       <w:spacing/>
@@ -35164,9 +35110,9 @@
       </w:tcPr>
     </w:tblStylePr>
   </w:style>
-  <w:style w:type="table" w:styleId="998">
+  <w:style w:type="table" w:styleId="1000">
     <w:name w:val="List Table 2"/>
-    <w:basedOn w:val="849"/>
+    <w:basedOn w:val="851"/>
     <w:uiPriority w:val="47"/>
     <w:pPr>
       <w:pBdr/>
@@ -35439,9 +35385,9 @@
       </w:tcPr>
     </w:tblStylePr>
   </w:style>
-  <w:style w:type="table" w:styleId="999" w:customStyle="1">
+  <w:style w:type="table" w:styleId="1001" w:customStyle="1">
     <w:name w:val="List Table 2 - Accent 1"/>
-    <w:basedOn w:val="849"/>
+    <w:basedOn w:val="851"/>
     <w:pPr>
       <w:pBdr/>
       <w:spacing/>
@@ -35713,9 +35659,9 @@
       </w:tcPr>
     </w:tblStylePr>
   </w:style>
-  <w:style w:type="table" w:styleId="1000" w:customStyle="1">
+  <w:style w:type="table" w:styleId="1002" w:customStyle="1">
     <w:name w:val="List Table 2 - Accent 2"/>
-    <w:basedOn w:val="849"/>
+    <w:basedOn w:val="851"/>
     <w:pPr>
       <w:pBdr/>
       <w:spacing/>
@@ -35987,9 +35933,9 @@
       </w:tcPr>
     </w:tblStylePr>
   </w:style>
-  <w:style w:type="table" w:styleId="1001" w:customStyle="1">
+  <w:style w:type="table" w:styleId="1003" w:customStyle="1">
     <w:name w:val="List Table 2 - Accent 3"/>
-    <w:basedOn w:val="849"/>
+    <w:basedOn w:val="851"/>
     <w:pPr>
       <w:pBdr/>
       <w:spacing/>
@@ -36261,9 +36207,9 @@
       </w:tcPr>
     </w:tblStylePr>
   </w:style>
-  <w:style w:type="table" w:styleId="1002" w:customStyle="1">
+  <w:style w:type="table" w:styleId="1004" w:customStyle="1">
     <w:name w:val="List Table 2 - Accent 4"/>
-    <w:basedOn w:val="849"/>
+    <w:basedOn w:val="851"/>
     <w:pPr>
       <w:pBdr/>
       <w:spacing/>
@@ -36535,9 +36481,9 @@
       </w:tcPr>
     </w:tblStylePr>
   </w:style>
-  <w:style w:type="table" w:styleId="1003" w:customStyle="1">
+  <w:style w:type="table" w:styleId="1005" w:customStyle="1">
     <w:name w:val="List Table 2 - Accent 5"/>
-    <w:basedOn w:val="849"/>
+    <w:basedOn w:val="851"/>
     <w:pPr>
       <w:pBdr/>
       <w:spacing/>
@@ -36809,9 +36755,9 @@
       </w:tcPr>
     </w:tblStylePr>
   </w:style>
-  <w:style w:type="table" w:styleId="1004" w:customStyle="1">
+  <w:style w:type="table" w:styleId="1006" w:customStyle="1">
     <w:name w:val="List Table 2 - Accent 6"/>
-    <w:basedOn w:val="849"/>
+    <w:basedOn w:val="851"/>
     <w:pPr>
       <w:pBdr/>
       <w:spacing/>
@@ -37083,9 +37029,9 @@
       </w:tcPr>
     </w:tblStylePr>
   </w:style>
-  <w:style w:type="table" w:styleId="1005">
+  <w:style w:type="table" w:styleId="1007">
     <w:name w:val="List Table 3"/>
-    <w:basedOn w:val="849"/>
+    <w:basedOn w:val="851"/>
     <w:uiPriority w:val="48"/>
     <w:pPr>
       <w:pBdr/>
@@ -37352,9 +37298,9 @@
       </w:tcPr>
     </w:tblStylePr>
   </w:style>
-  <w:style w:type="table" w:styleId="1006" w:customStyle="1">
+  <w:style w:type="table" w:styleId="1008" w:customStyle="1">
     <w:name w:val="List Table 3 - Accent 1"/>
-    <w:basedOn w:val="849"/>
+    <w:basedOn w:val="851"/>
     <w:pPr>
       <w:pBdr/>
       <w:spacing/>
@@ -37620,9 +37566,9 @@
       </w:tcPr>
     </w:tblStylePr>
   </w:style>
-  <w:style w:type="table" w:styleId="1007" w:customStyle="1">
+  <w:style w:type="table" w:styleId="1009" w:customStyle="1">
     <w:name w:val="List Table 3 - Accent 2"/>
-    <w:basedOn w:val="849"/>
+    <w:basedOn w:val="851"/>
     <w:pPr>
       <w:pBdr/>
       <w:spacing/>
@@ -37888,9 +37834,9 @@
       </w:tcPr>
     </w:tblStylePr>
   </w:style>
-  <w:style w:type="table" w:styleId="1008" w:customStyle="1">
+  <w:style w:type="table" w:styleId="1010" w:customStyle="1">
     <w:name w:val="List Table 3 - Accent 3"/>
-    <w:basedOn w:val="849"/>
+    <w:basedOn w:val="851"/>
     <w:pPr>
       <w:pBdr/>
       <w:spacing/>
@@ -38156,9 +38102,9 @@
       </w:tcPr>
     </w:tblStylePr>
   </w:style>
-  <w:style w:type="table" w:styleId="1009" w:customStyle="1">
+  <w:style w:type="table" w:styleId="1011" w:customStyle="1">
     <w:name w:val="List Table 3 - Accent 4"/>
-    <w:basedOn w:val="849"/>
+    <w:basedOn w:val="851"/>
     <w:pPr>
       <w:pBdr/>
       <w:spacing/>
@@ -38424,9 +38370,9 @@
       </w:tcPr>
     </w:tblStylePr>
   </w:style>
-  <w:style w:type="table" w:styleId="1010" w:customStyle="1">
+  <w:style w:type="table" w:styleId="1012" w:customStyle="1">
     <w:name w:val="List Table 3 - Accent 5"/>
-    <w:basedOn w:val="849"/>
+    <w:basedOn w:val="851"/>
     <w:pPr>
       <w:pBdr/>
       <w:spacing/>
@@ -38692,9 +38638,9 @@
       </w:tcPr>
     </w:tblStylePr>
   </w:style>
-  <w:style w:type="table" w:styleId="1011" w:customStyle="1">
+  <w:style w:type="table" w:styleId="1013" w:customStyle="1">
     <w:name w:val="List Table 3 - Accent 6"/>
-    <w:basedOn w:val="849"/>
+    <w:basedOn w:val="851"/>
     <w:pPr>
       <w:pBdr/>
       <w:spacing/>
@@ -38960,9 +38906,9 @@
       </w:tcPr>
     </w:tblStylePr>
   </w:style>
-  <w:style w:type="table" w:styleId="1012">
+  <w:style w:type="table" w:styleId="1014">
     <w:name w:val="List Table 4"/>
-    <w:basedOn w:val="849"/>
+    <w:basedOn w:val="851"/>
     <w:uiPriority w:val="49"/>
     <w:pPr>
       <w:pBdr/>
@@ -39226,9 +39172,9 @@
       </w:tcPr>
     </w:tblStylePr>
   </w:style>
-  <w:style w:type="table" w:styleId="1013" w:customStyle="1">
+  <w:style w:type="table" w:styleId="1015" w:customStyle="1">
     <w:name w:val="List Table 4 - Accent 1"/>
-    <w:basedOn w:val="849"/>
+    <w:basedOn w:val="851"/>
     <w:pPr>
       <w:pBdr/>
       <w:spacing/>
@@ -39491,9 +39437,9 @@
       </w:tcPr>
     </w:tblStylePr>
   </w:style>
-  <w:style w:type="table" w:styleId="1014" w:customStyle="1">
+  <w:style w:type="table" w:styleId="1016" w:customStyle="1">
     <w:name w:val="List Table 4 - Accent 2"/>
-    <w:basedOn w:val="849"/>
+    <w:basedOn w:val="851"/>
     <w:pPr>
       <w:pBdr/>
       <w:spacing/>
@@ -39756,9 +39702,9 @@
       </w:tcPr>
     </w:tblStylePr>
   </w:style>
-  <w:style w:type="table" w:styleId="1015" w:customStyle="1">
+  <w:style w:type="table" w:styleId="1017" w:customStyle="1">
     <w:name w:val="List Table 4 - Accent 3"/>
-    <w:basedOn w:val="849"/>
+    <w:basedOn w:val="851"/>
     <w:pPr>
       <w:pBdr/>
       <w:spacing/>
@@ -40021,9 +39967,9 @@
       </w:tcPr>
     </w:tblStylePr>
   </w:style>
-  <w:style w:type="table" w:styleId="1016" w:customStyle="1">
+  <w:style w:type="table" w:styleId="1018" w:customStyle="1">
     <w:name w:val="List Table 4 - Accent 4"/>
-    <w:basedOn w:val="849"/>
+    <w:basedOn w:val="851"/>
     <w:pPr>
       <w:pBdr/>
       <w:spacing/>
@@ -40286,9 +40232,9 @@
       </w:tcPr>
     </w:tblStylePr>
   </w:style>
-  <w:style w:type="table" w:styleId="1017" w:customStyle="1">
+  <w:style w:type="table" w:styleId="1019" w:customStyle="1">
     <w:name w:val="List Table 4 - Accent 5"/>
-    <w:basedOn w:val="849"/>
+    <w:basedOn w:val="851"/>
     <w:pPr>
       <w:pBdr/>
       <w:spacing/>
@@ -40551,9 +40497,9 @@
       </w:tcPr>
     </w:tblStylePr>
   </w:style>
-  <w:style w:type="table" w:styleId="1018" w:customStyle="1">
+  <w:style w:type="table" w:styleId="1020" w:customStyle="1">
     <w:name w:val="List Table 4 - Accent 6"/>
-    <w:basedOn w:val="849"/>
+    <w:basedOn w:val="851"/>
     <w:pPr>
       <w:pBdr/>
       <w:spacing/>
@@ -40816,9 +40762,9 @@
       </w:tcPr>
     </w:tblStylePr>
   </w:style>
-  <w:style w:type="table" w:styleId="1019">
+  <w:style w:type="table" w:styleId="1021">
     <w:name w:val="List Table 5 Dark"/>
-    <w:basedOn w:val="849"/>
+    <w:basedOn w:val="851"/>
     <w:uiPriority w:val="50"/>
     <w:pPr>
       <w:pBdr>
@@ -41084,9 +41030,9 @@
       </w:tcPr>
     </w:tblStylePr>
   </w:style>
-  <w:style w:type="table" w:styleId="1020" w:customStyle="1">
+  <w:style w:type="table" w:styleId="1022" w:customStyle="1">
     <w:name w:val="List Table 5 Dark - Accent 1"/>
-    <w:basedOn w:val="849"/>
+    <w:basedOn w:val="851"/>
     <w:pPr>
       <w:pBdr>
         <w:top w:val="none" w:color="000000" w:sz="0" w:space="3"/>
@@ -41351,9 +41297,9 @@
       </w:tcPr>
     </w:tblStylePr>
   </w:style>
-  <w:style w:type="table" w:styleId="1021" w:customStyle="1">
+  <w:style w:type="table" w:styleId="1023" w:customStyle="1">
     <w:name w:val="List Table 5 Dark - Accent 2"/>
-    <w:basedOn w:val="849"/>
+    <w:basedOn w:val="851"/>
     <w:pPr>
       <w:pBdr>
         <w:top w:val="none" w:color="000000" w:sz="0" w:space="3"/>
@@ -41618,9 +41564,9 @@
       </w:tcPr>
     </w:tblStylePr>
   </w:style>
-  <w:style w:type="table" w:styleId="1022" w:customStyle="1">
+  <w:style w:type="table" w:styleId="1024" w:customStyle="1">
     <w:name w:val="List Table 5 Dark - Accent 3"/>
-    <w:basedOn w:val="849"/>
+    <w:basedOn w:val="851"/>
     <w:pPr>
       <w:pBdr>
         <w:top w:val="none" w:color="000000" w:sz="0" w:space="3"/>
@@ -41885,9 +41831,9 @@
       </w:tcPr>
     </w:tblStylePr>
   </w:style>
-  <w:style w:type="table" w:styleId="1023" w:customStyle="1">
+  <w:style w:type="table" w:styleId="1025" w:customStyle="1">
     <w:name w:val="List Table 5 Dark - Accent 4"/>
-    <w:basedOn w:val="849"/>
+    <w:basedOn w:val="851"/>
     <w:pPr>
       <w:pBdr>
         <w:top w:val="none" w:color="000000" w:sz="0" w:space="3"/>
@@ -42152,9 +42098,9 @@
       </w:tcPr>
     </w:tblStylePr>
   </w:style>
-  <w:style w:type="table" w:styleId="1024" w:customStyle="1">
+  <w:style w:type="table" w:styleId="1026" w:customStyle="1">
     <w:name w:val="List Table 5 Dark - Accent 5"/>
-    <w:basedOn w:val="849"/>
+    <w:basedOn w:val="851"/>
     <w:pPr>
       <w:pBdr>
         <w:top w:val="none" w:color="000000" w:sz="0" w:space="3"/>
@@ -42419,9 +42365,9 @@
       </w:tcPr>
     </w:tblStylePr>
   </w:style>
-  <w:style w:type="table" w:styleId="1025" w:customStyle="1">
+  <w:style w:type="table" w:styleId="1027" w:customStyle="1">
     <w:name w:val="List Table 5 Dark - Accent 6"/>
-    <w:basedOn w:val="849"/>
+    <w:basedOn w:val="851"/>
     <w:pPr>
       <w:pBdr>
         <w:top w:val="none" w:color="000000" w:sz="0" w:space="3"/>
@@ -42686,9 +42632,9 @@
       </w:tcPr>
     </w:tblStylePr>
   </w:style>
-  <w:style w:type="table" w:styleId="1026">
+  <w:style w:type="table" w:styleId="1028">
     <w:name w:val="List Table 6 Colorful"/>
-    <w:basedOn w:val="849"/>
+    <w:basedOn w:val="851"/>
     <w:uiPriority w:val="51"/>
     <w:pPr>
       <w:pBdr/>
@@ -42950,9 +42896,9 @@
       </w:tcPr>
     </w:tblStylePr>
   </w:style>
-  <w:style w:type="table" w:styleId="1027" w:customStyle="1">
+  <w:style w:type="table" w:styleId="1029" w:customStyle="1">
     <w:name w:val="List Table 6 Colorful - Accent 1"/>
-    <w:basedOn w:val="849"/>
+    <w:basedOn w:val="851"/>
     <w:pPr>
       <w:pBdr/>
       <w:spacing/>
@@ -43213,9 +43159,9 @@
       </w:tcPr>
     </w:tblStylePr>
   </w:style>
-  <w:style w:type="table" w:styleId="1028" w:customStyle="1">
+  <w:style w:type="table" w:styleId="1030" w:customStyle="1">
     <w:name w:val="List Table 6 Colorful - Accent 2"/>
-    <w:basedOn w:val="849"/>
+    <w:basedOn w:val="851"/>
     <w:pPr>
       <w:pBdr/>
       <w:spacing/>
@@ -43476,9 +43422,9 @@
       </w:tcPr>
     </w:tblStylePr>
   </w:style>
-  <w:style w:type="table" w:styleId="1029" w:customStyle="1">
+  <w:style w:type="table" w:styleId="1031" w:customStyle="1">
     <w:name w:val="List Table 6 Colorful - Accent 3"/>
-    <w:basedOn w:val="849"/>
+    <w:basedOn w:val="851"/>
     <w:pPr>
       <w:pBdr/>
       <w:spacing/>
@@ -43739,9 +43685,9 @@
       </w:tcPr>
     </w:tblStylePr>
   </w:style>
-  <w:style w:type="table" w:styleId="1030" w:customStyle="1">
+  <w:style w:type="table" w:styleId="1032" w:customStyle="1">
     <w:name w:val="List Table 6 Colorful - Accent 4"/>
-    <w:basedOn w:val="849"/>
+    <w:basedOn w:val="851"/>
     <w:pPr>
       <w:pBdr/>
       <w:spacing/>
@@ -44002,9 +43948,9 @@
       </w:tcPr>
     </w:tblStylePr>
   </w:style>
-  <w:style w:type="table" w:styleId="1031" w:customStyle="1">
+  <w:style w:type="table" w:styleId="1033" w:customStyle="1">
     <w:name w:val="List Table 6 Colorful - Accent 5"/>
-    <w:basedOn w:val="849"/>
+    <w:basedOn w:val="851"/>
     <w:pPr>
       <w:pBdr/>
       <w:spacing/>
@@ -44265,9 +44211,9 @@
       </w:tcPr>
     </w:tblStylePr>
   </w:style>
-  <w:style w:type="table" w:styleId="1032" w:customStyle="1">
+  <w:style w:type="table" w:styleId="1034" w:customStyle="1">
     <w:name w:val="List Table 6 Colorful - Accent 6"/>
-    <w:basedOn w:val="849"/>
+    <w:basedOn w:val="851"/>
     <w:pPr>
       <w:pBdr/>
       <w:spacing/>
@@ -44528,9 +44474,9 @@
       </w:tcPr>
     </w:tblStylePr>
   </w:style>
-  <w:style w:type="table" w:styleId="1033">
+  <w:style w:type="table" w:styleId="1035">
     <w:name w:val="List Table 7 Colorful"/>
-    <w:basedOn w:val="849"/>
+    <w:basedOn w:val="851"/>
     <w:uiPriority w:val="52"/>
     <w:pPr>
       <w:pBdr>
@@ -44819,9 +44765,9 @@
       </w:tcPr>
     </w:tblStylePr>
   </w:style>
-  <w:style w:type="table" w:styleId="1034" w:customStyle="1">
+  <w:style w:type="table" w:styleId="1036" w:customStyle="1">
     <w:name w:val="List Table 7 Colorful - Accent 1"/>
-    <w:basedOn w:val="849"/>
+    <w:basedOn w:val="851"/>
     <w:pPr>
       <w:pBdr>
         <w:top w:val="none" w:color="000000" w:sz="0" w:space="3"/>
@@ -45109,9 +45055,9 @@
       </w:tcPr>
     </w:tblStylePr>
   </w:style>
-  <w:style w:type="table" w:styleId="1035" w:customStyle="1">
+  <w:style w:type="table" w:styleId="1037" w:customStyle="1">
     <w:name w:val="List Table 7 Colorful - Accent 2"/>
-    <w:basedOn w:val="849"/>
+    <w:basedOn w:val="851"/>
     <w:pPr>
       <w:pBdr>
         <w:top w:val="none" w:color="000000" w:sz="0" w:space="3"/>
@@ -45399,9 +45345,9 @@
       </w:tcPr>
     </w:tblStylePr>
   </w:style>
-  <w:style w:type="table" w:styleId="1036" w:customStyle="1">
+  <w:style w:type="table" w:styleId="1038" w:customStyle="1">
     <w:name w:val="List Table 7 Colorful - Accent 3"/>
-    <w:basedOn w:val="849"/>
+    <w:basedOn w:val="851"/>
     <w:pPr>
       <w:pBdr>
         <w:top w:val="none" w:color="000000" w:sz="0" w:space="3"/>
@@ -45689,9 +45635,9 @@
       </w:tcPr>
     </w:tblStylePr>
   </w:style>
-  <w:style w:type="table" w:styleId="1037" w:customStyle="1">
+  <w:style w:type="table" w:styleId="1039" w:customStyle="1">
     <w:name w:val="List Table 7 Colorful - Accent 4"/>
-    <w:basedOn w:val="849"/>
+    <w:basedOn w:val="851"/>
     <w:pPr>
       <w:pBdr>
         <w:top w:val="none" w:color="000000" w:sz="0" w:space="3"/>
@@ -45979,9 +45925,9 @@
       </w:tcPr>
     </w:tblStylePr>
   </w:style>
-  <w:style w:type="table" w:styleId="1038" w:customStyle="1">
+  <w:style w:type="table" w:styleId="1040" w:customStyle="1">
     <w:name w:val="List Table 7 Colorful - Accent 5"/>
-    <w:basedOn w:val="849"/>
+    <w:basedOn w:val="851"/>
     <w:pPr>
       <w:pBdr>
         <w:top w:val="none" w:color="000000" w:sz="0" w:space="3"/>
@@ -46269,9 +46215,9 @@
       </w:tcPr>
     </w:tblStylePr>
   </w:style>
-  <w:style w:type="table" w:styleId="1039" w:customStyle="1">
+  <w:style w:type="table" w:styleId="1041" w:customStyle="1">
     <w:name w:val="List Table 7 Colorful - Accent 6"/>
-    <w:basedOn w:val="849"/>
+    <w:basedOn w:val="851"/>
     <w:pPr>
       <w:pBdr>
         <w:top w:val="none" w:color="000000" w:sz="0" w:space="3"/>
@@ -46559,9 +46505,9 @@
       </w:tcPr>
     </w:tblStylePr>
   </w:style>
-  <w:style w:type="table" w:styleId="1040" w:customStyle="1">
+  <w:style w:type="table" w:styleId="1042" w:customStyle="1">
     <w:name w:val="Lined - Accent"/>
-    <w:basedOn w:val="849"/>
+    <w:basedOn w:val="851"/>
     <w:pPr>
       <w:pBdr/>
       <w:spacing/>
@@ -46847,9 +46793,9 @@
       </w:tcPr>
     </w:tblStylePr>
   </w:style>
-  <w:style w:type="table" w:styleId="1041" w:customStyle="1">
+  <w:style w:type="table" w:styleId="1043" w:customStyle="1">
     <w:name w:val="Lined - Accent 1"/>
-    <w:basedOn w:val="849"/>
+    <w:basedOn w:val="851"/>
     <w:pPr>
       <w:pBdr/>
       <w:spacing/>
@@ -47135,9 +47081,9 @@
       </w:tcPr>
     </w:tblStylePr>
   </w:style>
-  <w:style w:type="table" w:styleId="1042" w:customStyle="1">
+  <w:style w:type="table" w:styleId="1044" w:customStyle="1">
     <w:name w:val="Lined - Accent 2"/>
-    <w:basedOn w:val="849"/>
+    <w:basedOn w:val="851"/>
     <w:pPr>
       <w:pBdr/>
       <w:spacing/>
@@ -47423,9 +47369,9 @@
       </w:tcPr>
     </w:tblStylePr>
   </w:style>
-  <w:style w:type="table" w:styleId="1043" w:customStyle="1">
+  <w:style w:type="table" w:styleId="1045" w:customStyle="1">
     <w:name w:val="Lined - Accent 3"/>
-    <w:basedOn w:val="849"/>
+    <w:basedOn w:val="851"/>
     <w:pPr>
       <w:pBdr/>
       <w:spacing/>
@@ -47711,9 +47657,9 @@
       </w:tcPr>
     </w:tblStylePr>
   </w:style>
-  <w:style w:type="table" w:styleId="1044" w:customStyle="1">
+  <w:style w:type="table" w:styleId="1046" w:customStyle="1">
     <w:name w:val="Lined - Accent 4"/>
-    <w:basedOn w:val="849"/>
+    <w:basedOn w:val="851"/>
     <w:pPr>
       <w:pBdr/>
       <w:spacing/>
@@ -47999,9 +47945,9 @@
       </w:tcPr>
     </w:tblStylePr>
   </w:style>
-  <w:style w:type="table" w:styleId="1045" w:customStyle="1">
+  <w:style w:type="table" w:styleId="1047" w:customStyle="1">
     <w:name w:val="Lined - Accent 5"/>
-    <w:basedOn w:val="849"/>
+    <w:basedOn w:val="851"/>
     <w:pPr>
       <w:pBdr/>
       <w:spacing/>
@@ -48287,9 +48233,9 @@
       </w:tcPr>
     </w:tblStylePr>
   </w:style>
-  <w:style w:type="table" w:styleId="1046" w:customStyle="1">
+  <w:style w:type="table" w:styleId="1048" w:customStyle="1">
     <w:name w:val="Lined - Accent 6"/>
-    <w:basedOn w:val="849"/>
+    <w:basedOn w:val="851"/>
     <w:pPr>
       <w:pBdr/>
       <w:spacing/>
@@ -48575,9 +48521,9 @@
       </w:tcPr>
     </w:tblStylePr>
   </w:style>
-  <w:style w:type="table" w:styleId="1047" w:customStyle="1">
+  <w:style w:type="table" w:styleId="1049" w:customStyle="1">
     <w:name w:val="Bordered &amp; Lined - Accent"/>
-    <w:basedOn w:val="849"/>
+    <w:basedOn w:val="851"/>
     <w:pPr>
       <w:pBdr/>
       <w:spacing/>
@@ -48870,9 +48816,9 @@
       </w:tcPr>
     </w:tblStylePr>
   </w:style>
-  <w:style w:type="table" w:styleId="1048" w:customStyle="1">
+  <w:style w:type="table" w:styleId="1050" w:customStyle="1">
     <w:name w:val="Bordered &amp; Lined - Accent 1"/>
-    <w:basedOn w:val="849"/>
+    <w:basedOn w:val="851"/>
     <w:pPr>
       <w:pBdr/>
       <w:spacing/>
@@ -49165,9 +49111,9 @@
       </w:tcPr>
     </w:tblStylePr>
   </w:style>
-  <w:style w:type="table" w:styleId="1049" w:customStyle="1">
+  <w:style w:type="table" w:styleId="1051" w:customStyle="1">
     <w:name w:val="Bordered &amp; Lined - Accent 2"/>
-    <w:basedOn w:val="849"/>
+    <w:basedOn w:val="851"/>
     <w:pPr>
       <w:pBdr/>
       <w:spacing/>
@@ -49460,9 +49406,9 @@
       </w:tcPr>
     </w:tblStylePr>
   </w:style>
-  <w:style w:type="table" w:styleId="1050" w:customStyle="1">
+  <w:style w:type="table" w:styleId="1052" w:customStyle="1">
     <w:name w:val="Bordered &amp; Lined - Accent 3"/>
-    <w:basedOn w:val="849"/>
+    <w:basedOn w:val="851"/>
     <w:pPr>
       <w:pBdr/>
       <w:spacing/>
@@ -49755,9 +49701,9 @@
       </w:tcPr>
     </w:tblStylePr>
   </w:style>
-  <w:style w:type="table" w:styleId="1051" w:customStyle="1">
+  <w:style w:type="table" w:styleId="1053" w:customStyle="1">
     <w:name w:val="Bordered &amp; Lined - Accent 4"/>
-    <w:basedOn w:val="849"/>
+    <w:basedOn w:val="851"/>
     <w:pPr>
       <w:pBdr/>
       <w:spacing/>
@@ -50050,9 +49996,9 @@
       </w:tcPr>
     </w:tblStylePr>
   </w:style>
-  <w:style w:type="table" w:styleId="1052" w:customStyle="1">
+  <w:style w:type="table" w:styleId="1054" w:customStyle="1">
     <w:name w:val="Bordered &amp; Lined - Accent 5"/>
-    <w:basedOn w:val="849"/>
+    <w:basedOn w:val="851"/>
     <w:pPr>
       <w:pBdr/>
       <w:spacing/>
@@ -50345,9 +50291,9 @@
       </w:tcPr>
     </w:tblStylePr>
   </w:style>
-  <w:style w:type="table" w:styleId="1053" w:customStyle="1">
+  <w:style w:type="table" w:styleId="1055" w:customStyle="1">
     <w:name w:val="Bordered &amp; Lined - Accent 6"/>
-    <w:basedOn w:val="849"/>
+    <w:basedOn w:val="851"/>
     <w:pPr>
       <w:pBdr/>
       <w:spacing/>
@@ -50640,9 +50586,9 @@
       </w:tcPr>
     </w:tblStylePr>
   </w:style>
-  <w:style w:type="table" w:styleId="1054" w:customStyle="1">
+  <w:style w:type="table" w:styleId="1056" w:customStyle="1">
     <w:name w:val="Bordered"/>
-    <w:basedOn w:val="849"/>
+    <w:basedOn w:val="851"/>
     <w:pPr>
       <w:pBdr/>
       <w:spacing/>
@@ -50904,9 +50850,9 @@
       </w:tcPr>
     </w:tblStylePr>
   </w:style>
-  <w:style w:type="table" w:styleId="1055" w:customStyle="1">
+  <w:style w:type="table" w:styleId="1057" w:customStyle="1">
     <w:name w:val="Bordered - Accent 1"/>
-    <w:basedOn w:val="849"/>
+    <w:basedOn w:val="851"/>
     <w:pPr>
       <w:pBdr/>
       <w:spacing/>
@@ -51168,9 +51114,9 @@
       </w:tcPr>
     </w:tblStylePr>
   </w:style>
-  <w:style w:type="table" w:styleId="1056" w:customStyle="1">
+  <w:style w:type="table" w:styleId="1058" w:customStyle="1">
     <w:name w:val="Bordered - Accent 2"/>
-    <w:basedOn w:val="849"/>
+    <w:basedOn w:val="851"/>
     <w:pPr>
       <w:pBdr/>
       <w:spacing/>
@@ -51432,9 +51378,9 @@
       </w:tcPr>
     </w:tblStylePr>
   </w:style>
-  <w:style w:type="table" w:styleId="1057" w:customStyle="1">
+  <w:style w:type="table" w:styleId="1059" w:customStyle="1">
     <w:name w:val="Bordered - Accent 3"/>
-    <w:basedOn w:val="849"/>
+    <w:basedOn w:val="851"/>
     <w:pPr>
       <w:pBdr/>
       <w:spacing/>
@@ -51696,9 +51642,9 @@
       </w:tcPr>
     </w:tblStylePr>
   </w:style>
-  <w:style w:type="table" w:styleId="1058" w:customStyle="1">
+  <w:style w:type="table" w:styleId="1060" w:customStyle="1">
     <w:name w:val="Bordered - Accent 4"/>
-    <w:basedOn w:val="849"/>
+    <w:basedOn w:val="851"/>
     <w:pPr>
       <w:pBdr/>
       <w:spacing/>
@@ -51960,9 +51906,9 @@
       </w:tcPr>
     </w:tblStylePr>
   </w:style>
-  <w:style w:type="table" w:styleId="1059" w:customStyle="1">
+  <w:style w:type="table" w:styleId="1061" w:customStyle="1">
     <w:name w:val="Bordered - Accent 5"/>
-    <w:basedOn w:val="849"/>
+    <w:basedOn w:val="851"/>
     <w:pPr>
       <w:pBdr/>
       <w:spacing/>
@@ -52224,9 +52170,9 @@
       </w:tcPr>
     </w:tblStylePr>
   </w:style>
-  <w:style w:type="table" w:styleId="1060" w:customStyle="1">
+  <w:style w:type="table" w:styleId="1062" w:customStyle="1">
     <w:name w:val="Bordered - Accent 6"/>
-    <w:basedOn w:val="849"/>
+    <w:basedOn w:val="851"/>
     <w:pPr>
       <w:pBdr/>
       <w:spacing/>
@@ -52488,9 +52434,9 @@
       </w:tcPr>
     </w:tblStylePr>
   </w:style>
-  <w:style w:type="table" w:styleId="1061">
+  <w:style w:type="table" w:styleId="1063">
     <w:name w:val="Table Grid"/>
-    <w:basedOn w:val="849"/>
+    <w:basedOn w:val="851"/>
     <w:uiPriority w:val="59"/>
     <w:pPr>
       <w:pBdr/>

</xml_diff>

<commit_message>
feat: Add 'etage' property to apartment models and include it in the document generation service. (#44)
</commit_message>
<xml_diff>
--- a/src/assets/docx/bail.docx
+++ b/src/assets/docx/bail.docx
@@ -4,7 +4,7 @@
   <w:body>
     <w:p>
       <w:pPr>
-        <w:pStyle w:val="871"/>
+        <w:pStyle w:val="873"/>
         <w:pBdr/>
         <w:spacing/>
         <w:ind/>
@@ -17,7 +17,7 @@
     </w:p>
     <w:p>
       <w:pPr>
-        <w:pStyle w:val="871"/>
+        <w:pStyle w:val="873"/>
         <w:pBdr/>
         <w:spacing/>
         <w:ind/>
@@ -76,7 +76,7 @@
     </w:p>
     <w:p>
       <w:pPr>
-        <w:pStyle w:val="871"/>
+        <w:pStyle w:val="873"/>
         <w:pBdr/>
         <w:spacing/>
         <w:ind/>
@@ -131,7 +131,7 @@
     </w:p>
     <w:p>
       <w:pPr>
-        <w:pStyle w:val="839"/>
+        <w:pStyle w:val="841"/>
         <w:numPr>
           <w:ilvl w:val="0"/>
           <w:numId w:val="13"/>
@@ -189,7 +189,7 @@
     </w:p>
     <w:p>
       <w:pPr>
-        <w:pStyle w:val="840"/>
+        <w:pStyle w:val="842"/>
         <w:pBdr/>
         <w:shd w:val="solid" w:color="ffffff" w:fill="auto"/>
         <w:spacing/>
@@ -370,7 +370,7 @@
     </w:p>
     <w:p>
       <w:pPr>
-        <w:pStyle w:val="840"/>
+        <w:pStyle w:val="842"/>
         <w:pBdr/>
         <w:shd w:val="solid" w:color="ffffff" w:fill="auto"/>
         <w:spacing/>
@@ -586,7 +586,7 @@
     </w:p>
     <w:p>
       <w:pPr>
-        <w:pStyle w:val="839"/>
+        <w:pStyle w:val="841"/>
         <w:numPr>
           <w:ilvl w:val="0"/>
           <w:numId w:val="13"/>
@@ -641,7 +641,7 @@
     </w:p>
     <w:p>
       <w:pPr>
-        <w:pStyle w:val="840"/>
+        <w:pStyle w:val="842"/>
         <w:pBdr/>
         <w:shd w:val="solid" w:color="ffffff" w:fill="auto"/>
         <w:spacing/>
@@ -769,7 +769,7 @@
         <w:rPr/>
       </w:pPr>
       <w:r>
-        <w:t xml:space="preserve">Étage : 4è Étage, porte de droite</w:t>
+        <w:t xml:space="preserve">Étage : {etage}</w:t>
       </w:r>
       <w:r/>
     </w:p>
@@ -909,6 +909,7 @@
         <w:rPr>
           <w:bCs/>
         </w:rPr>
+        <w:t xml:space="preserve">s</w:t>
       </w:r>
       <w:r>
         <w:rPr>
@@ -2082,7 +2083,7 @@
       </w:r>
       <w:r>
         <w:rPr>
-          <w:bCs/>
+          <w:highlight w:val="none"/>
         </w:rPr>
       </w:r>
       <w:r>
@@ -2249,7 +2250,7 @@
     </w:p>
     <w:p>
       <w:pPr>
-        <w:pStyle w:val="869"/>
+        <w:pStyle w:val="871"/>
         <w:numPr>
           <w:ilvl w:val="0"/>
           <w:numId w:val="5"/>
@@ -2309,7 +2310,7 @@
     </w:p>
     <w:p>
       <w:pPr>
-        <w:pStyle w:val="882"/>
+        <w:pStyle w:val="884"/>
         <w:pBdr/>
         <w:spacing/>
         <w:ind/>
@@ -2352,7 +2353,7 @@
     </w:p>
     <w:p>
       <w:pPr>
-        <w:pStyle w:val="882"/>
+        <w:pStyle w:val="884"/>
         <w:pBdr/>
         <w:spacing/>
         <w:ind/>
@@ -2395,7 +2396,7 @@
     </w:p>
     <w:p>
       <w:pPr>
-        <w:pStyle w:val="882"/>
+        <w:pStyle w:val="884"/>
         <w:pBdr/>
         <w:spacing/>
         <w:ind/>
@@ -2514,7 +2515,7 @@
     </w:p>
     <w:p>
       <w:pPr>
-        <w:pStyle w:val="840"/>
+        <w:pStyle w:val="842"/>
         <w:pBdr/>
         <w:shd w:val="solid" w:color="ffffff" w:fill="auto"/>
         <w:spacing/>
@@ -2651,7 +2652,7 @@
     </w:p>
     <w:p>
       <w:pPr>
-        <w:pStyle w:val="840"/>
+        <w:pStyle w:val="842"/>
         <w:pBdr/>
         <w:shd w:val="solid" w:color="ffffff" w:fill="auto"/>
         <w:spacing/>
@@ -2738,7 +2739,7 @@
     </w:p>
     <w:p>
       <w:pPr>
-        <w:pStyle w:val="840"/>
+        <w:pStyle w:val="842"/>
         <w:pBdr/>
         <w:shd w:val="solid" w:color="ffffff" w:fill="auto"/>
         <w:spacing/>
@@ -3027,7 +3028,7 @@
       <w:r>
         <w:rPr>
           <w:rFonts w:cs="Arial"/>
-          <w:szCs w:val="20"/>
+          <w:highlight w:val="none"/>
         </w:rPr>
       </w:r>
       <w:r>
@@ -3056,8 +3057,6 @@
       <w:r>
         <w:rPr>
           <w:rFonts w:cs="Arial"/>
-          <w:szCs w:val="20"/>
-          <w:highlight w:val="none"/>
         </w:rPr>
       </w:r>
       <w:r>
@@ -3068,7 +3067,7 @@
     </w:p>
     <w:p>
       <w:pPr>
-        <w:pStyle w:val="840"/>
+        <w:pStyle w:val="842"/>
         <w:pBdr/>
         <w:shd w:val="solid" w:color="ffffff" w:fill="auto"/>
         <w:spacing/>
@@ -3188,7 +3187,7 @@
     </w:p>
     <w:p>
       <w:pPr>
-        <w:pStyle w:val="839"/>
+        <w:pStyle w:val="841"/>
         <w:numPr>
           <w:ilvl w:val="0"/>
           <w:numId w:val="13"/>
@@ -3280,7 +3279,7 @@
     </w:p>
     <w:p>
       <w:pPr>
-        <w:pStyle w:val="840"/>
+        <w:pStyle w:val="842"/>
         <w:pBdr/>
         <w:shd w:val="solid" w:color="ffffff" w:fill="auto"/>
         <w:spacing/>
@@ -3414,7 +3413,7 @@
     </w:p>
     <w:p>
       <w:pPr>
-        <w:pStyle w:val="840"/>
+        <w:pStyle w:val="842"/>
         <w:pBdr/>
         <w:shd w:val="solid" w:color="ffffff" w:fill="auto"/>
         <w:spacing/>
@@ -4349,7 +4348,7 @@
     </w:p>
     <w:p>
       <w:pPr>
-        <w:pStyle w:val="839"/>
+        <w:pStyle w:val="841"/>
         <w:numPr>
           <w:ilvl w:val="0"/>
           <w:numId w:val="13"/>
@@ -4441,7 +4440,7 @@
     </w:p>
     <w:p>
       <w:pPr>
-        <w:pStyle w:val="840"/>
+        <w:pStyle w:val="842"/>
         <w:pBdr/>
         <w:shd w:val="solid" w:color="ffffff" w:fill="auto"/>
         <w:spacing/>
@@ -4469,7 +4468,7 @@
     </w:p>
     <w:p>
       <w:pPr>
-        <w:pStyle w:val="841"/>
+        <w:pStyle w:val="843"/>
         <w:pBdr/>
         <w:spacing/>
         <w:ind/>
@@ -4828,7 +4827,7 @@
     </w:p>
     <w:p>
       <w:pPr>
-        <w:pStyle w:val="869"/>
+        <w:pStyle w:val="871"/>
         <w:numPr>
           <w:ilvl w:val="1"/>
           <w:numId w:val="9"/>
@@ -4845,7 +4844,7 @@
     </w:p>
     <w:p>
       <w:pPr>
-        <w:pStyle w:val="869"/>
+        <w:pStyle w:val="871"/>
         <w:numPr>
           <w:ilvl w:val="1"/>
           <w:numId w:val="9"/>
@@ -4868,7 +4867,7 @@
     </w:p>
     <w:p>
       <w:pPr>
-        <w:pStyle w:val="869"/>
+        <w:pStyle w:val="871"/>
         <w:numPr>
           <w:ilvl w:val="1"/>
           <w:numId w:val="9"/>
@@ -4885,7 +4884,7 @@
     </w:p>
     <w:p>
       <w:pPr>
-        <w:pStyle w:val="869"/>
+        <w:pStyle w:val="871"/>
         <w:numPr>
           <w:ilvl w:val="1"/>
           <w:numId w:val="9"/>
@@ -4911,7 +4910,7 @@
     </w:p>
     <w:p>
       <w:pPr>
-        <w:pStyle w:val="869"/>
+        <w:pStyle w:val="871"/>
         <w:numPr>
           <w:ilvl w:val="1"/>
           <w:numId w:val="9"/>
@@ -4928,7 +4927,7 @@
     </w:p>
     <w:p>
       <w:pPr>
-        <w:pStyle w:val="869"/>
+        <w:pStyle w:val="871"/>
         <w:numPr>
           <w:ilvl w:val="1"/>
           <w:numId w:val="9"/>
@@ -4957,7 +4956,7 @@
     </w:p>
     <w:p>
       <w:pPr>
-        <w:pStyle w:val="869"/>
+        <w:pStyle w:val="871"/>
         <w:numPr>
           <w:ilvl w:val="1"/>
           <w:numId w:val="9"/>
@@ -4974,7 +4973,7 @@
     </w:p>
     <w:p>
       <w:pPr>
-        <w:pStyle w:val="869"/>
+        <w:pStyle w:val="871"/>
         <w:numPr>
           <w:ilvl w:val="1"/>
           <w:numId w:val="9"/>
@@ -5012,7 +5011,7 @@
     </w:p>
     <w:p>
       <w:pPr>
-        <w:pStyle w:val="869"/>
+        <w:pStyle w:val="871"/>
         <w:numPr>
           <w:ilvl w:val="1"/>
           <w:numId w:val="9"/>
@@ -5032,7 +5031,7 @@
     </w:p>
     <w:p>
       <w:pPr>
-        <w:pStyle w:val="869"/>
+        <w:pStyle w:val="871"/>
         <w:numPr>
           <w:ilvl w:val="1"/>
           <w:numId w:val="9"/>
@@ -5073,7 +5072,7 @@
     </w:p>
     <w:p>
       <w:pPr>
-        <w:pStyle w:val="869"/>
+        <w:pStyle w:val="871"/>
         <w:numPr>
           <w:ilvl w:val="1"/>
           <w:numId w:val="9"/>
@@ -5090,7 +5089,7 @@
     </w:p>
     <w:p>
       <w:pPr>
-        <w:pStyle w:val="869"/>
+        <w:pStyle w:val="871"/>
         <w:numPr>
           <w:ilvl w:val="1"/>
           <w:numId w:val="9"/>
@@ -5107,7 +5106,7 @@
     </w:p>
     <w:p>
       <w:pPr>
-        <w:pStyle w:val="869"/>
+        <w:pStyle w:val="871"/>
         <w:numPr>
           <w:ilvl w:val="1"/>
           <w:numId w:val="9"/>
@@ -5142,7 +5141,7 @@
     </w:p>
     <w:p>
       <w:pPr>
-        <w:pStyle w:val="869"/>
+        <w:pStyle w:val="871"/>
         <w:numPr>
           <w:ilvl w:val="1"/>
           <w:numId w:val="9"/>
@@ -5159,7 +5158,7 @@
     </w:p>
     <w:p>
       <w:pPr>
-        <w:pStyle w:val="869"/>
+        <w:pStyle w:val="871"/>
         <w:numPr>
           <w:ilvl w:val="1"/>
           <w:numId w:val="9"/>
@@ -5170,39 +5169,30 @@
         <w:rPr/>
       </w:pPr>
       <w:r>
-        <w:t xml:space="preserve">La présence d’espaces verts au sein de la résidence et la situation de l’appartement au sein de l’immeuble (quatrième étage, avec vue dégagée sur la cour privée de la résidence) constituent de véritables atouts.</w:t>
+        <w:t xml:space="preserve">La présence d’espaces verts au sein de la résidence et la situation de l’appartement au sein de l’immeuble (vue dégagée sur le parc du Square du château constituent de véritables atouts.</w:t>
+      </w:r>
+      <w:r>
+        <w:t xml:space="preserve">{/</w:t>
+      </w:r>
+      <w:r>
+        <w:rPr>
+          <w:rFonts w:cs="Arial"/>
+          <w:szCs w:val="20"/>
+        </w:rPr>
+        <w:t xml:space="preserve">isChateauGaillard53A</w:t>
+      </w:r>
+      <w:r>
+        <w:t xml:space="preserve">}</w:t>
       </w:r>
       <w:r/>
     </w:p>
     <w:p>
       <w:pPr>
-        <w:pStyle w:val="869"/>
-        <w:numPr>
-          <w:ilvl w:val="1"/>
-          <w:numId w:val="9"/>
-        </w:numPr>
-        <w:pBdr/>
-        <w:spacing/>
-        <w:ind w:hanging="360" w:left="1440"/>
+        <w:pBdr/>
+        <w:spacing/>
+        <w:ind w:left="720"/>
         <w:rPr/>
       </w:pPr>
-      <w:r>
-        <w:t xml:space="preserve">La présence d’espaces verts au sein de la résidence et la situation de l’appartement au sein de l’immeuble (vue dégagée sur le parc du Square du château constituent de véritables atouts.</w:t>
-      </w:r>
-      <w:r/>
-      <w:r>
-        <w:t xml:space="preserve">{/</w:t>
-      </w:r>
-      <w:r>
-        <w:rPr>
-          <w:rFonts w:cs="Arial"/>
-          <w:szCs w:val="20"/>
-        </w:rPr>
-        <w:t xml:space="preserve">isChateauGaillard53A</w:t>
-      </w:r>
-      <w:r>
-        <w:t xml:space="preserve">}</w:t>
-      </w:r>
       <w:r/>
       <w:r/>
     </w:p>
@@ -5210,10 +5200,86 @@
       <w:pPr>
         <w:pBdr/>
         <w:spacing/>
-        <w:ind w:left="720"/>
+        <w:ind/>
+        <w:rPr>
+          <w:rFonts w:cs="Arial"/>
+          <w:szCs w:val="20"/>
+        </w:rPr>
+      </w:pPr>
+      <w:r>
+        <w:rPr>
+          <w:rFonts w:cs="Arial"/>
+          <w:szCs w:val="20"/>
+        </w:rPr>
+        <w:t xml:space="preserve">c) Informations relatives au loyer du dernier locataire : Le loyer appliqué au dernier locataire était de {</w:t>
+      </w:r>
+      <w:r>
+        <w:rPr>
+          <w:rFonts w:cs="Arial"/>
+          <w:szCs w:val="20"/>
+        </w:rPr>
+        <w:t xml:space="preserve">lastPriceWithoutCharge</w:t>
+      </w:r>
+      <w:r>
+        <w:rPr>
+          <w:rFonts w:cs="Arial"/>
+          <w:szCs w:val="20"/>
+        </w:rPr>
+        <w:t xml:space="preserve">}€ hors charges.</w:t>
+      </w:r>
+      <w:r>
+        <w:rPr>
+          <w:rFonts w:cs="Arial"/>
+          <w:szCs w:val="20"/>
+        </w:rPr>
+      </w:r>
+      <w:r>
+        <w:rPr>
+          <w:rFonts w:cs="Arial"/>
+          <w:szCs w:val="20"/>
+        </w:rPr>
+      </w:r>
+    </w:p>
+    <w:p>
+      <w:pPr>
+        <w:pBdr/>
+        <w:spacing/>
+        <w:ind/>
+        <w:rPr>
+          <w:rFonts w:cs="Arial"/>
+          <w:szCs w:val="20"/>
+        </w:rPr>
+      </w:pPr>
+      <w:r>
+        <w:rPr>
+          <w:rFonts w:cs="Arial"/>
+          <w:szCs w:val="20"/>
+        </w:rPr>
+      </w:r>
+      <w:r>
+        <w:rPr>
+          <w:rFonts w:cs="Arial"/>
+          <w:szCs w:val="20"/>
+        </w:rPr>
+      </w:r>
+      <w:r>
+        <w:rPr>
+          <w:rFonts w:cs="Arial"/>
+          <w:szCs w:val="20"/>
+        </w:rPr>
+      </w:r>
+    </w:p>
+    <w:p>
+      <w:pPr>
+        <w:pStyle w:val="843"/>
+        <w:pBdr/>
+        <w:spacing/>
+        <w:ind/>
         <w:rPr/>
       </w:pPr>
-      <w:r/>
+      <w:r>
+        <w:t xml:space="preserve">2° Modalités de révision</w:t>
+      </w:r>
       <w:r/>
     </w:p>
     <w:p>
@@ -5226,27 +5292,16 @@
           <w:szCs w:val="20"/>
         </w:rPr>
       </w:pPr>
-      <w:r>
-        <w:rPr>
-          <w:rFonts w:cs="Arial"/>
-          <w:szCs w:val="20"/>
-        </w:rPr>
-        <w:t xml:space="preserve">c) Informations relatives au loyer du dernier locataire : Le loyer appliqué au dernier locataire était de {</w:t>
-      </w:r>
-      <w:r>
-        <w:rPr>
-          <w:rFonts w:cs="Arial"/>
-          <w:szCs w:val="20"/>
-        </w:rPr>
-        <w:t xml:space="preserve">lastPriceWithoutCharge</w:t>
-      </w:r>
-      <w:r>
-        <w:rPr>
-          <w:rFonts w:cs="Arial"/>
-          <w:szCs w:val="20"/>
-        </w:rPr>
-        <w:t xml:space="preserve">}€ hors charges.</w:t>
-      </w:r>
+      <w:r/>
+      <w:bookmarkStart w:id="7" w:name="_Hlk206256147"/>
+      <w:r>
+        <w:rPr>
+          <w:rFonts w:cs="Arial"/>
+          <w:szCs w:val="20"/>
+        </w:rPr>
+        <w:t xml:space="preserve">Le loyer sera révisé chaque année à la date anniversaire de la signature du bail, en fonction de la variation de l’Indice de Référence des Loyers (IRL) publié par l’INSEE.</w:t>
+      </w:r>
+      <w:bookmarkEnd w:id="7"/>
       <w:r>
         <w:rPr>
           <w:rFonts w:cs="Arial"/>
@@ -5275,6 +5330,35 @@
           <w:rFonts w:cs="Arial"/>
           <w:szCs w:val="20"/>
         </w:rPr>
+        <w:t xml:space="preserve">Le trimestre de référence retenu est le {</w:t>
+      </w:r>
+      <w:r>
+        <w:rPr>
+          <w:rFonts w:cs="Arial"/>
+          <w:szCs w:val="20"/>
+        </w:rPr>
+        <w:t xml:space="preserve">tIrl</w:t>
+      </w:r>
+      <w:r>
+        <w:rPr>
+          <w:rFonts w:cs="Arial"/>
+          <w:szCs w:val="20"/>
+        </w:rPr>
+        <w:t xml:space="preserve">} valeur {</w:t>
+      </w:r>
+      <w:r>
+        <w:rPr>
+          <w:rFonts w:cs="Arial"/>
+          <w:szCs w:val="20"/>
+        </w:rPr>
+        <w:t xml:space="preserve">valIrl</w:t>
+      </w:r>
+      <w:r>
+        <w:rPr>
+          <w:rFonts w:cs="Arial"/>
+          <w:szCs w:val="20"/>
+        </w:rPr>
+        <w:t xml:space="preserve">}</w:t>
       </w:r>
       <w:r>
         <w:rPr>
@@ -5291,16 +5375,33 @@
     </w:p>
     <w:p>
       <w:pPr>
-        <w:pStyle w:val="841"/>
-        <w:pBdr/>
-        <w:spacing/>
-        <w:ind/>
-        <w:rPr/>
-      </w:pPr>
-      <w:r>
-        <w:t xml:space="preserve">2° Modalités de révision</w:t>
-      </w:r>
-      <w:r/>
+        <w:pBdr/>
+        <w:spacing/>
+        <w:ind/>
+        <w:rPr>
+          <w:rFonts w:cs="Arial"/>
+          <w:szCs w:val="20"/>
+        </w:rPr>
+      </w:pPr>
+      <w:r>
+        <w:rPr>
+          <w:rFonts w:cs="Arial"/>
+          <w:szCs w:val="20"/>
+        </w:rPr>
+        <w:t xml:space="preserve">La formule de calcul de la révision est la suivante : Nouveau loyer = Loyer actuel × (Nouvel IRL / IRL de référence)</w:t>
+      </w:r>
+      <w:r>
+        <w:rPr>
+          <w:rFonts w:cs="Arial"/>
+          <w:szCs w:val="20"/>
+        </w:rPr>
+      </w:r>
+      <w:r>
+        <w:rPr>
+          <w:rFonts w:cs="Arial"/>
+          <w:szCs w:val="20"/>
+        </w:rPr>
+      </w:r>
     </w:p>
     <w:p>
       <w:pPr>
@@ -5312,16 +5413,13 @@
           <w:szCs w:val="20"/>
         </w:rPr>
       </w:pPr>
-      <w:r/>
-      <w:bookmarkStart w:id="7" w:name="_Hlk206256147"/>
-      <w:r>
-        <w:rPr>
-          <w:rFonts w:cs="Arial"/>
-          <w:szCs w:val="20"/>
-        </w:rPr>
-        <w:t xml:space="preserve">Le loyer sera révisé chaque année à la date anniversaire de la signature du bail, en fonction de la variation de l’Indice de Référence des Loyers (IRL) publié par l’INSEE.</w:t>
-      </w:r>
-      <w:bookmarkEnd w:id="7"/>
+      <w:r>
+        <w:rPr>
+          <w:rFonts w:cs="Arial"/>
+          <w:szCs w:val="20"/>
+        </w:rPr>
+        <w:t xml:space="preserve">L’IRL de référence est celui du trimestre indiqué ci-dessus. Le nouvel IRL est celui publié par l’INSEE le jour de la date de la révision du loyer.</w:t>
+      </w:r>
       <w:r>
         <w:rPr>
           <w:rFonts w:cs="Arial"/>
@@ -5350,35 +5448,6 @@
           <w:rFonts w:cs="Arial"/>
           <w:szCs w:val="20"/>
         </w:rPr>
-        <w:t xml:space="preserve">Le trimestre de référence retenu est le {</w:t>
-      </w:r>
-      <w:r>
-        <w:rPr>
-          <w:rFonts w:cs="Arial"/>
-          <w:szCs w:val="20"/>
-        </w:rPr>
-        <w:t xml:space="preserve">tIrl</w:t>
-      </w:r>
-      <w:r>
-        <w:rPr>
-          <w:rFonts w:cs="Arial"/>
-          <w:szCs w:val="20"/>
-        </w:rPr>
-        <w:t xml:space="preserve">} valeur {</w:t>
-      </w:r>
-      <w:r>
-        <w:rPr>
-          <w:rFonts w:cs="Arial"/>
-          <w:szCs w:val="20"/>
-        </w:rPr>
-        <w:t xml:space="preserve">valIrl</w:t>
-      </w:r>
-      <w:r>
-        <w:rPr>
-          <w:rFonts w:cs="Arial"/>
-          <w:szCs w:val="20"/>
-        </w:rPr>
-        <w:t xml:space="preserve">}</w:t>
       </w:r>
       <w:r>
         <w:rPr>
@@ -5408,7 +5477,7 @@
           <w:rFonts w:cs="Arial"/>
           <w:szCs w:val="20"/>
         </w:rPr>
-        <w:t xml:space="preserve">La formule de calcul de la révision est la suivante : Nouveau loyer = Loyer actuel × (Nouvel IRL / IRL de référence)</w:t>
+        <w:t xml:space="preserve">En cas de non-application de la révision à la date prévue, le bailleur pourra en demander l’application rétroactive dans la limite d’un an.</w:t>
       </w:r>
       <w:r>
         <w:rPr>
@@ -5438,7 +5507,6 @@
           <w:rFonts w:cs="Arial"/>
           <w:szCs w:val="20"/>
         </w:rPr>
-        <w:t xml:space="preserve">L’IRL de référence est celui du trimestre indiqué ci-dessus. Le nouvel IRL est celui publié par l’INSEE le jour de la date de la révision du loyer.</w:t>
       </w:r>
       <w:r>
         <w:rPr>
@@ -5455,95 +5523,7 @@
     </w:p>
     <w:p>
       <w:pPr>
-        <w:pBdr/>
-        <w:spacing/>
-        <w:ind/>
-        <w:rPr>
-          <w:rFonts w:cs="Arial"/>
-          <w:szCs w:val="20"/>
-        </w:rPr>
-      </w:pPr>
-      <w:r>
-        <w:rPr>
-          <w:rFonts w:cs="Arial"/>
-          <w:szCs w:val="20"/>
-        </w:rPr>
-      </w:r>
-      <w:r>
-        <w:rPr>
-          <w:rFonts w:cs="Arial"/>
-          <w:szCs w:val="20"/>
-        </w:rPr>
-      </w:r>
-      <w:r>
-        <w:rPr>
-          <w:rFonts w:cs="Arial"/>
-          <w:szCs w:val="20"/>
-        </w:rPr>
-      </w:r>
-    </w:p>
-    <w:p>
-      <w:pPr>
-        <w:pBdr/>
-        <w:spacing/>
-        <w:ind/>
-        <w:rPr>
-          <w:rFonts w:cs="Arial"/>
-          <w:szCs w:val="20"/>
-        </w:rPr>
-      </w:pPr>
-      <w:r>
-        <w:rPr>
-          <w:rFonts w:cs="Arial"/>
-          <w:szCs w:val="20"/>
-        </w:rPr>
-        <w:t xml:space="preserve">En cas de non-application de la révision à la date prévue, le bailleur pourra en demander l’application rétroactive dans la limite d’un an.</w:t>
-      </w:r>
-      <w:r>
-        <w:rPr>
-          <w:rFonts w:cs="Arial"/>
-          <w:szCs w:val="20"/>
-        </w:rPr>
-      </w:r>
-      <w:r>
-        <w:rPr>
-          <w:rFonts w:cs="Arial"/>
-          <w:szCs w:val="20"/>
-        </w:rPr>
-      </w:r>
-    </w:p>
-    <w:p>
-      <w:pPr>
-        <w:pBdr/>
-        <w:spacing/>
-        <w:ind/>
-        <w:rPr>
-          <w:rFonts w:cs="Arial"/>
-          <w:szCs w:val="20"/>
-        </w:rPr>
-      </w:pPr>
-      <w:r>
-        <w:rPr>
-          <w:rFonts w:cs="Arial"/>
-          <w:szCs w:val="20"/>
-        </w:rPr>
-      </w:r>
-      <w:r>
-        <w:rPr>
-          <w:rFonts w:cs="Arial"/>
-          <w:szCs w:val="20"/>
-        </w:rPr>
-      </w:r>
-      <w:r>
-        <w:rPr>
-          <w:rFonts w:cs="Arial"/>
-          <w:szCs w:val="20"/>
-        </w:rPr>
-      </w:r>
-    </w:p>
-    <w:p>
-      <w:pPr>
-        <w:pStyle w:val="840"/>
+        <w:pStyle w:val="842"/>
         <w:pBdr/>
         <w:shd w:val="solid" w:color="ffffff" w:fill="auto"/>
         <w:spacing/>
@@ -5609,9 +5589,9 @@
           <w:b/>
           <w:color w:val="000000"/>
           <w:sz w:val="22"/>
-          <w:highlight w:val="none"/>
           <w:shd w:val="clear" w:color="auto" w:fill="ffffff"/>
         </w:rPr>
+        <w:t xml:space="preserve">1° Modalité de règlement des charges récupérables </w:t>
       </w:r>
       <w:r>
         <w:rPr>
@@ -5624,45 +5604,11 @@
       </w:r>
       <w:r>
         <w:rPr>
-          <w:rFonts w:cs="Arial"/>
-          <w:szCs w:val="20"/>
-        </w:rPr>
-      </w:r>
-      <w:r>
-        <w:rPr>
-          <w:b/>
-          <w:color w:val="000000"/>
-          <w:sz w:val="22"/>
-          <w:shd w:val="clear" w:color="auto" w:fill="ffffff"/>
-        </w:rPr>
-        <w:t xml:space="preserve">1° Modalité de règlement des charges récupérables </w:t>
-      </w:r>
-      <w:r>
-        <w:rPr>
-          <w:b/>
-          <w:color w:val="000000"/>
-          <w:sz w:val="22"/>
-          <w:shd w:val="clear" w:color="auto" w:fill="ffffff"/>
-        </w:rPr>
-      </w:r>
-      <w:r>
-        <w:rPr>
           <w:b/>
           <w:bCs/>
           <w:color w:val="000000"/>
           <w:sz w:val="22"/>
           <w:szCs w:val="22"/>
-          <w:highlight w:val="none"/>
-          <w:shd w:val="clear" w:color="auto" w:fill="ffffff"/>
-        </w:rPr>
-      </w:r>
-      <w:r>
-        <w:rPr>
-          <w:b/>
-          <w:bCs/>
-          <w:color w:val="000000"/>
-          <w:sz w:val="22"/>
-          <w:szCs w:val="22"/>
         </w:rPr>
       </w:r>
     </w:p>
@@ -6612,7 +6558,7 @@
     </w:p>
     <w:p>
       <w:pPr>
-        <w:pStyle w:val="841"/>
+        <w:pStyle w:val="843"/>
         <w:pBdr/>
         <w:spacing/>
         <w:ind/>
@@ -6703,7 +6649,7 @@
     </w:p>
     <w:p>
       <w:pPr>
-        <w:pStyle w:val="841"/>
+        <w:pStyle w:val="843"/>
         <w:pBdr/>
         <w:spacing/>
         <w:ind/>
@@ -6769,7 +6715,7 @@
     </w:p>
     <w:p>
       <w:pPr>
-        <w:pStyle w:val="841"/>
+        <w:pStyle w:val="843"/>
         <w:pBdr/>
         <w:spacing/>
         <w:ind/>
@@ -6841,7 +6787,7 @@
     </w:p>
     <w:p>
       <w:pPr>
-        <w:pStyle w:val="840"/>
+        <w:pStyle w:val="842"/>
         <w:pBdr/>
         <w:shd w:val="solid" w:color="ffffff" w:fill="auto"/>
         <w:spacing/>
@@ -6957,7 +6903,7 @@
     </w:p>
     <w:p>
       <w:pPr>
-        <w:pStyle w:val="840"/>
+        <w:pStyle w:val="842"/>
         <w:pBdr/>
         <w:shd w:val="solid" w:color="ffffff" w:fill="auto"/>
         <w:spacing/>
@@ -8440,7 +8386,7 @@
     </w:p>
     <w:p>
       <w:pPr>
-        <w:pStyle w:val="869"/>
+        <w:pStyle w:val="871"/>
         <w:pBdr/>
         <w:spacing/>
         <w:ind w:left="1418"/>
@@ -8542,7 +8488,7 @@
     </w:p>
     <w:p>
       <w:pPr>
-        <w:pStyle w:val="869"/>
+        <w:pStyle w:val="871"/>
         <w:pBdr/>
         <w:spacing/>
         <w:ind w:left="1418"/>
@@ -8629,7 +8575,7 @@
     </w:p>
     <w:p>
       <w:pPr>
-        <w:pStyle w:val="869"/>
+        <w:pStyle w:val="871"/>
         <w:pBdr/>
         <w:spacing/>
         <w:ind w:left="1418"/>
@@ -8936,7 +8882,7 @@
     </w:p>
     <w:p>
       <w:pPr>
-        <w:pStyle w:val="839"/>
+        <w:pStyle w:val="841"/>
         <w:numPr>
           <w:ilvl w:val="0"/>
           <w:numId w:val="13"/>
@@ -9140,7 +9086,7 @@
     </w:p>
     <w:p>
       <w:pPr>
-        <w:pStyle w:val="839"/>
+        <w:pStyle w:val="841"/>
         <w:numPr>
           <w:ilvl w:val="0"/>
           <w:numId w:val="13"/>
@@ -9173,7 +9119,7 @@
     </w:p>
     <w:p>
       <w:pPr>
-        <w:pStyle w:val="840"/>
+        <w:pStyle w:val="842"/>
         <w:pBdr/>
         <w:shd w:val="solid" w:color="ffffff" w:fill="auto"/>
         <w:spacing/>
@@ -9289,7 +9235,7 @@
     </w:p>
     <w:p>
       <w:pPr>
-        <w:pStyle w:val="840"/>
+        <w:pStyle w:val="842"/>
         <w:pBdr/>
         <w:shd w:val="solid" w:color="ffffff" w:fill="auto"/>
         <w:spacing/>
@@ -9448,7 +9394,7 @@
     </w:p>
     <w:p>
       <w:pPr>
-        <w:pStyle w:val="840"/>
+        <w:pStyle w:val="842"/>
         <w:pBdr/>
         <w:shd w:val="solid" w:color="ffffff" w:fill="auto"/>
         <w:spacing/>
@@ -9689,7 +9635,7 @@
     </w:p>
     <w:p>
       <w:pPr>
-        <w:pStyle w:val="839"/>
+        <w:pStyle w:val="841"/>
         <w:numPr>
           <w:ilvl w:val="0"/>
           <w:numId w:val="13"/>
@@ -9877,7 +9823,7 @@
     </w:p>
     <w:p>
       <w:pPr>
-        <w:pStyle w:val="869"/>
+        <w:pStyle w:val="871"/>
         <w:numPr>
           <w:ilvl w:val="0"/>
           <w:numId w:val="9"/>
@@ -9912,7 +9858,7 @@
     </w:p>
     <w:p>
       <w:pPr>
-        <w:pStyle w:val="869"/>
+        <w:pStyle w:val="871"/>
         <w:numPr>
           <w:ilvl w:val="0"/>
           <w:numId w:val="9"/>
@@ -9976,7 +9922,7 @@
     </w:p>
     <w:p>
       <w:pPr>
-        <w:pStyle w:val="839"/>
+        <w:pStyle w:val="841"/>
         <w:numPr>
           <w:ilvl w:val="0"/>
           <w:numId w:val="13"/>
@@ -10039,7 +9985,7 @@
     </w:p>
     <w:p>
       <w:pPr>
-        <w:pStyle w:val="840"/>
+        <w:pStyle w:val="842"/>
         <w:numPr>
           <w:ilvl w:val="0"/>
           <w:numId w:val="11"/>
@@ -10140,7 +10086,7 @@
     </w:p>
     <w:p>
       <w:pPr>
-        <w:pStyle w:val="840"/>
+        <w:pStyle w:val="842"/>
         <w:numPr>
           <w:ilvl w:val="0"/>
           <w:numId w:val="11"/>
@@ -10231,7 +10177,7 @@
     </w:p>
     <w:p>
       <w:pPr>
-        <w:pStyle w:val="840"/>
+        <w:pStyle w:val="842"/>
         <w:numPr>
           <w:ilvl w:val="0"/>
           <w:numId w:val="11"/>
@@ -10537,7 +10483,7 @@
     </w:p>
     <w:p>
       <w:pPr>
-        <w:pStyle w:val="839"/>
+        <w:pStyle w:val="841"/>
         <w:numPr>
           <w:ilvl w:val="0"/>
           <w:numId w:val="13"/>
@@ -10599,7 +10545,7 @@
     </w:p>
     <w:p>
       <w:pPr>
-        <w:pStyle w:val="840"/>
+        <w:pStyle w:val="842"/>
         <w:numPr>
           <w:ilvl w:val="0"/>
           <w:numId w:val="2"/>
@@ -10700,7 +10646,7 @@
     </w:p>
     <w:p>
       <w:pPr>
-        <w:pStyle w:val="869"/>
+        <w:pStyle w:val="871"/>
         <w:numPr>
           <w:ilvl w:val="0"/>
           <w:numId w:val="5"/>
@@ -10777,7 +10723,7 @@
     </w:p>
     <w:p>
       <w:pPr>
-        <w:pStyle w:val="840"/>
+        <w:pStyle w:val="842"/>
         <w:numPr>
           <w:ilvl w:val="0"/>
           <w:numId w:val="2"/>
@@ -11008,7 +10954,7 @@
     </w:p>
     <w:p>
       <w:pPr>
-        <w:pStyle w:val="840"/>
+        <w:pStyle w:val="842"/>
         <w:numPr>
           <w:ilvl w:val="0"/>
           <w:numId w:val="2"/>
@@ -11135,7 +11081,7 @@
     </w:p>
     <w:p>
       <w:pPr>
-        <w:pStyle w:val="840"/>
+        <w:pStyle w:val="842"/>
         <w:numPr>
           <w:ilvl w:val="0"/>
           <w:numId w:val="2"/>
@@ -11259,7 +11205,7 @@
     </w:p>
     <w:p>
       <w:pPr>
-        <w:pStyle w:val="840"/>
+        <w:pStyle w:val="842"/>
         <w:numPr>
           <w:ilvl w:val="0"/>
           <w:numId w:val="2"/>
@@ -11351,7 +11297,7 @@
     </w:p>
     <w:p>
       <w:pPr>
-        <w:pStyle w:val="840"/>
+        <w:pStyle w:val="842"/>
         <w:numPr>
           <w:ilvl w:val="0"/>
           <w:numId w:val="2"/>
@@ -11411,7 +11357,7 @@
     </w:p>
     <w:p>
       <w:pPr>
-        <w:pStyle w:val="869"/>
+        <w:pStyle w:val="871"/>
         <w:numPr>
           <w:ilvl w:val="0"/>
           <w:numId w:val="9"/>
@@ -11450,7 +11396,7 @@
     </w:p>
     <w:p>
       <w:pPr>
-        <w:pStyle w:val="869"/>
+        <w:pStyle w:val="871"/>
         <w:numPr>
           <w:ilvl w:val="0"/>
           <w:numId w:val="10"/>
@@ -11467,7 +11413,7 @@
     </w:p>
     <w:p>
       <w:pPr>
-        <w:pStyle w:val="869"/>
+        <w:pStyle w:val="871"/>
         <w:numPr>
           <w:ilvl w:val="0"/>
           <w:numId w:val="10"/>
@@ -11484,7 +11430,7 @@
     </w:p>
     <w:p>
       <w:pPr>
-        <w:pStyle w:val="869"/>
+        <w:pStyle w:val="871"/>
         <w:numPr>
           <w:ilvl w:val="0"/>
           <w:numId w:val="10"/>
@@ -11501,7 +11447,7 @@
     </w:p>
     <w:p>
       <w:pPr>
-        <w:pStyle w:val="869"/>
+        <w:pStyle w:val="871"/>
         <w:numPr>
           <w:ilvl w:val="0"/>
           <w:numId w:val="10"/>
@@ -11562,7 +11508,7 @@
     </w:p>
     <w:p>
       <w:pPr>
-        <w:pStyle w:val="841"/>
+        <w:pStyle w:val="843"/>
         <w:pBdr/>
         <w:spacing/>
         <w:ind/>
@@ -11635,7 +11581,7 @@
     </w:p>
     <w:p>
       <w:pPr>
-        <w:pStyle w:val="841"/>
+        <w:pStyle w:val="843"/>
         <w:pBdr/>
         <w:spacing/>
         <w:ind/>
@@ -11809,7 +11755,7 @@
     </w:p>
     <w:p>
       <w:pPr>
-        <w:pStyle w:val="841"/>
+        <w:pStyle w:val="843"/>
         <w:pBdr/>
         <w:spacing/>
         <w:ind/>
@@ -11847,7 +11793,7 @@
     </w:p>
     <w:p>
       <w:pPr>
-        <w:pStyle w:val="840"/>
+        <w:pStyle w:val="842"/>
         <w:numPr>
           <w:ilvl w:val="0"/>
           <w:numId w:val="2"/>
@@ -11937,7 +11883,7 @@
     </w:p>
     <w:p>
       <w:pPr>
-        <w:pStyle w:val="840"/>
+        <w:pStyle w:val="842"/>
         <w:numPr>
           <w:ilvl w:val="0"/>
           <w:numId w:val="2"/>
@@ -11993,7 +11939,7 @@
     </w:p>
     <w:p>
       <w:pPr>
-        <w:pStyle w:val="869"/>
+        <w:pStyle w:val="871"/>
         <w:numPr>
           <w:ilvl w:val="0"/>
           <w:numId w:val="16"/>
@@ -12011,7 +11957,7 @@
     </w:p>
     <w:p>
       <w:pPr>
-        <w:pStyle w:val="869"/>
+        <w:pStyle w:val="871"/>
         <w:numPr>
           <w:ilvl w:val="0"/>
           <w:numId w:val="16"/>
@@ -12029,7 +11975,7 @@
     </w:p>
     <w:p>
       <w:pPr>
-        <w:pStyle w:val="869"/>
+        <w:pStyle w:val="871"/>
         <w:numPr>
           <w:ilvl w:val="0"/>
           <w:numId w:val="16"/>
@@ -12071,7 +12017,7 @@
     </w:p>
     <w:p>
       <w:pPr>
-        <w:pStyle w:val="869"/>
+        <w:pStyle w:val="871"/>
         <w:numPr>
           <w:ilvl w:val="0"/>
           <w:numId w:val="16"/>
@@ -12089,7 +12035,7 @@
     </w:p>
     <w:p>
       <w:pPr>
-        <w:pStyle w:val="869"/>
+        <w:pStyle w:val="871"/>
         <w:numPr>
           <w:ilvl w:val="0"/>
           <w:numId w:val="16"/>
@@ -12107,7 +12053,7 @@
     </w:p>
     <w:p>
       <w:pPr>
-        <w:pStyle w:val="869"/>
+        <w:pStyle w:val="871"/>
         <w:numPr>
           <w:ilvl w:val="0"/>
           <w:numId w:val="16"/>
@@ -12186,7 +12132,7 @@
     </w:p>
     <w:p>
       <w:pPr>
-        <w:pStyle w:val="869"/>
+        <w:pStyle w:val="871"/>
         <w:numPr>
           <w:ilvl w:val="0"/>
           <w:numId w:val="4"/>
@@ -12204,7 +12150,7 @@
     </w:p>
     <w:p>
       <w:pPr>
-        <w:pStyle w:val="869"/>
+        <w:pStyle w:val="871"/>
         <w:numPr>
           <w:ilvl w:val="0"/>
           <w:numId w:val="4"/>
@@ -12222,7 +12168,7 @@
     </w:p>
     <w:p>
       <w:pPr>
-        <w:pStyle w:val="869"/>
+        <w:pStyle w:val="871"/>
         <w:numPr>
           <w:ilvl w:val="0"/>
           <w:numId w:val="4"/>
@@ -12264,7 +12210,7 @@
     </w:p>
     <w:p>
       <w:pPr>
-        <w:pStyle w:val="869"/>
+        <w:pStyle w:val="871"/>
         <w:numPr>
           <w:ilvl w:val="0"/>
           <w:numId w:val="7"/>
@@ -12282,7 +12228,7 @@
     </w:p>
     <w:p>
       <w:pPr>
-        <w:pStyle w:val="869"/>
+        <w:pStyle w:val="871"/>
         <w:numPr>
           <w:ilvl w:val="0"/>
           <w:numId w:val="7"/>
@@ -12311,7 +12257,7 @@
     </w:p>
     <w:p>
       <w:pPr>
-        <w:pStyle w:val="840"/>
+        <w:pStyle w:val="842"/>
         <w:numPr>
           <w:ilvl w:val="0"/>
           <w:numId w:val="2"/>
@@ -12434,7 +12380,7 @@
     </w:p>
     <w:p>
       <w:pPr>
-        <w:pStyle w:val="839"/>
+        <w:pStyle w:val="841"/>
         <w:numPr>
           <w:ilvl w:val="0"/>
           <w:numId w:val="13"/>
@@ -13035,7 +12981,7 @@
         </w:tcPr>
         <w:p>
           <w:pPr>
-            <w:pStyle w:val="874"/>
+            <w:pStyle w:val="876"/>
             <w:pBdr/>
             <w:spacing/>
             <w:ind/>
@@ -13077,7 +13023,7 @@
         </w:tcPr>
         <w:p>
           <w:pPr>
-            <w:pStyle w:val="874"/>
+            <w:pStyle w:val="876"/>
             <w:pBdr/>
             <w:spacing/>
             <w:ind/>
@@ -13117,7 +13063,7 @@
               </w:tcPr>
               <w:p>
                 <w:pPr>
-                  <w:pStyle w:val="874"/>
+                  <w:pStyle w:val="876"/>
                   <w:pBdr/>
                   <w:spacing/>
                   <w:ind/>
@@ -13131,7 +13077,7 @@
               </w:p>
               <w:p>
                 <w:pPr>
-                  <w:pStyle w:val="874"/>
+                  <w:pStyle w:val="876"/>
                   <w:pBdr/>
                   <w:spacing/>
                   <w:ind/>
@@ -13151,7 +13097,7 @@
         </w:tbl>
         <w:p>
           <w:pPr>
-            <w:pStyle w:val="874"/>
+            <w:pStyle w:val="876"/>
             <w:pBdr/>
             <w:spacing/>
             <w:ind/>
@@ -13170,7 +13116,7 @@
         </w:tcPr>
         <w:p>
           <w:pPr>
-            <w:pStyle w:val="874"/>
+            <w:pStyle w:val="876"/>
             <w:pBdr/>
             <w:spacing/>
             <w:ind/>
@@ -13219,7 +13165,7 @@
   </w:tbl>
   <w:p>
     <w:pPr>
-      <w:pStyle w:val="874"/>
+      <w:pStyle w:val="876"/>
       <w:pBdr/>
       <w:spacing/>
       <w:ind/>
@@ -13283,7 +13229,7 @@
 <w:hdr xmlns:wpc="http://schemas.microsoft.com/office/word/2010/wordprocessingCanvas" xmlns:mc="http://schemas.openxmlformats.org/markup-compatibility/2006" xmlns:o="urn:schemas-microsoft-com:office:office" xmlns:r="http://schemas.openxmlformats.org/officeDocument/2006/relationships" xmlns:m="http://schemas.openxmlformats.org/officeDocument/2006/math" xmlns:v="urn:schemas-microsoft-com:vml" xmlns:wp14="http://schemas.microsoft.com/office/word/2010/wordprocessingDrawing" xmlns:wp="http://schemas.openxmlformats.org/drawingml/2006/wordprocessingDrawing" xmlns:w10="urn:schemas-microsoft-com:office:word" xmlns:w="http://schemas.openxmlformats.org/wordprocessingml/2006/main" xmlns:w14="http://schemas.microsoft.com/office/word/2010/wordml" xmlns:w15="http://schemas.microsoft.com/office/word/2012/wordml" xmlns:wpg="http://schemas.microsoft.com/office/word/2010/wordprocessingGroup" xmlns:wpi="http://schemas.microsoft.com/office/word/2010/wordprocessingInk" xmlns:wne="http://schemas.microsoft.com/office/word/2006/wordml" xmlns:a="http://schemas.openxmlformats.org/drawingml/2006/main" xmlns:wps="http://schemas.microsoft.com/office/word/2010/wordprocessingShape" mc:Ignorable="w14 w15 wp14">
   <w:p>
     <w:pPr>
-      <w:pStyle w:val="873"/>
+      <w:pStyle w:val="875"/>
       <w:pBdr/>
       <w:spacing/>
       <w:ind/>
@@ -14058,7 +14004,7 @@
         <w:spacing/>
         <w:ind w:firstLine="0" w:left="360"/>
       </w:pPr>
-      <w:pStyle w:val="867"/>
+      <w:pStyle w:val="869"/>
       <w:rPr>
         <w:spacing w:val="0"/>
       </w:rPr>
@@ -17176,7 +17122,7 @@
     <w:lsdException w:name="Bibliography" w:uiPriority="37"/>
     <w:lsdException w:name="TOC Heading" w:uiPriority="39" w:qFormat="1"/>
   </w:latentStyles>
-  <w:style w:type="paragraph" w:styleId="838" w:default="1">
+  <w:style w:type="paragraph" w:styleId="840" w:default="1">
     <w:name w:val="Normal"/>
     <w:qFormat/>
     <w:pPr>
@@ -17188,10 +17134,10 @@
       <w:szCs w:val="22"/>
     </w:rPr>
   </w:style>
-  <w:style w:type="paragraph" w:styleId="839">
+  <w:style w:type="paragraph" w:styleId="841">
     <w:name w:val="Heading 1"/>
-    <w:basedOn w:val="838"/>
-    <w:next w:val="838"/>
+    <w:basedOn w:val="840"/>
+    <w:next w:val="840"/>
     <w:qFormat/>
     <w:pPr>
       <w:widowControl w:val="false"/>
@@ -17216,10 +17162,10 @@
       <w:szCs w:val="24"/>
     </w:rPr>
   </w:style>
-  <w:style w:type="paragraph" w:styleId="840">
+  <w:style w:type="paragraph" w:styleId="842">
     <w:name w:val="Heading 2"/>
-    <w:basedOn w:val="838"/>
-    <w:next w:val="838"/>
+    <w:basedOn w:val="840"/>
+    <w:next w:val="840"/>
     <w:qFormat/>
     <w:pPr>
       <w:widowControl w:val="false"/>
@@ -17244,10 +17190,10 @@
       <w:szCs w:val="24"/>
     </w:rPr>
   </w:style>
-  <w:style w:type="paragraph" w:styleId="841">
+  <w:style w:type="paragraph" w:styleId="843">
     <w:name w:val="Heading 3"/>
-    <w:basedOn w:val="838"/>
-    <w:next w:val="838"/>
+    <w:basedOn w:val="840"/>
+    <w:next w:val="840"/>
     <w:qFormat/>
     <w:pPr>
       <w:keepNext w:val="true"/>
@@ -17270,10 +17216,10 @@
       <w:sz w:val="22"/>
     </w:rPr>
   </w:style>
-  <w:style w:type="paragraph" w:styleId="842">
+  <w:style w:type="paragraph" w:styleId="844">
     <w:name w:val="Heading 4"/>
-    <w:basedOn w:val="838"/>
-    <w:next w:val="838"/>
+    <w:basedOn w:val="840"/>
+    <w:next w:val="840"/>
     <w:qFormat/>
     <w:pPr>
       <w:keepNext w:val="true"/>
@@ -17290,10 +17236,10 @@
       <w:color w:val="0f4761"/>
     </w:rPr>
   </w:style>
-  <w:style w:type="paragraph" w:styleId="843">
+  <w:style w:type="paragraph" w:styleId="845">
     <w:name w:val="Heading 5"/>
-    <w:basedOn w:val="838"/>
-    <w:next w:val="838"/>
+    <w:basedOn w:val="840"/>
+    <w:next w:val="840"/>
     <w:qFormat/>
     <w:pPr>
       <w:keepNext w:val="true"/>
@@ -17308,10 +17254,10 @@
       <w:color w:val="0f4761"/>
     </w:rPr>
   </w:style>
-  <w:style w:type="paragraph" w:styleId="844">
+  <w:style w:type="paragraph" w:styleId="846">
     <w:name w:val="Heading 6"/>
-    <w:basedOn w:val="838"/>
-    <w:next w:val="838"/>
+    <w:basedOn w:val="840"/>
+    <w:next w:val="840"/>
     <w:qFormat/>
     <w:pPr>
       <w:keepNext w:val="true"/>
@@ -17328,10 +17274,10 @@
       <w:color w:val="595959"/>
     </w:rPr>
   </w:style>
-  <w:style w:type="paragraph" w:styleId="845">
+  <w:style w:type="paragraph" w:styleId="847">
     <w:name w:val="Heading 7"/>
-    <w:basedOn w:val="838"/>
-    <w:next w:val="838"/>
+    <w:basedOn w:val="840"/>
+    <w:next w:val="840"/>
     <w:qFormat/>
     <w:pPr>
       <w:keepNext w:val="true"/>
@@ -17348,10 +17294,10 @@
       <w:color w:val="404040"/>
     </w:rPr>
   </w:style>
-  <w:style w:type="paragraph" w:styleId="846">
+  <w:style w:type="paragraph" w:styleId="848">
     <w:name w:val="Heading 8"/>
-    <w:basedOn w:val="838"/>
-    <w:next w:val="838"/>
+    <w:basedOn w:val="840"/>
+    <w:next w:val="840"/>
     <w:qFormat/>
     <w:pPr>
       <w:keepNext w:val="true"/>
@@ -17367,10 +17313,10 @@
       <w:szCs w:val="20"/>
     </w:rPr>
   </w:style>
-  <w:style w:type="paragraph" w:styleId="847">
+  <w:style w:type="paragraph" w:styleId="849">
     <w:name w:val="Heading 9"/>
-    <w:basedOn w:val="838"/>
-    <w:next w:val="838"/>
+    <w:basedOn w:val="840"/>
+    <w:next w:val="840"/>
     <w:qFormat/>
     <w:pPr>
       <w:keepNext w:val="true"/>
@@ -17388,7 +17334,7 @@
       <w:szCs w:val="20"/>
     </w:rPr>
   </w:style>
-  <w:style w:type="character" w:styleId="848" w:default="1">
+  <w:style w:type="character" w:styleId="850" w:default="1">
     <w:name w:val="Default Paragraph Font"/>
     <w:uiPriority w:val="1"/>
     <w:unhideWhenUsed/>
@@ -17398,7 +17344,7 @@
       <w:ind/>
     </w:pPr>
   </w:style>
-  <w:style w:type="table" w:styleId="849" w:default="1">
+  <w:style w:type="table" w:styleId="851" w:default="1">
     <w:name w:val="Normal Table"/>
     <w:uiPriority w:val="99"/>
     <w:semiHidden/>
@@ -17591,7 +17537,7 @@
       </w:tcPr>
     </w:tblStylePr>
   </w:style>
-  <w:style w:type="numbering" w:styleId="850" w:default="1">
+  <w:style w:type="numbering" w:styleId="852" w:default="1">
     <w:name w:val="No List"/>
     <w:uiPriority w:val="99"/>
     <w:semiHidden/>
@@ -17602,10 +17548,10 @@
       <w:ind/>
     </w:pPr>
   </w:style>
-  <w:style w:type="paragraph" w:styleId="851">
+  <w:style w:type="paragraph" w:styleId="853">
     <w:name w:val="Quote"/>
-    <w:basedOn w:val="838"/>
-    <w:next w:val="838"/>
+    <w:basedOn w:val="840"/>
+    <w:next w:val="840"/>
     <w:qFormat/>
     <w:pPr>
       <w:pBdr/>
@@ -17619,10 +17565,10 @@
       <w:color w:val="404040"/>
     </w:rPr>
   </w:style>
-  <w:style w:type="paragraph" w:styleId="852">
+  <w:style w:type="paragraph" w:styleId="854">
     <w:name w:val="Intense Quote"/>
-    <w:basedOn w:val="838"/>
-    <w:next w:val="838"/>
+    <w:basedOn w:val="840"/>
+    <w:next w:val="840"/>
     <w:qFormat/>
     <w:pPr>
       <w:pBdr>
@@ -17642,10 +17588,10 @@
       <w:color w:val="0f4761"/>
     </w:rPr>
   </w:style>
-  <w:style w:type="paragraph" w:styleId="853">
+  <w:style w:type="paragraph" w:styleId="855">
     <w:name w:val="Caption"/>
-    <w:basedOn w:val="838"/>
-    <w:next w:val="838"/>
+    <w:basedOn w:val="840"/>
+    <w:next w:val="840"/>
     <w:qFormat/>
     <w:pPr>
       <w:pBdr/>
@@ -17660,10 +17606,10 @@
       <w:szCs w:val="18"/>
     </w:rPr>
   </w:style>
-  <w:style w:type="paragraph" w:styleId="854">
+  <w:style w:type="paragraph" w:styleId="856">
     <w:name w:val="toc 1"/>
-    <w:basedOn w:val="838"/>
-    <w:next w:val="838"/>
+    <w:basedOn w:val="840"/>
+    <w:next w:val="840"/>
     <w:qFormat/>
     <w:pPr>
       <w:pBdr/>
@@ -17671,10 +17617,10 @@
       <w:ind/>
     </w:pPr>
   </w:style>
-  <w:style w:type="paragraph" w:styleId="855">
+  <w:style w:type="paragraph" w:styleId="857">
     <w:name w:val="toc 2"/>
-    <w:basedOn w:val="838"/>
-    <w:next w:val="838"/>
+    <w:basedOn w:val="840"/>
+    <w:next w:val="840"/>
     <w:qFormat/>
     <w:pPr>
       <w:pBdr/>
@@ -17682,10 +17628,10 @@
       <w:ind w:left="220"/>
     </w:pPr>
   </w:style>
-  <w:style w:type="paragraph" w:styleId="856">
+  <w:style w:type="paragraph" w:styleId="858">
     <w:name w:val="toc 3"/>
-    <w:basedOn w:val="838"/>
-    <w:next w:val="838"/>
+    <w:basedOn w:val="840"/>
+    <w:next w:val="840"/>
     <w:qFormat/>
     <w:pPr>
       <w:pBdr/>
@@ -17693,10 +17639,10 @@
       <w:ind w:left="440"/>
     </w:pPr>
   </w:style>
-  <w:style w:type="paragraph" w:styleId="857">
+  <w:style w:type="paragraph" w:styleId="859">
     <w:name w:val="toc 4"/>
-    <w:basedOn w:val="838"/>
-    <w:next w:val="838"/>
+    <w:basedOn w:val="840"/>
+    <w:next w:val="840"/>
     <w:qFormat/>
     <w:pPr>
       <w:pBdr/>
@@ -17704,10 +17650,10 @@
       <w:ind w:left="660"/>
     </w:pPr>
   </w:style>
-  <w:style w:type="paragraph" w:styleId="858">
+  <w:style w:type="paragraph" w:styleId="860">
     <w:name w:val="toc 5"/>
-    <w:basedOn w:val="838"/>
-    <w:next w:val="838"/>
+    <w:basedOn w:val="840"/>
+    <w:next w:val="840"/>
     <w:qFormat/>
     <w:pPr>
       <w:pBdr/>
@@ -17715,10 +17661,10 @@
       <w:ind w:left="880"/>
     </w:pPr>
   </w:style>
-  <w:style w:type="paragraph" w:styleId="859">
+  <w:style w:type="paragraph" w:styleId="861">
     <w:name w:val="toc 6"/>
-    <w:basedOn w:val="838"/>
-    <w:next w:val="838"/>
+    <w:basedOn w:val="840"/>
+    <w:next w:val="840"/>
     <w:qFormat/>
     <w:pPr>
       <w:pBdr/>
@@ -17726,10 +17672,10 @@
       <w:ind w:left="1100"/>
     </w:pPr>
   </w:style>
-  <w:style w:type="paragraph" w:styleId="860">
+  <w:style w:type="paragraph" w:styleId="862">
     <w:name w:val="toc 7"/>
-    <w:basedOn w:val="838"/>
-    <w:next w:val="838"/>
+    <w:basedOn w:val="840"/>
+    <w:next w:val="840"/>
     <w:qFormat/>
     <w:pPr>
       <w:pBdr/>
@@ -17737,10 +17683,10 @@
       <w:ind w:left="1320"/>
     </w:pPr>
   </w:style>
-  <w:style w:type="paragraph" w:styleId="861">
+  <w:style w:type="paragraph" w:styleId="863">
     <w:name w:val="toc 8"/>
-    <w:basedOn w:val="838"/>
-    <w:next w:val="838"/>
+    <w:basedOn w:val="840"/>
+    <w:next w:val="840"/>
     <w:qFormat/>
     <w:pPr>
       <w:pBdr/>
@@ -17748,10 +17694,10 @@
       <w:ind w:left="1540"/>
     </w:pPr>
   </w:style>
-  <w:style w:type="paragraph" w:styleId="862">
+  <w:style w:type="paragraph" w:styleId="864">
     <w:name w:val="toc 9"/>
-    <w:basedOn w:val="838"/>
-    <w:next w:val="838"/>
+    <w:basedOn w:val="840"/>
+    <w:next w:val="840"/>
     <w:qFormat/>
     <w:pPr>
       <w:pBdr/>
@@ -17759,7 +17705,7 @@
       <w:ind w:left="1760"/>
     </w:pPr>
   </w:style>
-  <w:style w:type="paragraph" w:styleId="863">
+  <w:style w:type="paragraph" w:styleId="865">
     <w:name w:val="TOC Heading"/>
     <w:qFormat/>
     <w:pPr>
@@ -17769,10 +17715,10 @@
       <w:jc w:val="left"/>
     </w:pPr>
   </w:style>
-  <w:style w:type="paragraph" w:styleId="864">
+  <w:style w:type="paragraph" w:styleId="866">
     <w:name w:val="table of figures"/>
-    <w:basedOn w:val="838"/>
-    <w:next w:val="838"/>
+    <w:basedOn w:val="840"/>
+    <w:next w:val="840"/>
     <w:qFormat/>
     <w:pPr>
       <w:pBdr/>
@@ -17780,9 +17726,9 @@
       <w:ind/>
     </w:pPr>
   </w:style>
-  <w:style w:type="paragraph" w:styleId="865">
+  <w:style w:type="paragraph" w:styleId="867">
     <w:name w:val="Body Text 2"/>
-    <w:basedOn w:val="838"/>
+    <w:basedOn w:val="840"/>
     <w:qFormat/>
     <w:pPr>
       <w:widowControl w:val="false"/>
@@ -17794,9 +17740,9 @@
       <w:rFonts w:eastAsia="Times New Roman" w:cs="Arial"/>
     </w:rPr>
   </w:style>
-  <w:style w:type="paragraph" w:styleId="866">
+  <w:style w:type="paragraph" w:styleId="868">
     <w:name w:val="Body Text 3"/>
-    <w:basedOn w:val="838"/>
+    <w:basedOn w:val="840"/>
     <w:qFormat/>
     <w:pPr>
       <w:pBdr/>
@@ -17808,9 +17754,9 @@
       <w:szCs w:val="16"/>
     </w:rPr>
   </w:style>
-  <w:style w:type="paragraph" w:styleId="867" w:customStyle="1">
+  <w:style w:type="paragraph" w:styleId="869" w:customStyle="1">
     <w:name w:val="Titres conditions générales"/>
-    <w:basedOn w:val="838"/>
+    <w:basedOn w:val="840"/>
     <w:qFormat/>
     <w:pPr>
       <w:numPr>
@@ -17826,7 +17772,7 @@
       <w:sz w:val="22"/>
     </w:rPr>
   </w:style>
-  <w:style w:type="paragraph" w:styleId="868">
+  <w:style w:type="paragraph" w:styleId="870">
     <w:name w:val="No Spacing"/>
     <w:qFormat/>
     <w:pPr>
@@ -17841,9 +17787,9 @@
       <w:szCs w:val="22"/>
     </w:rPr>
   </w:style>
-  <w:style w:type="paragraph" w:styleId="869">
+  <w:style w:type="paragraph" w:styleId="871">
     <w:name w:val="List Paragraph"/>
-    <w:basedOn w:val="838"/>
+    <w:basedOn w:val="840"/>
     <w:qFormat/>
     <w:pPr>
       <w:pBdr/>
@@ -17852,9 +17798,9 @@
       <w:contextualSpacing w:val="true"/>
     </w:pPr>
   </w:style>
-  <w:style w:type="paragraph" w:styleId="870" w:customStyle="1">
+  <w:style w:type="paragraph" w:styleId="872" w:customStyle="1">
     <w:name w:val="Annexes - Soustitre"/>
-    <w:basedOn w:val="838"/>
+    <w:basedOn w:val="840"/>
     <w:qFormat/>
     <w:pPr>
       <w:pBdr/>
@@ -17867,10 +17813,10 @@
       <w:color w:val="7f7f7f"/>
     </w:rPr>
   </w:style>
-  <w:style w:type="paragraph" w:styleId="871">
+  <w:style w:type="paragraph" w:styleId="873">
     <w:name w:val="Title"/>
-    <w:basedOn w:val="838"/>
-    <w:next w:val="838"/>
+    <w:basedOn w:val="840"/>
+    <w:next w:val="840"/>
     <w:qFormat/>
     <w:pPr>
       <w:pBdr/>
@@ -17887,10 +17833,10 @@
       <w:szCs w:val="52"/>
     </w:rPr>
   </w:style>
-  <w:style w:type="paragraph" w:styleId="872">
+  <w:style w:type="paragraph" w:styleId="874">
     <w:name w:val="Subtitle"/>
-    <w:basedOn w:val="838"/>
-    <w:next w:val="838"/>
+    <w:basedOn w:val="840"/>
+    <w:next w:val="840"/>
     <w:qFormat/>
     <w:pPr>
       <w:pBdr/>
@@ -17907,9 +17853,9 @@
       <w:szCs w:val="24"/>
     </w:rPr>
   </w:style>
-  <w:style w:type="paragraph" w:styleId="873">
+  <w:style w:type="paragraph" w:styleId="875">
     <w:name w:val="Header"/>
-    <w:basedOn w:val="838"/>
+    <w:basedOn w:val="840"/>
     <w:qFormat/>
     <w:pPr>
       <w:pBdr/>
@@ -17921,9 +17867,9 @@
       <w:ind/>
     </w:pPr>
   </w:style>
-  <w:style w:type="paragraph" w:styleId="874">
+  <w:style w:type="paragraph" w:styleId="876">
     <w:name w:val="Footer"/>
-    <w:basedOn w:val="838"/>
+    <w:basedOn w:val="840"/>
     <w:qFormat/>
     <w:pPr>
       <w:pBdr/>
@@ -17935,9 +17881,9 @@
       <w:ind/>
     </w:pPr>
   </w:style>
-  <w:style w:type="paragraph" w:styleId="875">
+  <w:style w:type="paragraph" w:styleId="877">
     <w:name w:val="Balloon Text"/>
-    <w:basedOn w:val="838"/>
+    <w:basedOn w:val="840"/>
     <w:qFormat/>
     <w:pPr>
       <w:pBdr/>
@@ -17950,9 +17896,9 @@
       <w:szCs w:val="16"/>
     </w:rPr>
   </w:style>
-  <w:style w:type="paragraph" w:styleId="876" w:customStyle="1">
+  <w:style w:type="paragraph" w:styleId="878" w:customStyle="1">
     <w:name w:val="Conditions générales"/>
-    <w:basedOn w:val="838"/>
+    <w:basedOn w:val="840"/>
     <w:qFormat/>
     <w:pPr>
       <w:pBdr/>
@@ -17963,9 +17909,9 @@
       <w:sz w:val="18"/>
     </w:rPr>
   </w:style>
-  <w:style w:type="paragraph" w:styleId="877">
+  <w:style w:type="paragraph" w:styleId="879">
     <w:name w:val="endnote text"/>
-    <w:basedOn w:val="838"/>
+    <w:basedOn w:val="840"/>
     <w:qFormat/>
     <w:pPr>
       <w:pBdr/>
@@ -17976,9 +17922,9 @@
       <w:szCs w:val="20"/>
     </w:rPr>
   </w:style>
-  <w:style w:type="paragraph" w:styleId="878">
+  <w:style w:type="paragraph" w:styleId="880">
     <w:name w:val="footnote text"/>
-    <w:basedOn w:val="838"/>
+    <w:basedOn w:val="840"/>
     <w:qFormat/>
     <w:pPr>
       <w:pBdr/>
@@ -17989,9 +17935,9 @@
       <w:szCs w:val="20"/>
     </w:rPr>
   </w:style>
-  <w:style w:type="paragraph" w:styleId="879" w:customStyle="1">
+  <w:style w:type="paragraph" w:styleId="881" w:customStyle="1">
     <w:name w:val="Commentaire1"/>
-    <w:basedOn w:val="838"/>
+    <w:basedOn w:val="840"/>
     <w:qFormat/>
     <w:pPr>
       <w:pBdr/>
@@ -18002,10 +17948,10 @@
       <w:szCs w:val="20"/>
     </w:rPr>
   </w:style>
-  <w:style w:type="paragraph" w:styleId="880" w:customStyle="1">
+  <w:style w:type="paragraph" w:styleId="882" w:customStyle="1">
     <w:name w:val="Objet du commentaire1"/>
-    <w:basedOn w:val="879"/>
-    <w:next w:val="879"/>
+    <w:basedOn w:val="881"/>
+    <w:next w:val="881"/>
     <w:qFormat/>
     <w:pPr>
       <w:pBdr/>
@@ -18017,7 +17963,7 @@
       <w:bCs/>
     </w:rPr>
   </w:style>
-  <w:style w:type="paragraph" w:styleId="881">
+  <w:style w:type="paragraph" w:styleId="883">
     <w:name w:val="Revision"/>
     <w:qFormat/>
     <w:pPr>
@@ -18030,7 +17976,7 @@
       <w:szCs w:val="22"/>
     </w:rPr>
   </w:style>
-  <w:style w:type="paragraph" w:styleId="882" w:customStyle="1">
+  <w:style w:type="paragraph" w:styleId="884" w:customStyle="1">
     <w:name w:val="Default"/>
     <w:qFormat/>
     <w:pPr>
@@ -18046,9 +17992,9 @@
       <w:szCs w:val="24"/>
     </w:rPr>
   </w:style>
-  <w:style w:type="character" w:styleId="883" w:customStyle="1">
+  <w:style w:type="character" w:styleId="885" w:customStyle="1">
     <w:name w:val="Heading 1 Char"/>
-    <w:basedOn w:val="848"/>
+    <w:basedOn w:val="850"/>
     <w:pPr>
       <w:pBdr/>
       <w:spacing/>
@@ -18061,9 +18007,9 @@
       <w:szCs w:val="40"/>
     </w:rPr>
   </w:style>
-  <w:style w:type="character" w:styleId="884" w:customStyle="1">
+  <w:style w:type="character" w:styleId="886" w:customStyle="1">
     <w:name w:val="Heading 2 Char"/>
-    <w:basedOn w:val="848"/>
+    <w:basedOn w:val="850"/>
     <w:pPr>
       <w:pBdr/>
       <w:spacing/>
@@ -18076,9 +18022,9 @@
       <w:szCs w:val="32"/>
     </w:rPr>
   </w:style>
-  <w:style w:type="character" w:styleId="885" w:customStyle="1">
+  <w:style w:type="character" w:styleId="887" w:customStyle="1">
     <w:name w:val="Heading 3 Char"/>
-    <w:basedOn w:val="848"/>
+    <w:basedOn w:val="850"/>
     <w:pPr>
       <w:pBdr/>
       <w:spacing/>
@@ -18091,9 +18037,9 @@
       <w:szCs w:val="28"/>
     </w:rPr>
   </w:style>
-  <w:style w:type="character" w:styleId="886" w:customStyle="1">
+  <w:style w:type="character" w:styleId="888" w:customStyle="1">
     <w:name w:val="Heading 4 Char"/>
-    <w:basedOn w:val="848"/>
+    <w:basedOn w:val="850"/>
     <w:pPr>
       <w:pBdr/>
       <w:spacing/>
@@ -18106,9 +18052,9 @@
       <w:color w:val="0f4761"/>
     </w:rPr>
   </w:style>
-  <w:style w:type="character" w:styleId="887" w:customStyle="1">
+  <w:style w:type="character" w:styleId="889" w:customStyle="1">
     <w:name w:val="Heading 5 Char"/>
-    <w:basedOn w:val="848"/>
+    <w:basedOn w:val="850"/>
     <w:pPr>
       <w:pBdr/>
       <w:spacing/>
@@ -18119,9 +18065,9 @@
       <w:color w:val="0f4761"/>
     </w:rPr>
   </w:style>
-  <w:style w:type="character" w:styleId="888" w:customStyle="1">
+  <w:style w:type="character" w:styleId="890" w:customStyle="1">
     <w:name w:val="Heading 6 Char"/>
-    <w:basedOn w:val="848"/>
+    <w:basedOn w:val="850"/>
     <w:pPr>
       <w:pBdr/>
       <w:spacing/>
@@ -18134,9 +18080,9 @@
       <w:color w:val="595959"/>
     </w:rPr>
   </w:style>
-  <w:style w:type="character" w:styleId="889" w:customStyle="1">
+  <w:style w:type="character" w:styleId="891" w:customStyle="1">
     <w:name w:val="Heading 7 Char"/>
-    <w:basedOn w:val="848"/>
+    <w:basedOn w:val="850"/>
     <w:pPr>
       <w:pBdr/>
       <w:spacing/>
@@ -18147,9 +18093,9 @@
       <w:color w:val="595959"/>
     </w:rPr>
   </w:style>
-  <w:style w:type="character" w:styleId="890" w:customStyle="1">
+  <w:style w:type="character" w:styleId="892" w:customStyle="1">
     <w:name w:val="Heading 8 Char"/>
-    <w:basedOn w:val="848"/>
+    <w:basedOn w:val="850"/>
     <w:pPr>
       <w:pBdr/>
       <w:spacing/>
@@ -18162,9 +18108,9 @@
       <w:color w:val="272727"/>
     </w:rPr>
   </w:style>
-  <w:style w:type="character" w:styleId="891" w:customStyle="1">
+  <w:style w:type="character" w:styleId="893" w:customStyle="1">
     <w:name w:val="Heading 9 Char"/>
-    <w:basedOn w:val="848"/>
+    <w:basedOn w:val="850"/>
     <w:pPr>
       <w:pBdr/>
       <w:spacing/>
@@ -18177,9 +18123,9 @@
       <w:color w:val="272727"/>
     </w:rPr>
   </w:style>
-  <w:style w:type="character" w:styleId="892" w:customStyle="1">
+  <w:style w:type="character" w:styleId="894" w:customStyle="1">
     <w:name w:val="Title Char"/>
-    <w:basedOn w:val="848"/>
+    <w:basedOn w:val="850"/>
     <w:pPr>
       <w:pBdr/>
       <w:spacing/>
@@ -18192,9 +18138,9 @@
       <w:szCs w:val="56"/>
     </w:rPr>
   </w:style>
-  <w:style w:type="character" w:styleId="893" w:customStyle="1">
+  <w:style w:type="character" w:styleId="895" w:customStyle="1">
     <w:name w:val="Subtitle Char"/>
-    <w:basedOn w:val="848"/>
+    <w:basedOn w:val="850"/>
     <w:pPr>
       <w:pBdr/>
       <w:spacing/>
@@ -18207,9 +18153,9 @@
       <w:szCs w:val="28"/>
     </w:rPr>
   </w:style>
-  <w:style w:type="character" w:styleId="894" w:customStyle="1">
+  <w:style w:type="character" w:styleId="896" w:customStyle="1">
     <w:name w:val="Quote Char"/>
-    <w:basedOn w:val="848"/>
+    <w:basedOn w:val="850"/>
     <w:pPr>
       <w:pBdr/>
       <w:spacing/>
@@ -18221,9 +18167,9 @@
       <w:color w:val="404040"/>
     </w:rPr>
   </w:style>
-  <w:style w:type="character" w:styleId="895">
+  <w:style w:type="character" w:styleId="897">
     <w:name w:val="Intense Emphasis"/>
-    <w:basedOn w:val="848"/>
+    <w:basedOn w:val="850"/>
     <w:pPr>
       <w:pBdr/>
       <w:spacing/>
@@ -18235,9 +18181,9 @@
       <w:color w:val="0f4761"/>
     </w:rPr>
   </w:style>
-  <w:style w:type="character" w:styleId="896" w:customStyle="1">
+  <w:style w:type="character" w:styleId="898" w:customStyle="1">
     <w:name w:val="Intense Quote Char"/>
-    <w:basedOn w:val="848"/>
+    <w:basedOn w:val="850"/>
     <w:pPr>
       <w:pBdr/>
       <w:spacing/>
@@ -18249,9 +18195,9 @@
       <w:color w:val="0f4761"/>
     </w:rPr>
   </w:style>
-  <w:style w:type="character" w:styleId="897">
+  <w:style w:type="character" w:styleId="899">
     <w:name w:val="Intense Reference"/>
-    <w:basedOn w:val="848"/>
+    <w:basedOn w:val="850"/>
     <w:pPr>
       <w:pBdr/>
       <w:spacing/>
@@ -18265,9 +18211,9 @@
       <w:spacing w:val="0"/>
     </w:rPr>
   </w:style>
-  <w:style w:type="character" w:styleId="898">
+  <w:style w:type="character" w:styleId="900">
     <w:name w:val="Subtle Emphasis"/>
-    <w:basedOn w:val="848"/>
+    <w:basedOn w:val="850"/>
     <w:pPr>
       <w:pBdr/>
       <w:spacing/>
@@ -18279,9 +18225,9 @@
       <w:color w:val="404040"/>
     </w:rPr>
   </w:style>
-  <w:style w:type="character" w:styleId="899">
+  <w:style w:type="character" w:styleId="901">
     <w:name w:val="Emphasis"/>
-    <w:basedOn w:val="848"/>
+    <w:basedOn w:val="850"/>
     <w:pPr>
       <w:pBdr/>
       <w:spacing/>
@@ -18292,9 +18238,9 @@
       <w:iCs/>
     </w:rPr>
   </w:style>
-  <w:style w:type="character" w:styleId="900">
+  <w:style w:type="character" w:styleId="902">
     <w:name w:val="Strong"/>
-    <w:basedOn w:val="848"/>
+    <w:basedOn w:val="850"/>
     <w:pPr>
       <w:pBdr/>
       <w:spacing/>
@@ -18305,9 +18251,9 @@
       <w:bCs/>
     </w:rPr>
   </w:style>
-  <w:style w:type="character" w:styleId="901">
+  <w:style w:type="character" w:styleId="903">
     <w:name w:val="Subtle Reference"/>
-    <w:basedOn w:val="848"/>
+    <w:basedOn w:val="850"/>
     <w:pPr>
       <w:pBdr/>
       <w:spacing/>
@@ -18318,9 +18264,9 @@
       <w:color w:val="5a5a5a"/>
     </w:rPr>
   </w:style>
-  <w:style w:type="character" w:styleId="902">
+  <w:style w:type="character" w:styleId="904">
     <w:name w:val="Book Title"/>
-    <w:basedOn w:val="848"/>
+    <w:basedOn w:val="850"/>
     <w:pPr>
       <w:pBdr/>
       <w:spacing/>
@@ -18334,27 +18280,27 @@
       <w:spacing w:val="0"/>
     </w:rPr>
   </w:style>
-  <w:style w:type="character" w:styleId="903" w:customStyle="1">
+  <w:style w:type="character" w:styleId="905" w:customStyle="1">
     <w:name w:val="Header Char"/>
-    <w:basedOn w:val="848"/>
+    <w:basedOn w:val="850"/>
     <w:pPr>
       <w:pBdr/>
       <w:spacing/>
       <w:ind/>
     </w:pPr>
   </w:style>
-  <w:style w:type="character" w:styleId="904" w:customStyle="1">
+  <w:style w:type="character" w:styleId="906" w:customStyle="1">
     <w:name w:val="Footer Char"/>
-    <w:basedOn w:val="848"/>
+    <w:basedOn w:val="850"/>
     <w:pPr>
       <w:pBdr/>
       <w:spacing/>
       <w:ind/>
     </w:pPr>
   </w:style>
-  <w:style w:type="character" w:styleId="905" w:customStyle="1">
+  <w:style w:type="character" w:styleId="907" w:customStyle="1">
     <w:name w:val="Footnote Text Char"/>
-    <w:basedOn w:val="848"/>
+    <w:basedOn w:val="850"/>
     <w:pPr>
       <w:pBdr/>
       <w:spacing/>
@@ -18365,9 +18311,9 @@
       <w:szCs w:val="20"/>
     </w:rPr>
   </w:style>
-  <w:style w:type="character" w:styleId="906" w:customStyle="1">
+  <w:style w:type="character" w:styleId="908" w:customStyle="1">
     <w:name w:val="Endnote Text Char"/>
-    <w:basedOn w:val="848"/>
+    <w:basedOn w:val="850"/>
     <w:pPr>
       <w:pBdr/>
       <w:spacing/>
@@ -18378,9 +18324,9 @@
       <w:szCs w:val="20"/>
     </w:rPr>
   </w:style>
-  <w:style w:type="character" w:styleId="907">
+  <w:style w:type="character" w:styleId="909">
     <w:name w:val="FollowedHyperlink"/>
-    <w:basedOn w:val="848"/>
+    <w:basedOn w:val="850"/>
     <w:pPr>
       <w:pBdr/>
       <w:spacing/>
@@ -18391,7 +18337,7 @@
       <w:u w:val="single"/>
     </w:rPr>
   </w:style>
-  <w:style w:type="character" w:styleId="908" w:customStyle="1">
+  <w:style w:type="character" w:styleId="910" w:customStyle="1">
     <w:name w:val="Titre 1 Car"/>
     <w:pPr>
       <w:pBdr/>
@@ -18407,7 +18353,7 @@
       <w:shd w:val="clear" w:color="auto" w:fill="ffffff"/>
     </w:rPr>
   </w:style>
-  <w:style w:type="character" w:styleId="909" w:customStyle="1">
+  <w:style w:type="character" w:styleId="911" w:customStyle="1">
     <w:name w:val="Titre 2 Car"/>
     <w:pPr>
       <w:pBdr/>
@@ -18424,7 +18370,7 @@
       <w:shd w:val="clear" w:color="auto" w:fill="808080"/>
     </w:rPr>
   </w:style>
-  <w:style w:type="character" w:styleId="910" w:customStyle="1">
+  <w:style w:type="character" w:styleId="912" w:customStyle="1">
     <w:name w:val="Corps de texte 2 Car"/>
     <w:pPr>
       <w:pBdr/>
@@ -18435,7 +18381,7 @@
       <w:rFonts w:ascii="Arial" w:hAnsi="Arial" w:eastAsia="Times New Roman" w:cs="Arial"/>
     </w:rPr>
   </w:style>
-  <w:style w:type="character" w:styleId="911" w:customStyle="1">
+  <w:style w:type="character" w:styleId="913" w:customStyle="1">
     <w:name w:val="Titre 9 Car"/>
     <w:pPr>
       <w:pBdr/>
@@ -18451,7 +18397,7 @@
       <w:szCs w:val="20"/>
     </w:rPr>
   </w:style>
-  <w:style w:type="character" w:styleId="912" w:customStyle="1">
+  <w:style w:type="character" w:styleId="914" w:customStyle="1">
     <w:name w:val="Corps de texte 3 Car"/>
     <w:pPr>
       <w:pBdr/>
@@ -18463,7 +18409,7 @@
       <w:szCs w:val="16"/>
     </w:rPr>
   </w:style>
-  <w:style w:type="character" w:styleId="913" w:customStyle="1">
+  <w:style w:type="character" w:styleId="915" w:customStyle="1">
     <w:name w:val="Titre 7 Car"/>
     <w:pPr>
       <w:pBdr/>
@@ -18477,7 +18423,7 @@
       <w:color w:val="404040"/>
     </w:rPr>
   </w:style>
-  <w:style w:type="character" w:styleId="914" w:customStyle="1">
+  <w:style w:type="character" w:styleId="916" w:customStyle="1">
     <w:name w:val="Titre 8 Car"/>
     <w:pPr>
       <w:pBdr/>
@@ -18491,7 +18437,7 @@
       <w:szCs w:val="20"/>
     </w:rPr>
   </w:style>
-  <w:style w:type="character" w:styleId="915" w:customStyle="1">
+  <w:style w:type="character" w:styleId="917" w:customStyle="1">
     <w:name w:val="Titres conditions générales Car"/>
     <w:pPr>
       <w:pBdr/>
@@ -18505,7 +18451,7 @@
       <w:szCs w:val="22"/>
     </w:rPr>
   </w:style>
-  <w:style w:type="character" w:styleId="916" w:customStyle="1">
+  <w:style w:type="character" w:styleId="918" w:customStyle="1">
     <w:name w:val="Titre 3 Car"/>
     <w:pPr>
       <w:pBdr/>
@@ -18518,7 +18464,7 @@
       <w:bCs/>
     </w:rPr>
   </w:style>
-  <w:style w:type="character" w:styleId="917" w:customStyle="1">
+  <w:style w:type="character" w:styleId="919" w:customStyle="1">
     <w:name w:val="Annexes - Soustitre Car"/>
     <w:pPr>
       <w:pBdr/>
@@ -18532,7 +18478,7 @@
       <w:sz w:val="20"/>
     </w:rPr>
   </w:style>
-  <w:style w:type="character" w:styleId="918" w:customStyle="1">
+  <w:style w:type="character" w:styleId="920" w:customStyle="1">
     <w:name w:val="Titre Car"/>
     <w:pPr>
       <w:pBdr/>
@@ -18547,7 +18493,7 @@
       <w:szCs w:val="52"/>
     </w:rPr>
   </w:style>
-  <w:style w:type="character" w:styleId="919" w:customStyle="1">
+  <w:style w:type="character" w:styleId="921" w:customStyle="1">
     <w:name w:val="Sous-titre Car"/>
     <w:pPr>
       <w:pBdr/>
@@ -18564,7 +18510,7 @@
       <w:szCs w:val="24"/>
     </w:rPr>
   </w:style>
-  <w:style w:type="character" w:styleId="920" w:customStyle="1">
+  <w:style w:type="character" w:styleId="922" w:customStyle="1">
     <w:name w:val="En-tête Car"/>
     <w:pPr>
       <w:pBdr/>
@@ -18575,7 +18521,7 @@
       <w:sz w:val="20"/>
     </w:rPr>
   </w:style>
-  <w:style w:type="character" w:styleId="921" w:customStyle="1">
+  <w:style w:type="character" w:styleId="923" w:customStyle="1">
     <w:name w:val="Pied de page Car"/>
     <w:pPr>
       <w:pBdr/>
@@ -18586,7 +18532,7 @@
       <w:sz w:val="20"/>
     </w:rPr>
   </w:style>
-  <w:style w:type="character" w:styleId="922" w:customStyle="1">
+  <w:style w:type="character" w:styleId="924" w:customStyle="1">
     <w:name w:val="Texte de bulles Car"/>
     <w:pPr>
       <w:pBdr/>
@@ -18599,7 +18545,7 @@
       <w:szCs w:val="16"/>
     </w:rPr>
   </w:style>
-  <w:style w:type="character" w:styleId="923">
+  <w:style w:type="character" w:styleId="925">
     <w:name w:val="Hyperlink"/>
     <w:pPr>
       <w:pBdr/>
@@ -18611,7 +18557,7 @@
       <w:u w:val="single"/>
     </w:rPr>
   </w:style>
-  <w:style w:type="character" w:styleId="924">
+  <w:style w:type="character" w:styleId="926">
     <w:name w:val="Placeholder Text"/>
     <w:pPr>
       <w:pBdr/>
@@ -18622,7 +18568,7 @@
       <w:color w:val="808080"/>
     </w:rPr>
   </w:style>
-  <w:style w:type="character" w:styleId="925" w:customStyle="1">
+  <w:style w:type="character" w:styleId="927" w:customStyle="1">
     <w:name w:val="Conditions générales Car"/>
     <w:pPr>
       <w:pBdr/>
@@ -18633,7 +18579,7 @@
       <w:sz w:val="18"/>
     </w:rPr>
   </w:style>
-  <w:style w:type="character" w:styleId="926" w:customStyle="1">
+  <w:style w:type="character" w:styleId="928" w:customStyle="1">
     <w:name w:val="Note de fin Car"/>
     <w:pPr>
       <w:pBdr/>
@@ -18641,7 +18587,7 @@
       <w:ind/>
     </w:pPr>
   </w:style>
-  <w:style w:type="character" w:styleId="927">
+  <w:style w:type="character" w:styleId="929">
     <w:name w:val="endnote reference"/>
     <w:pPr>
       <w:pBdr/>
@@ -18652,7 +18598,7 @@
       <w:vertAlign w:val="superscript"/>
     </w:rPr>
   </w:style>
-  <w:style w:type="character" w:styleId="928" w:customStyle="1">
+  <w:style w:type="character" w:styleId="930" w:customStyle="1">
     <w:name w:val="Note de bas de page Car"/>
     <w:pPr>
       <w:pBdr/>
@@ -18660,7 +18606,7 @@
       <w:ind/>
     </w:pPr>
   </w:style>
-  <w:style w:type="character" w:styleId="929">
+  <w:style w:type="character" w:styleId="931">
     <w:name w:val="footnote reference"/>
     <w:pPr>
       <w:pBdr/>
@@ -18671,7 +18617,7 @@
       <w:vertAlign w:val="superscript"/>
     </w:rPr>
   </w:style>
-  <w:style w:type="character" w:styleId="930" w:customStyle="1">
+  <w:style w:type="character" w:styleId="932" w:customStyle="1">
     <w:name w:val="Marque de commentaire1"/>
     <w:pPr>
       <w:pBdr/>
@@ -18683,7 +18629,7 @@
       <w:szCs w:val="16"/>
     </w:rPr>
   </w:style>
-  <w:style w:type="character" w:styleId="931" w:customStyle="1">
+  <w:style w:type="character" w:styleId="933" w:customStyle="1">
     <w:name w:val="Commentaire Car"/>
     <w:pPr>
       <w:pBdr/>
@@ -18691,7 +18637,7 @@
       <w:ind/>
     </w:pPr>
   </w:style>
-  <w:style w:type="character" w:styleId="932" w:customStyle="1">
+  <w:style w:type="character" w:styleId="934" w:customStyle="1">
     <w:name w:val="Objet du commentaire Car"/>
     <w:pPr>
       <w:pBdr/>
@@ -18703,16 +18649,16 @@
       <w:bCs/>
     </w:rPr>
   </w:style>
-  <w:style w:type="character" w:styleId="933" w:customStyle="1">
+  <w:style w:type="character" w:styleId="935" w:customStyle="1">
     <w:name w:val="mr-3"/>
-    <w:basedOn w:val="848"/>
+    <w:basedOn w:val="850"/>
     <w:pPr>
       <w:pBdr/>
       <w:spacing/>
       <w:ind/>
     </w:pPr>
   </w:style>
-  <w:style w:type="character" w:styleId="934" w:customStyle="1">
+  <w:style w:type="character" w:styleId="936" w:customStyle="1">
     <w:name w:val="Mention non résolue1"/>
     <w:pPr>
       <w:pBdr/>
@@ -18724,7 +18670,7 @@
       <w:shd w:val="clear" w:color="auto" w:fill="e1dfdd"/>
     </w:rPr>
   </w:style>
-  <w:style w:type="table" w:styleId="935" w:customStyle="1">
+  <w:style w:type="table" w:styleId="937" w:customStyle="1">
     <w:name w:val="Tableau normal"/>
     <w:uiPriority w:val="99"/>
     <w:semiHidden/>
@@ -18919,9 +18865,9 @@
       </w:tcPr>
     </w:tblStylePr>
   </w:style>
-  <w:style w:type="table" w:styleId="936" w:customStyle="1">
+  <w:style w:type="table" w:styleId="938" w:customStyle="1">
     <w:name w:val="Table Grid Light"/>
-    <w:basedOn w:val="849"/>
+    <w:basedOn w:val="851"/>
     <w:pPr>
       <w:pBdr/>
       <w:spacing/>
@@ -19110,9 +19056,9 @@
       </w:tcPr>
     </w:tblStylePr>
   </w:style>
-  <w:style w:type="table" w:styleId="937">
+  <w:style w:type="table" w:styleId="939">
     <w:name w:val="Plain Table 1"/>
-    <w:basedOn w:val="849"/>
+    <w:basedOn w:val="851"/>
     <w:uiPriority w:val="41"/>
     <w:pPr>
       <w:pBdr/>
@@ -19356,9 +19302,9 @@
       </w:tcPr>
     </w:tblStylePr>
   </w:style>
-  <w:style w:type="table" w:styleId="938">
+  <w:style w:type="table" w:styleId="940">
     <w:name w:val="Plain Table 2"/>
-    <w:basedOn w:val="849"/>
+    <w:basedOn w:val="851"/>
     <w:uiPriority w:val="42"/>
     <w:pPr>
       <w:pBdr/>
@@ -19608,9 +19554,9 @@
       </w:tcPr>
     </w:tblStylePr>
   </w:style>
-  <w:style w:type="table" w:styleId="939">
+  <w:style w:type="table" w:styleId="941">
     <w:name w:val="Plain Table 3"/>
-    <w:basedOn w:val="849"/>
+    <w:basedOn w:val="851"/>
     <w:uiPriority w:val="43"/>
     <w:pPr>
       <w:pBdr/>
@@ -19873,9 +19819,9 @@
       </w:tcPr>
     </w:tblStylePr>
   </w:style>
-  <w:style w:type="table" w:styleId="940">
+  <w:style w:type="table" w:styleId="942">
     <w:name w:val="Plain Table 4"/>
-    <w:basedOn w:val="849"/>
+    <w:basedOn w:val="851"/>
     <w:uiPriority w:val="44"/>
     <w:pPr>
       <w:pBdr/>
@@ -20130,9 +20076,9 @@
       </w:tcPr>
     </w:tblStylePr>
   </w:style>
-  <w:style w:type="table" w:styleId="941">
+  <w:style w:type="table" w:styleId="943">
     <w:name w:val="Plain Table 5"/>
-    <w:basedOn w:val="849"/>
+    <w:basedOn w:val="851"/>
     <w:uiPriority w:val="45"/>
     <w:pPr>
       <w:pBdr/>
@@ -20400,9 +20346,9 @@
       </w:tcPr>
     </w:tblStylePr>
   </w:style>
-  <w:style w:type="table" w:styleId="942">
+  <w:style w:type="table" w:styleId="944">
     <w:name w:val="Grid Table 1 Light"/>
-    <w:basedOn w:val="849"/>
+    <w:basedOn w:val="851"/>
     <w:uiPriority w:val="46"/>
     <w:pPr>
       <w:pBdr/>
@@ -20657,9 +20603,9 @@
       </w:tcPr>
     </w:tblStylePr>
   </w:style>
-  <w:style w:type="table" w:styleId="943" w:customStyle="1">
+  <w:style w:type="table" w:styleId="945" w:customStyle="1">
     <w:name w:val="Grid Table 1 Light - Accent 1"/>
-    <w:basedOn w:val="849"/>
+    <w:basedOn w:val="851"/>
     <w:pPr>
       <w:pBdr/>
       <w:spacing/>
@@ -20913,9 +20859,9 @@
       </w:tcPr>
     </w:tblStylePr>
   </w:style>
-  <w:style w:type="table" w:styleId="944" w:customStyle="1">
+  <w:style w:type="table" w:styleId="946" w:customStyle="1">
     <w:name w:val="Grid Table 1 Light - Accent 2"/>
-    <w:basedOn w:val="849"/>
+    <w:basedOn w:val="851"/>
     <w:pPr>
       <w:pBdr/>
       <w:spacing/>
@@ -21169,9 +21115,9 @@
       </w:tcPr>
     </w:tblStylePr>
   </w:style>
-  <w:style w:type="table" w:styleId="945" w:customStyle="1">
+  <w:style w:type="table" w:styleId="947" w:customStyle="1">
     <w:name w:val="Grid Table 1 Light - Accent 3"/>
-    <w:basedOn w:val="849"/>
+    <w:basedOn w:val="851"/>
     <w:pPr>
       <w:pBdr/>
       <w:spacing/>
@@ -21425,9 +21371,9 @@
       </w:tcPr>
     </w:tblStylePr>
   </w:style>
-  <w:style w:type="table" w:styleId="946" w:customStyle="1">
+  <w:style w:type="table" w:styleId="948" w:customStyle="1">
     <w:name w:val="Grid Table 1 Light - Accent 4"/>
-    <w:basedOn w:val="849"/>
+    <w:basedOn w:val="851"/>
     <w:pPr>
       <w:pBdr/>
       <w:spacing/>
@@ -21681,9 +21627,9 @@
       </w:tcPr>
     </w:tblStylePr>
   </w:style>
-  <w:style w:type="table" w:styleId="947" w:customStyle="1">
+  <w:style w:type="table" w:styleId="949" w:customStyle="1">
     <w:name w:val="Grid Table 1 Light - Accent 5"/>
-    <w:basedOn w:val="849"/>
+    <w:basedOn w:val="851"/>
     <w:pPr>
       <w:pBdr/>
       <w:spacing/>
@@ -21937,9 +21883,9 @@
       </w:tcPr>
     </w:tblStylePr>
   </w:style>
-  <w:style w:type="table" w:styleId="948" w:customStyle="1">
+  <w:style w:type="table" w:styleId="950" w:customStyle="1">
     <w:name w:val="Grid Table 1 Light - Accent 6"/>
-    <w:basedOn w:val="849"/>
+    <w:basedOn w:val="851"/>
     <w:pPr>
       <w:pBdr/>
       <w:spacing/>
@@ -22193,9 +22139,9 @@
       </w:tcPr>
     </w:tblStylePr>
   </w:style>
-  <w:style w:type="table" w:styleId="949">
+  <w:style w:type="table" w:styleId="951">
     <w:name w:val="Grid Table 2"/>
-    <w:basedOn w:val="849"/>
+    <w:basedOn w:val="851"/>
     <w:uiPriority w:val="47"/>
     <w:pPr>
       <w:pBdr/>
@@ -22460,9 +22406,9 @@
       </w:tcPr>
     </w:tblStylePr>
   </w:style>
-  <w:style w:type="table" w:styleId="950" w:customStyle="1">
+  <w:style w:type="table" w:styleId="952" w:customStyle="1">
     <w:name w:val="Grid Table 2 - Accent 1"/>
-    <w:basedOn w:val="849"/>
+    <w:basedOn w:val="851"/>
     <w:pPr>
       <w:pBdr/>
       <w:spacing/>
@@ -22726,9 +22672,9 @@
       </w:tcPr>
     </w:tblStylePr>
   </w:style>
-  <w:style w:type="table" w:styleId="951" w:customStyle="1">
+  <w:style w:type="table" w:styleId="953" w:customStyle="1">
     <w:name w:val="Grid Table 2 - Accent 2"/>
-    <w:basedOn w:val="849"/>
+    <w:basedOn w:val="851"/>
     <w:pPr>
       <w:pBdr/>
       <w:spacing/>
@@ -22992,9 +22938,9 @@
       </w:tcPr>
     </w:tblStylePr>
   </w:style>
-  <w:style w:type="table" w:styleId="952" w:customStyle="1">
+  <w:style w:type="table" w:styleId="954" w:customStyle="1">
     <w:name w:val="Grid Table 2 - Accent 3"/>
-    <w:basedOn w:val="849"/>
+    <w:basedOn w:val="851"/>
     <w:pPr>
       <w:pBdr/>
       <w:spacing/>
@@ -23258,9 +23204,9 @@
       </w:tcPr>
     </w:tblStylePr>
   </w:style>
-  <w:style w:type="table" w:styleId="953" w:customStyle="1">
+  <w:style w:type="table" w:styleId="955" w:customStyle="1">
     <w:name w:val="Grid Table 2 - Accent 4"/>
-    <w:basedOn w:val="849"/>
+    <w:basedOn w:val="851"/>
     <w:pPr>
       <w:pBdr/>
       <w:spacing/>
@@ -23524,9 +23470,9 @@
       </w:tcPr>
     </w:tblStylePr>
   </w:style>
-  <w:style w:type="table" w:styleId="954" w:customStyle="1">
+  <w:style w:type="table" w:styleId="956" w:customStyle="1">
     <w:name w:val="Grid Table 2 - Accent 5"/>
-    <w:basedOn w:val="849"/>
+    <w:basedOn w:val="851"/>
     <w:pPr>
       <w:pBdr/>
       <w:spacing/>
@@ -23790,9 +23736,9 @@
       </w:tcPr>
     </w:tblStylePr>
   </w:style>
-  <w:style w:type="table" w:styleId="955" w:customStyle="1">
+  <w:style w:type="table" w:styleId="957" w:customStyle="1">
     <w:name w:val="Grid Table 2 - Accent 6"/>
-    <w:basedOn w:val="849"/>
+    <w:basedOn w:val="851"/>
     <w:pPr>
       <w:pBdr/>
       <w:spacing/>
@@ -24056,9 +24002,9 @@
       </w:tcPr>
     </w:tblStylePr>
   </w:style>
-  <w:style w:type="table" w:styleId="956">
+  <w:style w:type="table" w:styleId="958">
     <w:name w:val="Grid Table 3"/>
-    <w:basedOn w:val="849"/>
+    <w:basedOn w:val="851"/>
     <w:uiPriority w:val="48"/>
     <w:pPr>
       <w:pBdr/>
@@ -24322,9 +24268,9 @@
       </w:tcPr>
     </w:tblStylePr>
   </w:style>
-  <w:style w:type="table" w:styleId="957" w:customStyle="1">
+  <w:style w:type="table" w:styleId="959" w:customStyle="1">
     <w:name w:val="Grid Table 3 - Accent 1"/>
-    <w:basedOn w:val="849"/>
+    <w:basedOn w:val="851"/>
     <w:pPr>
       <w:pBdr/>
       <w:spacing/>
@@ -24587,9 +24533,9 @@
       </w:tcPr>
     </w:tblStylePr>
   </w:style>
-  <w:style w:type="table" w:styleId="958" w:customStyle="1">
+  <w:style w:type="table" w:styleId="960" w:customStyle="1">
     <w:name w:val="Grid Table 3 - Accent 2"/>
-    <w:basedOn w:val="849"/>
+    <w:basedOn w:val="851"/>
     <w:pPr>
       <w:pBdr/>
       <w:spacing/>
@@ -24852,9 +24798,9 @@
       </w:tcPr>
     </w:tblStylePr>
   </w:style>
-  <w:style w:type="table" w:styleId="959" w:customStyle="1">
+  <w:style w:type="table" w:styleId="961" w:customStyle="1">
     <w:name w:val="Grid Table 3 - Accent 3"/>
-    <w:basedOn w:val="849"/>
+    <w:basedOn w:val="851"/>
     <w:pPr>
       <w:pBdr/>
       <w:spacing/>
@@ -25117,9 +25063,9 @@
       </w:tcPr>
     </w:tblStylePr>
   </w:style>
-  <w:style w:type="table" w:styleId="960" w:customStyle="1">
+  <w:style w:type="table" w:styleId="962" w:customStyle="1">
     <w:name w:val="Grid Table 3 - Accent 4"/>
-    <w:basedOn w:val="849"/>
+    <w:basedOn w:val="851"/>
     <w:pPr>
       <w:pBdr/>
       <w:spacing/>
@@ -25382,9 +25328,9 @@
       </w:tcPr>
     </w:tblStylePr>
   </w:style>
-  <w:style w:type="table" w:styleId="961" w:customStyle="1">
+  <w:style w:type="table" w:styleId="963" w:customStyle="1">
     <w:name w:val="Grid Table 3 - Accent 5"/>
-    <w:basedOn w:val="849"/>
+    <w:basedOn w:val="851"/>
     <w:pPr>
       <w:pBdr/>
       <w:spacing/>
@@ -25647,9 +25593,9 @@
       </w:tcPr>
     </w:tblStylePr>
   </w:style>
-  <w:style w:type="table" w:styleId="962" w:customStyle="1">
+  <w:style w:type="table" w:styleId="964" w:customStyle="1">
     <w:name w:val="Grid Table 3 - Accent 6"/>
-    <w:basedOn w:val="849"/>
+    <w:basedOn w:val="851"/>
     <w:pPr>
       <w:pBdr/>
       <w:spacing/>
@@ -25912,9 +25858,9 @@
       </w:tcPr>
     </w:tblStylePr>
   </w:style>
-  <w:style w:type="table" w:styleId="963">
+  <w:style w:type="table" w:styleId="965">
     <w:name w:val="Grid Table 4"/>
-    <w:basedOn w:val="849"/>
+    <w:basedOn w:val="851"/>
     <w:uiPriority w:val="49"/>
     <w:pPr>
       <w:pBdr/>
@@ -26186,9 +26132,9 @@
       </w:tcPr>
     </w:tblStylePr>
   </w:style>
-  <w:style w:type="table" w:styleId="964" w:customStyle="1">
+  <w:style w:type="table" w:styleId="966" w:customStyle="1">
     <w:name w:val="Grid Table 4 - Accent 1"/>
-    <w:basedOn w:val="849"/>
+    <w:basedOn w:val="851"/>
     <w:pPr>
       <w:pBdr/>
       <w:spacing/>
@@ -26459,9 +26405,9 @@
       </w:tcPr>
     </w:tblStylePr>
   </w:style>
-  <w:style w:type="table" w:styleId="965" w:customStyle="1">
+  <w:style w:type="table" w:styleId="967" w:customStyle="1">
     <w:name w:val="Grid Table 4 - Accent 2"/>
-    <w:basedOn w:val="849"/>
+    <w:basedOn w:val="851"/>
     <w:pPr>
       <w:pBdr/>
       <w:spacing/>
@@ -26732,9 +26678,9 @@
       </w:tcPr>
     </w:tblStylePr>
   </w:style>
-  <w:style w:type="table" w:styleId="966" w:customStyle="1">
+  <w:style w:type="table" w:styleId="968" w:customStyle="1">
     <w:name w:val="Grid Table 4 - Accent 3"/>
-    <w:basedOn w:val="849"/>
+    <w:basedOn w:val="851"/>
     <w:pPr>
       <w:pBdr/>
       <w:spacing/>
@@ -27005,9 +26951,9 @@
       </w:tcPr>
     </w:tblStylePr>
   </w:style>
-  <w:style w:type="table" w:styleId="967" w:customStyle="1">
+  <w:style w:type="table" w:styleId="969" w:customStyle="1">
     <w:name w:val="Grid Table 4 - Accent 4"/>
-    <w:basedOn w:val="849"/>
+    <w:basedOn w:val="851"/>
     <w:pPr>
       <w:pBdr/>
       <w:spacing/>
@@ -27278,9 +27224,9 @@
       </w:tcPr>
     </w:tblStylePr>
   </w:style>
-  <w:style w:type="table" w:styleId="968" w:customStyle="1">
+  <w:style w:type="table" w:styleId="970" w:customStyle="1">
     <w:name w:val="Grid Table 4 - Accent 5"/>
-    <w:basedOn w:val="849"/>
+    <w:basedOn w:val="851"/>
     <w:pPr>
       <w:pBdr/>
       <w:spacing/>
@@ -27551,9 +27497,9 @@
       </w:tcPr>
     </w:tblStylePr>
   </w:style>
-  <w:style w:type="table" w:styleId="969" w:customStyle="1">
+  <w:style w:type="table" w:styleId="971" w:customStyle="1">
     <w:name w:val="Grid Table 4 - Accent 6"/>
-    <w:basedOn w:val="849"/>
+    <w:basedOn w:val="851"/>
     <w:pPr>
       <w:pBdr/>
       <w:spacing/>
@@ -27824,9 +27770,9 @@
       </w:tcPr>
     </w:tblStylePr>
   </w:style>
-  <w:style w:type="table" w:styleId="970">
+  <w:style w:type="table" w:styleId="972">
     <w:name w:val="Grid Table 5 Dark"/>
-    <w:basedOn w:val="849"/>
+    <w:basedOn w:val="851"/>
     <w:uiPriority w:val="50"/>
     <w:pPr>
       <w:pBdr/>
@@ -28079,9 +28025,9 @@
       </w:tcPr>
     </w:tblStylePr>
   </w:style>
-  <w:style w:type="table" w:styleId="971" w:customStyle="1">
+  <w:style w:type="table" w:styleId="973" w:customStyle="1">
     <w:name w:val="Grid Table 5 Dark- Accent 1"/>
-    <w:basedOn w:val="849"/>
+    <w:basedOn w:val="851"/>
     <w:pPr>
       <w:pBdr/>
       <w:spacing/>
@@ -28333,9 +28279,9 @@
       </w:tcPr>
     </w:tblStylePr>
   </w:style>
-  <w:style w:type="table" w:styleId="972" w:customStyle="1">
+  <w:style w:type="table" w:styleId="974" w:customStyle="1">
     <w:name w:val="Grid Table 5 Dark - Accent 2"/>
-    <w:basedOn w:val="849"/>
+    <w:basedOn w:val="851"/>
     <w:pPr>
       <w:pBdr/>
       <w:spacing/>
@@ -28587,9 +28533,9 @@
       </w:tcPr>
     </w:tblStylePr>
   </w:style>
-  <w:style w:type="table" w:styleId="973" w:customStyle="1">
+  <w:style w:type="table" w:styleId="975" w:customStyle="1">
     <w:name w:val="Grid Table 5 Dark - Accent 3"/>
-    <w:basedOn w:val="849"/>
+    <w:basedOn w:val="851"/>
     <w:pPr>
       <w:pBdr/>
       <w:spacing/>
@@ -28841,9 +28787,9 @@
       </w:tcPr>
     </w:tblStylePr>
   </w:style>
-  <w:style w:type="table" w:styleId="974" w:customStyle="1">
+  <w:style w:type="table" w:styleId="976" w:customStyle="1">
     <w:name w:val="Grid Table 5 Dark- Accent 4"/>
-    <w:basedOn w:val="849"/>
+    <w:basedOn w:val="851"/>
     <w:pPr>
       <w:pBdr/>
       <w:spacing/>
@@ -29095,9 +29041,9 @@
       </w:tcPr>
     </w:tblStylePr>
   </w:style>
-  <w:style w:type="table" w:styleId="975" w:customStyle="1">
+  <w:style w:type="table" w:styleId="977" w:customStyle="1">
     <w:name w:val="Grid Table 5 Dark - Accent 5"/>
-    <w:basedOn w:val="849"/>
+    <w:basedOn w:val="851"/>
     <w:pPr>
       <w:pBdr/>
       <w:spacing/>
@@ -29349,9 +29295,9 @@
       </w:tcPr>
     </w:tblStylePr>
   </w:style>
-  <w:style w:type="table" w:styleId="976" w:customStyle="1">
+  <w:style w:type="table" w:styleId="978" w:customStyle="1">
     <w:name w:val="Grid Table 5 Dark - Accent 6"/>
-    <w:basedOn w:val="849"/>
+    <w:basedOn w:val="851"/>
     <w:pPr>
       <w:pBdr/>
       <w:spacing/>
@@ -29603,9 +29549,9 @@
       </w:tcPr>
     </w:tblStylePr>
   </w:style>
-  <w:style w:type="table" w:styleId="977">
+  <w:style w:type="table" w:styleId="979">
     <w:name w:val="Grid Table 6 Colorful"/>
-    <w:basedOn w:val="849"/>
+    <w:basedOn w:val="851"/>
     <w:uiPriority w:val="51"/>
     <w:pPr>
       <w:pBdr>
@@ -29880,9 +29826,9 @@
       </w:tcPr>
     </w:tblStylePr>
   </w:style>
-  <w:style w:type="table" w:styleId="978" w:customStyle="1">
+  <w:style w:type="table" w:styleId="980" w:customStyle="1">
     <w:name w:val="Grid Table 6 Colorful - Accent 1"/>
-    <w:basedOn w:val="849"/>
+    <w:basedOn w:val="851"/>
     <w:pPr>
       <w:pBdr>
         <w:top w:val="none" w:color="000000" w:sz="0" w:space="3"/>
@@ -30156,9 +30102,9 @@
       </w:tcPr>
     </w:tblStylePr>
   </w:style>
-  <w:style w:type="table" w:styleId="979" w:customStyle="1">
+  <w:style w:type="table" w:styleId="981" w:customStyle="1">
     <w:name w:val="Grid Table 6 Colorful - Accent 2"/>
-    <w:basedOn w:val="849"/>
+    <w:basedOn w:val="851"/>
     <w:pPr>
       <w:pBdr>
         <w:top w:val="none" w:color="000000" w:sz="0" w:space="3"/>
@@ -30432,9 +30378,9 @@
       </w:tcPr>
     </w:tblStylePr>
   </w:style>
-  <w:style w:type="table" w:styleId="980" w:customStyle="1">
+  <w:style w:type="table" w:styleId="982" w:customStyle="1">
     <w:name w:val="Grid Table 6 Colorful - Accent 3"/>
-    <w:basedOn w:val="849"/>
+    <w:basedOn w:val="851"/>
     <w:pPr>
       <w:pBdr>
         <w:top w:val="none" w:color="000000" w:sz="0" w:space="3"/>
@@ -30708,9 +30654,9 @@
       </w:tcPr>
     </w:tblStylePr>
   </w:style>
-  <w:style w:type="table" w:styleId="981" w:customStyle="1">
+  <w:style w:type="table" w:styleId="983" w:customStyle="1">
     <w:name w:val="Grid Table 6 Colorful - Accent 4"/>
-    <w:basedOn w:val="849"/>
+    <w:basedOn w:val="851"/>
     <w:pPr>
       <w:pBdr>
         <w:top w:val="none" w:color="000000" w:sz="0" w:space="3"/>
@@ -30984,9 +30930,9 @@
       </w:tcPr>
     </w:tblStylePr>
   </w:style>
-  <w:style w:type="table" w:styleId="982" w:customStyle="1">
+  <w:style w:type="table" w:styleId="984" w:customStyle="1">
     <w:name w:val="Grid Table 6 Colorful - Accent 5"/>
-    <w:basedOn w:val="849"/>
+    <w:basedOn w:val="851"/>
     <w:pPr>
       <w:pBdr>
         <w:top w:val="none" w:color="000000" w:sz="0" w:space="3"/>
@@ -31260,9 +31206,9 @@
       </w:tcPr>
     </w:tblStylePr>
   </w:style>
-  <w:style w:type="table" w:styleId="983" w:customStyle="1">
+  <w:style w:type="table" w:styleId="985" w:customStyle="1">
     <w:name w:val="Grid Table 6 Colorful - Accent 6"/>
-    <w:basedOn w:val="849"/>
+    <w:basedOn w:val="851"/>
     <w:pPr>
       <w:pBdr>
         <w:top w:val="none" w:color="000000" w:sz="0" w:space="3"/>
@@ -31536,9 +31482,9 @@
       </w:tcPr>
     </w:tblStylePr>
   </w:style>
-  <w:style w:type="table" w:styleId="984">
+  <w:style w:type="table" w:styleId="986">
     <w:name w:val="Grid Table 7 Colorful"/>
-    <w:basedOn w:val="849"/>
+    <w:basedOn w:val="851"/>
     <w:uiPriority w:val="52"/>
     <w:pPr>
       <w:pBdr/>
@@ -31819,9 +31765,9 @@
       </w:tcPr>
     </w:tblStylePr>
   </w:style>
-  <w:style w:type="table" w:styleId="985" w:customStyle="1">
+  <w:style w:type="table" w:styleId="987" w:customStyle="1">
     <w:name w:val="Grid Table 7 Colorful - Accent 1"/>
-    <w:basedOn w:val="849"/>
+    <w:basedOn w:val="851"/>
     <w:pPr>
       <w:pBdr/>
       <w:spacing/>
@@ -32101,9 +32047,9 @@
       </w:tcPr>
     </w:tblStylePr>
   </w:style>
-  <w:style w:type="table" w:styleId="986" w:customStyle="1">
+  <w:style w:type="table" w:styleId="988" w:customStyle="1">
     <w:name w:val="Grid Table 7 Colorful - Accent 2"/>
-    <w:basedOn w:val="849"/>
+    <w:basedOn w:val="851"/>
     <w:pPr>
       <w:pBdr/>
       <w:spacing/>
@@ -32383,9 +32329,9 @@
       </w:tcPr>
     </w:tblStylePr>
   </w:style>
-  <w:style w:type="table" w:styleId="987" w:customStyle="1">
+  <w:style w:type="table" w:styleId="989" w:customStyle="1">
     <w:name w:val="Grid Table 7 Colorful - Accent 3"/>
-    <w:basedOn w:val="849"/>
+    <w:basedOn w:val="851"/>
     <w:pPr>
       <w:pBdr/>
       <w:spacing/>
@@ -32665,9 +32611,9 @@
       </w:tcPr>
     </w:tblStylePr>
   </w:style>
-  <w:style w:type="table" w:styleId="988" w:customStyle="1">
+  <w:style w:type="table" w:styleId="990" w:customStyle="1">
     <w:name w:val="Grid Table 7 Colorful - Accent 4"/>
-    <w:basedOn w:val="849"/>
+    <w:basedOn w:val="851"/>
     <w:pPr>
       <w:pBdr/>
       <w:spacing/>
@@ -32947,9 +32893,9 @@
       </w:tcPr>
     </w:tblStylePr>
   </w:style>
-  <w:style w:type="table" w:styleId="989" w:customStyle="1">
+  <w:style w:type="table" w:styleId="991" w:customStyle="1">
     <w:name w:val="Grid Table 7 Colorful - Accent 5"/>
-    <w:basedOn w:val="849"/>
+    <w:basedOn w:val="851"/>
     <w:pPr>
       <w:pBdr/>
       <w:spacing/>
@@ -33229,9 +33175,9 @@
       </w:tcPr>
     </w:tblStylePr>
   </w:style>
-  <w:style w:type="table" w:styleId="990" w:customStyle="1">
+  <w:style w:type="table" w:styleId="992" w:customStyle="1">
     <w:name w:val="Grid Table 7 Colorful - Accent 6"/>
-    <w:basedOn w:val="849"/>
+    <w:basedOn w:val="851"/>
     <w:pPr>
       <w:pBdr/>
       <w:spacing/>
@@ -33511,9 +33457,9 @@
       </w:tcPr>
     </w:tblStylePr>
   </w:style>
-  <w:style w:type="table" w:styleId="991">
+  <w:style w:type="table" w:styleId="993">
     <w:name w:val="List Table 1 Light"/>
-    <w:basedOn w:val="849"/>
+    <w:basedOn w:val="851"/>
     <w:uiPriority w:val="46"/>
     <w:pPr>
       <w:pBdr/>
@@ -33748,9 +33694,9 @@
       </w:tcPr>
     </w:tblStylePr>
   </w:style>
-  <w:style w:type="table" w:styleId="992" w:customStyle="1">
+  <w:style w:type="table" w:styleId="994" w:customStyle="1">
     <w:name w:val="List Table 1 Light - Accent 1"/>
-    <w:basedOn w:val="849"/>
+    <w:basedOn w:val="851"/>
     <w:pPr>
       <w:pBdr/>
       <w:spacing/>
@@ -33984,9 +33930,9 @@
       </w:tcPr>
     </w:tblStylePr>
   </w:style>
-  <w:style w:type="table" w:styleId="993" w:customStyle="1">
+  <w:style w:type="table" w:styleId="995" w:customStyle="1">
     <w:name w:val="List Table 1 Light - Accent 2"/>
-    <w:basedOn w:val="849"/>
+    <w:basedOn w:val="851"/>
     <w:pPr>
       <w:pBdr/>
       <w:spacing/>
@@ -34220,9 +34166,9 @@
       </w:tcPr>
     </w:tblStylePr>
   </w:style>
-  <w:style w:type="table" w:styleId="994" w:customStyle="1">
+  <w:style w:type="table" w:styleId="996" w:customStyle="1">
     <w:name w:val="List Table 1 Light - Accent 3"/>
-    <w:basedOn w:val="849"/>
+    <w:basedOn w:val="851"/>
     <w:pPr>
       <w:pBdr/>
       <w:spacing/>
@@ -34456,9 +34402,9 @@
       </w:tcPr>
     </w:tblStylePr>
   </w:style>
-  <w:style w:type="table" w:styleId="995" w:customStyle="1">
+  <w:style w:type="table" w:styleId="997" w:customStyle="1">
     <w:name w:val="List Table 1 Light - Accent 4"/>
-    <w:basedOn w:val="849"/>
+    <w:basedOn w:val="851"/>
     <w:pPr>
       <w:pBdr/>
       <w:spacing/>
@@ -34692,9 +34638,9 @@
       </w:tcPr>
     </w:tblStylePr>
   </w:style>
-  <w:style w:type="table" w:styleId="996" w:customStyle="1">
+  <w:style w:type="table" w:styleId="998" w:customStyle="1">
     <w:name w:val="List Table 1 Light - Accent 5"/>
-    <w:basedOn w:val="849"/>
+    <w:basedOn w:val="851"/>
     <w:pPr>
       <w:pBdr/>
       <w:spacing/>
@@ -34928,9 +34874,9 @@
       </w:tcPr>
     </w:tblStylePr>
   </w:style>
-  <w:style w:type="table" w:styleId="997" w:customStyle="1">
+  <w:style w:type="table" w:styleId="999" w:customStyle="1">
     <w:name w:val="List Table 1 Light - Accent 6"/>
-    <w:basedOn w:val="849"/>
+    <w:basedOn w:val="851"/>
     <w:pPr>
       <w:pBdr/>
       <w:spacing/>
@@ -35164,9 +35110,9 @@
       </w:tcPr>
     </w:tblStylePr>
   </w:style>
-  <w:style w:type="table" w:styleId="998">
+  <w:style w:type="table" w:styleId="1000">
     <w:name w:val="List Table 2"/>
-    <w:basedOn w:val="849"/>
+    <w:basedOn w:val="851"/>
     <w:uiPriority w:val="47"/>
     <w:pPr>
       <w:pBdr/>
@@ -35439,9 +35385,9 @@
       </w:tcPr>
     </w:tblStylePr>
   </w:style>
-  <w:style w:type="table" w:styleId="999" w:customStyle="1">
+  <w:style w:type="table" w:styleId="1001" w:customStyle="1">
     <w:name w:val="List Table 2 - Accent 1"/>
-    <w:basedOn w:val="849"/>
+    <w:basedOn w:val="851"/>
     <w:pPr>
       <w:pBdr/>
       <w:spacing/>
@@ -35713,9 +35659,9 @@
       </w:tcPr>
     </w:tblStylePr>
   </w:style>
-  <w:style w:type="table" w:styleId="1000" w:customStyle="1">
+  <w:style w:type="table" w:styleId="1002" w:customStyle="1">
     <w:name w:val="List Table 2 - Accent 2"/>
-    <w:basedOn w:val="849"/>
+    <w:basedOn w:val="851"/>
     <w:pPr>
       <w:pBdr/>
       <w:spacing/>
@@ -35987,9 +35933,9 @@
       </w:tcPr>
     </w:tblStylePr>
   </w:style>
-  <w:style w:type="table" w:styleId="1001" w:customStyle="1">
+  <w:style w:type="table" w:styleId="1003" w:customStyle="1">
     <w:name w:val="List Table 2 - Accent 3"/>
-    <w:basedOn w:val="849"/>
+    <w:basedOn w:val="851"/>
     <w:pPr>
       <w:pBdr/>
       <w:spacing/>
@@ -36261,9 +36207,9 @@
       </w:tcPr>
     </w:tblStylePr>
   </w:style>
-  <w:style w:type="table" w:styleId="1002" w:customStyle="1">
+  <w:style w:type="table" w:styleId="1004" w:customStyle="1">
     <w:name w:val="List Table 2 - Accent 4"/>
-    <w:basedOn w:val="849"/>
+    <w:basedOn w:val="851"/>
     <w:pPr>
       <w:pBdr/>
       <w:spacing/>
@@ -36535,9 +36481,9 @@
       </w:tcPr>
     </w:tblStylePr>
   </w:style>
-  <w:style w:type="table" w:styleId="1003" w:customStyle="1">
+  <w:style w:type="table" w:styleId="1005" w:customStyle="1">
     <w:name w:val="List Table 2 - Accent 5"/>
-    <w:basedOn w:val="849"/>
+    <w:basedOn w:val="851"/>
     <w:pPr>
       <w:pBdr/>
       <w:spacing/>
@@ -36809,9 +36755,9 @@
       </w:tcPr>
     </w:tblStylePr>
   </w:style>
-  <w:style w:type="table" w:styleId="1004" w:customStyle="1">
+  <w:style w:type="table" w:styleId="1006" w:customStyle="1">
     <w:name w:val="List Table 2 - Accent 6"/>
-    <w:basedOn w:val="849"/>
+    <w:basedOn w:val="851"/>
     <w:pPr>
       <w:pBdr/>
       <w:spacing/>
@@ -37083,9 +37029,9 @@
       </w:tcPr>
     </w:tblStylePr>
   </w:style>
-  <w:style w:type="table" w:styleId="1005">
+  <w:style w:type="table" w:styleId="1007">
     <w:name w:val="List Table 3"/>
-    <w:basedOn w:val="849"/>
+    <w:basedOn w:val="851"/>
     <w:uiPriority w:val="48"/>
     <w:pPr>
       <w:pBdr/>
@@ -37352,9 +37298,9 @@
       </w:tcPr>
     </w:tblStylePr>
   </w:style>
-  <w:style w:type="table" w:styleId="1006" w:customStyle="1">
+  <w:style w:type="table" w:styleId="1008" w:customStyle="1">
     <w:name w:val="List Table 3 - Accent 1"/>
-    <w:basedOn w:val="849"/>
+    <w:basedOn w:val="851"/>
     <w:pPr>
       <w:pBdr/>
       <w:spacing/>
@@ -37620,9 +37566,9 @@
       </w:tcPr>
     </w:tblStylePr>
   </w:style>
-  <w:style w:type="table" w:styleId="1007" w:customStyle="1">
+  <w:style w:type="table" w:styleId="1009" w:customStyle="1">
     <w:name w:val="List Table 3 - Accent 2"/>
-    <w:basedOn w:val="849"/>
+    <w:basedOn w:val="851"/>
     <w:pPr>
       <w:pBdr/>
       <w:spacing/>
@@ -37888,9 +37834,9 @@
       </w:tcPr>
     </w:tblStylePr>
   </w:style>
-  <w:style w:type="table" w:styleId="1008" w:customStyle="1">
+  <w:style w:type="table" w:styleId="1010" w:customStyle="1">
     <w:name w:val="List Table 3 - Accent 3"/>
-    <w:basedOn w:val="849"/>
+    <w:basedOn w:val="851"/>
     <w:pPr>
       <w:pBdr/>
       <w:spacing/>
@@ -38156,9 +38102,9 @@
       </w:tcPr>
     </w:tblStylePr>
   </w:style>
-  <w:style w:type="table" w:styleId="1009" w:customStyle="1">
+  <w:style w:type="table" w:styleId="1011" w:customStyle="1">
     <w:name w:val="List Table 3 - Accent 4"/>
-    <w:basedOn w:val="849"/>
+    <w:basedOn w:val="851"/>
     <w:pPr>
       <w:pBdr/>
       <w:spacing/>
@@ -38424,9 +38370,9 @@
       </w:tcPr>
     </w:tblStylePr>
   </w:style>
-  <w:style w:type="table" w:styleId="1010" w:customStyle="1">
+  <w:style w:type="table" w:styleId="1012" w:customStyle="1">
     <w:name w:val="List Table 3 - Accent 5"/>
-    <w:basedOn w:val="849"/>
+    <w:basedOn w:val="851"/>
     <w:pPr>
       <w:pBdr/>
       <w:spacing/>
@@ -38692,9 +38638,9 @@
       </w:tcPr>
     </w:tblStylePr>
   </w:style>
-  <w:style w:type="table" w:styleId="1011" w:customStyle="1">
+  <w:style w:type="table" w:styleId="1013" w:customStyle="1">
     <w:name w:val="List Table 3 - Accent 6"/>
-    <w:basedOn w:val="849"/>
+    <w:basedOn w:val="851"/>
     <w:pPr>
       <w:pBdr/>
       <w:spacing/>
@@ -38960,9 +38906,9 @@
       </w:tcPr>
     </w:tblStylePr>
   </w:style>
-  <w:style w:type="table" w:styleId="1012">
+  <w:style w:type="table" w:styleId="1014">
     <w:name w:val="List Table 4"/>
-    <w:basedOn w:val="849"/>
+    <w:basedOn w:val="851"/>
     <w:uiPriority w:val="49"/>
     <w:pPr>
       <w:pBdr/>
@@ -39226,9 +39172,9 @@
       </w:tcPr>
     </w:tblStylePr>
   </w:style>
-  <w:style w:type="table" w:styleId="1013" w:customStyle="1">
+  <w:style w:type="table" w:styleId="1015" w:customStyle="1">
     <w:name w:val="List Table 4 - Accent 1"/>
-    <w:basedOn w:val="849"/>
+    <w:basedOn w:val="851"/>
     <w:pPr>
       <w:pBdr/>
       <w:spacing/>
@@ -39491,9 +39437,9 @@
       </w:tcPr>
     </w:tblStylePr>
   </w:style>
-  <w:style w:type="table" w:styleId="1014" w:customStyle="1">
+  <w:style w:type="table" w:styleId="1016" w:customStyle="1">
     <w:name w:val="List Table 4 - Accent 2"/>
-    <w:basedOn w:val="849"/>
+    <w:basedOn w:val="851"/>
     <w:pPr>
       <w:pBdr/>
       <w:spacing/>
@@ -39756,9 +39702,9 @@
       </w:tcPr>
     </w:tblStylePr>
   </w:style>
-  <w:style w:type="table" w:styleId="1015" w:customStyle="1">
+  <w:style w:type="table" w:styleId="1017" w:customStyle="1">
     <w:name w:val="List Table 4 - Accent 3"/>
-    <w:basedOn w:val="849"/>
+    <w:basedOn w:val="851"/>
     <w:pPr>
       <w:pBdr/>
       <w:spacing/>
@@ -40021,9 +39967,9 @@
       </w:tcPr>
     </w:tblStylePr>
   </w:style>
-  <w:style w:type="table" w:styleId="1016" w:customStyle="1">
+  <w:style w:type="table" w:styleId="1018" w:customStyle="1">
     <w:name w:val="List Table 4 - Accent 4"/>
-    <w:basedOn w:val="849"/>
+    <w:basedOn w:val="851"/>
     <w:pPr>
       <w:pBdr/>
       <w:spacing/>
@@ -40286,9 +40232,9 @@
       </w:tcPr>
     </w:tblStylePr>
   </w:style>
-  <w:style w:type="table" w:styleId="1017" w:customStyle="1">
+  <w:style w:type="table" w:styleId="1019" w:customStyle="1">
     <w:name w:val="List Table 4 - Accent 5"/>
-    <w:basedOn w:val="849"/>
+    <w:basedOn w:val="851"/>
     <w:pPr>
       <w:pBdr/>
       <w:spacing/>
@@ -40551,9 +40497,9 @@
       </w:tcPr>
     </w:tblStylePr>
   </w:style>
-  <w:style w:type="table" w:styleId="1018" w:customStyle="1">
+  <w:style w:type="table" w:styleId="1020" w:customStyle="1">
     <w:name w:val="List Table 4 - Accent 6"/>
-    <w:basedOn w:val="849"/>
+    <w:basedOn w:val="851"/>
     <w:pPr>
       <w:pBdr/>
       <w:spacing/>
@@ -40816,9 +40762,9 @@
       </w:tcPr>
     </w:tblStylePr>
   </w:style>
-  <w:style w:type="table" w:styleId="1019">
+  <w:style w:type="table" w:styleId="1021">
     <w:name w:val="List Table 5 Dark"/>
-    <w:basedOn w:val="849"/>
+    <w:basedOn w:val="851"/>
     <w:uiPriority w:val="50"/>
     <w:pPr>
       <w:pBdr>
@@ -41084,9 +41030,9 @@
       </w:tcPr>
     </w:tblStylePr>
   </w:style>
-  <w:style w:type="table" w:styleId="1020" w:customStyle="1">
+  <w:style w:type="table" w:styleId="1022" w:customStyle="1">
     <w:name w:val="List Table 5 Dark - Accent 1"/>
-    <w:basedOn w:val="849"/>
+    <w:basedOn w:val="851"/>
     <w:pPr>
       <w:pBdr>
         <w:top w:val="none" w:color="000000" w:sz="0" w:space="3"/>
@@ -41351,9 +41297,9 @@
       </w:tcPr>
     </w:tblStylePr>
   </w:style>
-  <w:style w:type="table" w:styleId="1021" w:customStyle="1">
+  <w:style w:type="table" w:styleId="1023" w:customStyle="1">
     <w:name w:val="List Table 5 Dark - Accent 2"/>
-    <w:basedOn w:val="849"/>
+    <w:basedOn w:val="851"/>
     <w:pPr>
       <w:pBdr>
         <w:top w:val="none" w:color="000000" w:sz="0" w:space="3"/>
@@ -41618,9 +41564,9 @@
       </w:tcPr>
     </w:tblStylePr>
   </w:style>
-  <w:style w:type="table" w:styleId="1022" w:customStyle="1">
+  <w:style w:type="table" w:styleId="1024" w:customStyle="1">
     <w:name w:val="List Table 5 Dark - Accent 3"/>
-    <w:basedOn w:val="849"/>
+    <w:basedOn w:val="851"/>
     <w:pPr>
       <w:pBdr>
         <w:top w:val="none" w:color="000000" w:sz="0" w:space="3"/>
@@ -41885,9 +41831,9 @@
       </w:tcPr>
     </w:tblStylePr>
   </w:style>
-  <w:style w:type="table" w:styleId="1023" w:customStyle="1">
+  <w:style w:type="table" w:styleId="1025" w:customStyle="1">
     <w:name w:val="List Table 5 Dark - Accent 4"/>
-    <w:basedOn w:val="849"/>
+    <w:basedOn w:val="851"/>
     <w:pPr>
       <w:pBdr>
         <w:top w:val="none" w:color="000000" w:sz="0" w:space="3"/>
@@ -42152,9 +42098,9 @@
       </w:tcPr>
     </w:tblStylePr>
   </w:style>
-  <w:style w:type="table" w:styleId="1024" w:customStyle="1">
+  <w:style w:type="table" w:styleId="1026" w:customStyle="1">
     <w:name w:val="List Table 5 Dark - Accent 5"/>
-    <w:basedOn w:val="849"/>
+    <w:basedOn w:val="851"/>
     <w:pPr>
       <w:pBdr>
         <w:top w:val="none" w:color="000000" w:sz="0" w:space="3"/>
@@ -42419,9 +42365,9 @@
       </w:tcPr>
     </w:tblStylePr>
   </w:style>
-  <w:style w:type="table" w:styleId="1025" w:customStyle="1">
+  <w:style w:type="table" w:styleId="1027" w:customStyle="1">
     <w:name w:val="List Table 5 Dark - Accent 6"/>
-    <w:basedOn w:val="849"/>
+    <w:basedOn w:val="851"/>
     <w:pPr>
       <w:pBdr>
         <w:top w:val="none" w:color="000000" w:sz="0" w:space="3"/>
@@ -42686,9 +42632,9 @@
       </w:tcPr>
     </w:tblStylePr>
   </w:style>
-  <w:style w:type="table" w:styleId="1026">
+  <w:style w:type="table" w:styleId="1028">
     <w:name w:val="List Table 6 Colorful"/>
-    <w:basedOn w:val="849"/>
+    <w:basedOn w:val="851"/>
     <w:uiPriority w:val="51"/>
     <w:pPr>
       <w:pBdr/>
@@ -42950,9 +42896,9 @@
       </w:tcPr>
     </w:tblStylePr>
   </w:style>
-  <w:style w:type="table" w:styleId="1027" w:customStyle="1">
+  <w:style w:type="table" w:styleId="1029" w:customStyle="1">
     <w:name w:val="List Table 6 Colorful - Accent 1"/>
-    <w:basedOn w:val="849"/>
+    <w:basedOn w:val="851"/>
     <w:pPr>
       <w:pBdr/>
       <w:spacing/>
@@ -43213,9 +43159,9 @@
       </w:tcPr>
     </w:tblStylePr>
   </w:style>
-  <w:style w:type="table" w:styleId="1028" w:customStyle="1">
+  <w:style w:type="table" w:styleId="1030" w:customStyle="1">
     <w:name w:val="List Table 6 Colorful - Accent 2"/>
-    <w:basedOn w:val="849"/>
+    <w:basedOn w:val="851"/>
     <w:pPr>
       <w:pBdr/>
       <w:spacing/>
@@ -43476,9 +43422,9 @@
       </w:tcPr>
     </w:tblStylePr>
   </w:style>
-  <w:style w:type="table" w:styleId="1029" w:customStyle="1">
+  <w:style w:type="table" w:styleId="1031" w:customStyle="1">
     <w:name w:val="List Table 6 Colorful - Accent 3"/>
-    <w:basedOn w:val="849"/>
+    <w:basedOn w:val="851"/>
     <w:pPr>
       <w:pBdr/>
       <w:spacing/>
@@ -43739,9 +43685,9 @@
       </w:tcPr>
     </w:tblStylePr>
   </w:style>
-  <w:style w:type="table" w:styleId="1030" w:customStyle="1">
+  <w:style w:type="table" w:styleId="1032" w:customStyle="1">
     <w:name w:val="List Table 6 Colorful - Accent 4"/>
-    <w:basedOn w:val="849"/>
+    <w:basedOn w:val="851"/>
     <w:pPr>
       <w:pBdr/>
       <w:spacing/>
@@ -44002,9 +43948,9 @@
       </w:tcPr>
     </w:tblStylePr>
   </w:style>
-  <w:style w:type="table" w:styleId="1031" w:customStyle="1">
+  <w:style w:type="table" w:styleId="1033" w:customStyle="1">
     <w:name w:val="List Table 6 Colorful - Accent 5"/>
-    <w:basedOn w:val="849"/>
+    <w:basedOn w:val="851"/>
     <w:pPr>
       <w:pBdr/>
       <w:spacing/>
@@ -44265,9 +44211,9 @@
       </w:tcPr>
     </w:tblStylePr>
   </w:style>
-  <w:style w:type="table" w:styleId="1032" w:customStyle="1">
+  <w:style w:type="table" w:styleId="1034" w:customStyle="1">
     <w:name w:val="List Table 6 Colorful - Accent 6"/>
-    <w:basedOn w:val="849"/>
+    <w:basedOn w:val="851"/>
     <w:pPr>
       <w:pBdr/>
       <w:spacing/>
@@ -44528,9 +44474,9 @@
       </w:tcPr>
     </w:tblStylePr>
   </w:style>
-  <w:style w:type="table" w:styleId="1033">
+  <w:style w:type="table" w:styleId="1035">
     <w:name w:val="List Table 7 Colorful"/>
-    <w:basedOn w:val="849"/>
+    <w:basedOn w:val="851"/>
     <w:uiPriority w:val="52"/>
     <w:pPr>
       <w:pBdr>
@@ -44819,9 +44765,9 @@
       </w:tcPr>
     </w:tblStylePr>
   </w:style>
-  <w:style w:type="table" w:styleId="1034" w:customStyle="1">
+  <w:style w:type="table" w:styleId="1036" w:customStyle="1">
     <w:name w:val="List Table 7 Colorful - Accent 1"/>
-    <w:basedOn w:val="849"/>
+    <w:basedOn w:val="851"/>
     <w:pPr>
       <w:pBdr>
         <w:top w:val="none" w:color="000000" w:sz="0" w:space="3"/>
@@ -45109,9 +45055,9 @@
       </w:tcPr>
     </w:tblStylePr>
   </w:style>
-  <w:style w:type="table" w:styleId="1035" w:customStyle="1">
+  <w:style w:type="table" w:styleId="1037" w:customStyle="1">
     <w:name w:val="List Table 7 Colorful - Accent 2"/>
-    <w:basedOn w:val="849"/>
+    <w:basedOn w:val="851"/>
     <w:pPr>
       <w:pBdr>
         <w:top w:val="none" w:color="000000" w:sz="0" w:space="3"/>
@@ -45399,9 +45345,9 @@
       </w:tcPr>
     </w:tblStylePr>
   </w:style>
-  <w:style w:type="table" w:styleId="1036" w:customStyle="1">
+  <w:style w:type="table" w:styleId="1038" w:customStyle="1">
     <w:name w:val="List Table 7 Colorful - Accent 3"/>
-    <w:basedOn w:val="849"/>
+    <w:basedOn w:val="851"/>
     <w:pPr>
       <w:pBdr>
         <w:top w:val="none" w:color="000000" w:sz="0" w:space="3"/>
@@ -45689,9 +45635,9 @@
       </w:tcPr>
     </w:tblStylePr>
   </w:style>
-  <w:style w:type="table" w:styleId="1037" w:customStyle="1">
+  <w:style w:type="table" w:styleId="1039" w:customStyle="1">
     <w:name w:val="List Table 7 Colorful - Accent 4"/>
-    <w:basedOn w:val="849"/>
+    <w:basedOn w:val="851"/>
     <w:pPr>
       <w:pBdr>
         <w:top w:val="none" w:color="000000" w:sz="0" w:space="3"/>
@@ -45979,9 +45925,9 @@
       </w:tcPr>
     </w:tblStylePr>
   </w:style>
-  <w:style w:type="table" w:styleId="1038" w:customStyle="1">
+  <w:style w:type="table" w:styleId="1040" w:customStyle="1">
     <w:name w:val="List Table 7 Colorful - Accent 5"/>
-    <w:basedOn w:val="849"/>
+    <w:basedOn w:val="851"/>
     <w:pPr>
       <w:pBdr>
         <w:top w:val="none" w:color="000000" w:sz="0" w:space="3"/>
@@ -46269,9 +46215,9 @@
       </w:tcPr>
     </w:tblStylePr>
   </w:style>
-  <w:style w:type="table" w:styleId="1039" w:customStyle="1">
+  <w:style w:type="table" w:styleId="1041" w:customStyle="1">
     <w:name w:val="List Table 7 Colorful - Accent 6"/>
-    <w:basedOn w:val="849"/>
+    <w:basedOn w:val="851"/>
     <w:pPr>
       <w:pBdr>
         <w:top w:val="none" w:color="000000" w:sz="0" w:space="3"/>
@@ -46559,9 +46505,9 @@
       </w:tcPr>
     </w:tblStylePr>
   </w:style>
-  <w:style w:type="table" w:styleId="1040" w:customStyle="1">
+  <w:style w:type="table" w:styleId="1042" w:customStyle="1">
     <w:name w:val="Lined - Accent"/>
-    <w:basedOn w:val="849"/>
+    <w:basedOn w:val="851"/>
     <w:pPr>
       <w:pBdr/>
       <w:spacing/>
@@ -46847,9 +46793,9 @@
       </w:tcPr>
     </w:tblStylePr>
   </w:style>
-  <w:style w:type="table" w:styleId="1041" w:customStyle="1">
+  <w:style w:type="table" w:styleId="1043" w:customStyle="1">
     <w:name w:val="Lined - Accent 1"/>
-    <w:basedOn w:val="849"/>
+    <w:basedOn w:val="851"/>
     <w:pPr>
       <w:pBdr/>
       <w:spacing/>
@@ -47135,9 +47081,9 @@
       </w:tcPr>
     </w:tblStylePr>
   </w:style>
-  <w:style w:type="table" w:styleId="1042" w:customStyle="1">
+  <w:style w:type="table" w:styleId="1044" w:customStyle="1">
     <w:name w:val="Lined - Accent 2"/>
-    <w:basedOn w:val="849"/>
+    <w:basedOn w:val="851"/>
     <w:pPr>
       <w:pBdr/>
       <w:spacing/>
@@ -47423,9 +47369,9 @@
       </w:tcPr>
     </w:tblStylePr>
   </w:style>
-  <w:style w:type="table" w:styleId="1043" w:customStyle="1">
+  <w:style w:type="table" w:styleId="1045" w:customStyle="1">
     <w:name w:val="Lined - Accent 3"/>
-    <w:basedOn w:val="849"/>
+    <w:basedOn w:val="851"/>
     <w:pPr>
       <w:pBdr/>
       <w:spacing/>
@@ -47711,9 +47657,9 @@
       </w:tcPr>
     </w:tblStylePr>
   </w:style>
-  <w:style w:type="table" w:styleId="1044" w:customStyle="1">
+  <w:style w:type="table" w:styleId="1046" w:customStyle="1">
     <w:name w:val="Lined - Accent 4"/>
-    <w:basedOn w:val="849"/>
+    <w:basedOn w:val="851"/>
     <w:pPr>
       <w:pBdr/>
       <w:spacing/>
@@ -47999,9 +47945,9 @@
       </w:tcPr>
     </w:tblStylePr>
   </w:style>
-  <w:style w:type="table" w:styleId="1045" w:customStyle="1">
+  <w:style w:type="table" w:styleId="1047" w:customStyle="1">
     <w:name w:val="Lined - Accent 5"/>
-    <w:basedOn w:val="849"/>
+    <w:basedOn w:val="851"/>
     <w:pPr>
       <w:pBdr/>
       <w:spacing/>
@@ -48287,9 +48233,9 @@
       </w:tcPr>
     </w:tblStylePr>
   </w:style>
-  <w:style w:type="table" w:styleId="1046" w:customStyle="1">
+  <w:style w:type="table" w:styleId="1048" w:customStyle="1">
     <w:name w:val="Lined - Accent 6"/>
-    <w:basedOn w:val="849"/>
+    <w:basedOn w:val="851"/>
     <w:pPr>
       <w:pBdr/>
       <w:spacing/>
@@ -48575,9 +48521,9 @@
       </w:tcPr>
     </w:tblStylePr>
   </w:style>
-  <w:style w:type="table" w:styleId="1047" w:customStyle="1">
+  <w:style w:type="table" w:styleId="1049" w:customStyle="1">
     <w:name w:val="Bordered &amp; Lined - Accent"/>
-    <w:basedOn w:val="849"/>
+    <w:basedOn w:val="851"/>
     <w:pPr>
       <w:pBdr/>
       <w:spacing/>
@@ -48870,9 +48816,9 @@
       </w:tcPr>
     </w:tblStylePr>
   </w:style>
-  <w:style w:type="table" w:styleId="1048" w:customStyle="1">
+  <w:style w:type="table" w:styleId="1050" w:customStyle="1">
     <w:name w:val="Bordered &amp; Lined - Accent 1"/>
-    <w:basedOn w:val="849"/>
+    <w:basedOn w:val="851"/>
     <w:pPr>
       <w:pBdr/>
       <w:spacing/>
@@ -49165,9 +49111,9 @@
       </w:tcPr>
     </w:tblStylePr>
   </w:style>
-  <w:style w:type="table" w:styleId="1049" w:customStyle="1">
+  <w:style w:type="table" w:styleId="1051" w:customStyle="1">
     <w:name w:val="Bordered &amp; Lined - Accent 2"/>
-    <w:basedOn w:val="849"/>
+    <w:basedOn w:val="851"/>
     <w:pPr>
       <w:pBdr/>
       <w:spacing/>
@@ -49460,9 +49406,9 @@
       </w:tcPr>
     </w:tblStylePr>
   </w:style>
-  <w:style w:type="table" w:styleId="1050" w:customStyle="1">
+  <w:style w:type="table" w:styleId="1052" w:customStyle="1">
     <w:name w:val="Bordered &amp; Lined - Accent 3"/>
-    <w:basedOn w:val="849"/>
+    <w:basedOn w:val="851"/>
     <w:pPr>
       <w:pBdr/>
       <w:spacing/>
@@ -49755,9 +49701,9 @@
       </w:tcPr>
     </w:tblStylePr>
   </w:style>
-  <w:style w:type="table" w:styleId="1051" w:customStyle="1">
+  <w:style w:type="table" w:styleId="1053" w:customStyle="1">
     <w:name w:val="Bordered &amp; Lined - Accent 4"/>
-    <w:basedOn w:val="849"/>
+    <w:basedOn w:val="851"/>
     <w:pPr>
       <w:pBdr/>
       <w:spacing/>
@@ -50050,9 +49996,9 @@
       </w:tcPr>
     </w:tblStylePr>
   </w:style>
-  <w:style w:type="table" w:styleId="1052" w:customStyle="1">
+  <w:style w:type="table" w:styleId="1054" w:customStyle="1">
     <w:name w:val="Bordered &amp; Lined - Accent 5"/>
-    <w:basedOn w:val="849"/>
+    <w:basedOn w:val="851"/>
     <w:pPr>
       <w:pBdr/>
       <w:spacing/>
@@ -50345,9 +50291,9 @@
       </w:tcPr>
     </w:tblStylePr>
   </w:style>
-  <w:style w:type="table" w:styleId="1053" w:customStyle="1">
+  <w:style w:type="table" w:styleId="1055" w:customStyle="1">
     <w:name w:val="Bordered &amp; Lined - Accent 6"/>
-    <w:basedOn w:val="849"/>
+    <w:basedOn w:val="851"/>
     <w:pPr>
       <w:pBdr/>
       <w:spacing/>
@@ -50640,9 +50586,9 @@
       </w:tcPr>
     </w:tblStylePr>
   </w:style>
-  <w:style w:type="table" w:styleId="1054" w:customStyle="1">
+  <w:style w:type="table" w:styleId="1056" w:customStyle="1">
     <w:name w:val="Bordered"/>
-    <w:basedOn w:val="849"/>
+    <w:basedOn w:val="851"/>
     <w:pPr>
       <w:pBdr/>
       <w:spacing/>
@@ -50904,9 +50850,9 @@
       </w:tcPr>
     </w:tblStylePr>
   </w:style>
-  <w:style w:type="table" w:styleId="1055" w:customStyle="1">
+  <w:style w:type="table" w:styleId="1057" w:customStyle="1">
     <w:name w:val="Bordered - Accent 1"/>
-    <w:basedOn w:val="849"/>
+    <w:basedOn w:val="851"/>
     <w:pPr>
       <w:pBdr/>
       <w:spacing/>
@@ -51168,9 +51114,9 @@
       </w:tcPr>
     </w:tblStylePr>
   </w:style>
-  <w:style w:type="table" w:styleId="1056" w:customStyle="1">
+  <w:style w:type="table" w:styleId="1058" w:customStyle="1">
     <w:name w:val="Bordered - Accent 2"/>
-    <w:basedOn w:val="849"/>
+    <w:basedOn w:val="851"/>
     <w:pPr>
       <w:pBdr/>
       <w:spacing/>
@@ -51432,9 +51378,9 @@
       </w:tcPr>
     </w:tblStylePr>
   </w:style>
-  <w:style w:type="table" w:styleId="1057" w:customStyle="1">
+  <w:style w:type="table" w:styleId="1059" w:customStyle="1">
     <w:name w:val="Bordered - Accent 3"/>
-    <w:basedOn w:val="849"/>
+    <w:basedOn w:val="851"/>
     <w:pPr>
       <w:pBdr/>
       <w:spacing/>
@@ -51696,9 +51642,9 @@
       </w:tcPr>
     </w:tblStylePr>
   </w:style>
-  <w:style w:type="table" w:styleId="1058" w:customStyle="1">
+  <w:style w:type="table" w:styleId="1060" w:customStyle="1">
     <w:name w:val="Bordered - Accent 4"/>
-    <w:basedOn w:val="849"/>
+    <w:basedOn w:val="851"/>
     <w:pPr>
       <w:pBdr/>
       <w:spacing/>
@@ -51960,9 +51906,9 @@
       </w:tcPr>
     </w:tblStylePr>
   </w:style>
-  <w:style w:type="table" w:styleId="1059" w:customStyle="1">
+  <w:style w:type="table" w:styleId="1061" w:customStyle="1">
     <w:name w:val="Bordered - Accent 5"/>
-    <w:basedOn w:val="849"/>
+    <w:basedOn w:val="851"/>
     <w:pPr>
       <w:pBdr/>
       <w:spacing/>
@@ -52224,9 +52170,9 @@
       </w:tcPr>
     </w:tblStylePr>
   </w:style>
-  <w:style w:type="table" w:styleId="1060" w:customStyle="1">
+  <w:style w:type="table" w:styleId="1062" w:customStyle="1">
     <w:name w:val="Bordered - Accent 6"/>
-    <w:basedOn w:val="849"/>
+    <w:basedOn w:val="851"/>
     <w:pPr>
       <w:pBdr/>
       <w:spacing/>
@@ -52488,9 +52434,9 @@
       </w:tcPr>
     </w:tblStylePr>
   </w:style>
-  <w:style w:type="table" w:styleId="1061">
+  <w:style w:type="table" w:styleId="1063">
     <w:name w:val="Table Grid"/>
-    <w:basedOn w:val="849"/>
+    <w:basedOn w:val="851"/>
     <w:uiPriority w:val="59"/>
     <w:pPr>
       <w:pBdr/>

</xml_diff>

<commit_message>
fix: docx bail isChargeList
</commit_message>
<xml_diff>
--- a/src/assets/docx/bail.docx
+++ b/src/assets/docx/bail.docx
@@ -111,8 +111,8 @@
           <w:color w:val="auto"/>
         </w:rPr>
       </w:pPr>
-      <w:bookmarkStart w:id="0" w:name="_Hlk99641473"/>
-      <w:bookmarkStart w:id="1" w:name="_Hlk99641432"/>
+      <w:bookmarkStart w:id="0" w:name="_Hlk99641432"/>
+      <w:bookmarkStart w:id="1" w:name="_Hlk99641473"/>
       <w:r>
         <w:rPr>
           <w:color w:val="auto"/>
@@ -3100,6 +3100,24 @@
           <w:szCs w:val="20"/>
         </w:rPr>
       </w:r>
+      <w:r>
+        <w:br w:type="page"/>
+      </w:r>
+    </w:p>
+    <w:p>
+      <w:pPr>
+        <w:pStyle w:val="Normal"/>
+        <w:rPr>
+          <w:rFonts w:cs="Arial"/>
+          <w:szCs w:val="20"/>
+        </w:rPr>
+      </w:pPr>
+      <w:r>
+        <w:rPr>
+          <w:rFonts w:cs="Arial"/>
+          <w:szCs w:val="20"/>
+        </w:rPr>
+      </w:r>
     </w:p>
     <w:p>
       <w:pPr>
@@ -3120,6 +3138,34 @@
           <w:color w:val="auto"/>
         </w:rPr>
         <w:t>B. Charges récupérables</w:t>
+      </w:r>
+    </w:p>
+    <w:p>
+      <w:pPr>
+        <w:pStyle w:val="Normal"/>
+        <w:spacing w:before="307" w:after="173"/>
+        <w:rPr>
+          <w:b/>
+          <w:b/>
+          <w:bCs/>
+          <w:color w:val="000000"/>
+          <w:sz w:val="22"/>
+          <w:szCs w:val="22"/>
+        </w:rPr>
+      </w:pPr>
+      <w:r>
+        <w:rPr>
+          <w:rFonts w:ascii="monospace" w:hAnsi="monospace"/>
+          <w:b/>
+          <w:i w:val="false"/>
+          <w:caps w:val="false"/>
+          <w:smallCaps w:val="false"/>
+          <w:color w:val="000000"/>
+          <w:spacing w:val="0"/>
+          <w:sz w:val="22"/>
+          <w:shd w:fill="FFFFFF" w:val="clear"/>
+        </w:rPr>
+        <w:t>{#isChargeList}</w:t>
       </w:r>
     </w:p>
     <w:p>

</xml_diff>

<commit_message>
fix: docx bail isChargeList (#73)
Co-authored-by: Christian COLEY <christian.coley@smile.com>
</commit_message>
<xml_diff>
--- a/src/assets/docx/bail.docx
+++ b/src/assets/docx/bail.docx
@@ -111,8 +111,8 @@
           <w:color w:val="auto"/>
         </w:rPr>
       </w:pPr>
-      <w:bookmarkStart w:id="0" w:name="_Hlk99641473"/>
-      <w:bookmarkStart w:id="1" w:name="_Hlk99641432"/>
+      <w:bookmarkStart w:id="0" w:name="_Hlk99641432"/>
+      <w:bookmarkStart w:id="1" w:name="_Hlk99641473"/>
       <w:r>
         <w:rPr>
           <w:color w:val="auto"/>
@@ -3100,6 +3100,24 @@
           <w:szCs w:val="20"/>
         </w:rPr>
       </w:r>
+      <w:r>
+        <w:br w:type="page"/>
+      </w:r>
+    </w:p>
+    <w:p>
+      <w:pPr>
+        <w:pStyle w:val="Normal"/>
+        <w:rPr>
+          <w:rFonts w:cs="Arial"/>
+          <w:szCs w:val="20"/>
+        </w:rPr>
+      </w:pPr>
+      <w:r>
+        <w:rPr>
+          <w:rFonts w:cs="Arial"/>
+          <w:szCs w:val="20"/>
+        </w:rPr>
+      </w:r>
     </w:p>
     <w:p>
       <w:pPr>
@@ -3120,6 +3138,34 @@
           <w:color w:val="auto"/>
         </w:rPr>
         <w:t>B. Charges récupérables</w:t>
+      </w:r>
+    </w:p>
+    <w:p>
+      <w:pPr>
+        <w:pStyle w:val="Normal"/>
+        <w:spacing w:before="307" w:after="173"/>
+        <w:rPr>
+          <w:b/>
+          <w:b/>
+          <w:bCs/>
+          <w:color w:val="000000"/>
+          <w:sz w:val="22"/>
+          <w:szCs w:val="22"/>
+        </w:rPr>
+      </w:pPr>
+      <w:r>
+        <w:rPr>
+          <w:rFonts w:ascii="monospace" w:hAnsi="monospace"/>
+          <w:b/>
+          <w:i w:val="false"/>
+          <w:caps w:val="false"/>
+          <w:smallCaps w:val="false"/>
+          <w:color w:val="000000"/>
+          <w:spacing w:val="0"/>
+          <w:sz w:val="22"/>
+          <w:shd w:fill="FFFFFF" w:val="clear"/>
+        </w:rPr>
+        <w:t>{#isChargeList}</w:t>
       </w:r>
     </w:p>
     <w:p>

</xml_diff>